<commit_message>
QOL + Performance Patch
v0.4.8.9 quick patch 2: behaviour-identical cleanup and performance across sim, render, world, deck and the server. Golden fingerprints (tools/golden.mjs), sim_batch and deck_sim identical; Node 752/754, Python 334 OK.

Co-Authored-By: Claude Opus 5.5 <noreply@anthropic.com>
Claude-Session: https://claude.ai/code/session_01KoV53Zch3m9KKpFXygU1Rw
</commit_message>
<xml_diff>
--- a/PATCH_NOTES_v0.4.8.9.docx
+++ b/PATCH_NOTES_v0.4.8.9.docx
@@ -2503,6 +2503,495 @@
         <w:t xml:space="preserve"> still come from your park's world. Who you face and how they play now come only from the run's start, so the server and your screen always get the same run.</w:t>
       </w:r>
     </w:p>
+    <w:p>
+      <w:pPr>
+        <w:pBdr>
+          <w:bottom w:val="single" w:color="D0D7DE" w:sz="4" w:space="1"/>
+        </w:pBdr>
+        <w:spacing w:after="160" w:before="80"/>
+      </w:pPr>
+    </w:p>
+    <w:p>
+      <w:pPr>
+        <w:pStyle w:val="Heading1"/>
+        <w:spacing w:after="120" w:before="280"/>
+      </w:pPr>
+      <w:r>
+        <w:rPr>
+          <w:rFonts w:ascii="Calibri" w:cs="Calibri" w:eastAsia="Calibri" w:hAnsi="Calibri"/>
+          <w:b/>
+          <w:bCs/>
+          <w:color w:val="C8102E"/>
+          <w:sz w:val="32"/>
+          <w:szCs w:val="32"/>
+        </w:rPr>
+        <w:t xml:space="preserve">Quick patch 2 (Oct 22): QOL + Performance</w:t>
+      </w:r>
+    </w:p>
+    <w:p>
+      <w:pPr>
+        <w:spacing w:after="140" w:line="288"/>
+      </w:pPr>
+      <w:r>
+        <w:rPr>
+          <w:rFonts w:ascii="Calibri" w:cs="Calibri" w:eastAsia="Calibri" w:hAnsi="Calibri"/>
+          <w:b/>
+          <w:bCs/>
+          <w:color w:val="1F2328"/>
+        </w:rPr>
+        <w:t xml:space="preserve">Nothing about how the game plays has changed.</w:t>
+      </w:r>
+      <w:r>
+        <w:rPr>
+          <w:rFonts w:ascii="Calibri" w:cs="Calibri" w:eastAsia="Calibri" w:hAnsi="Calibri"/>
+          <w:color w:val="1F2328"/>
+        </w:rPr>
+        <w:t xml:space="preserve"> Every game mode plays exactly as before, down to the last bounce. We checked that by replaying seeded park, Pro-Am, lockstep online, park director and Gauntlet games before and after the patch and getting identical results. Players on quick patch 1 and quick patch 2 can still play together.</w:t>
+      </w:r>
+    </w:p>
+    <w:p>
+      <w:pPr>
+        <w:pStyle w:val="Heading2"/>
+        <w:spacing w:after="80" w:before="200"/>
+      </w:pPr>
+      <w:r>
+        <w:rPr>
+          <w:rFonts w:ascii="Calibri" w:cs="Calibri" w:eastAsia="Calibri" w:hAnsi="Calibri"/>
+          <w:b/>
+          <w:bCs/>
+          <w:color w:val="1F2328"/>
+          <w:sz w:val="26"/>
+          <w:szCs w:val="26"/>
+        </w:rPr>
+        <w:t xml:space="preserve">Smoother on your PC</w:t>
+      </w:r>
+    </w:p>
+    <w:p>
+      <w:pPr>
+        <w:pStyle w:val="ListParagraph"/>
+        <w:numPr>
+          <w:ilvl w:val="0"/>
+          <w:numId w:val="2"/>
+        </w:numPr>
+        <w:spacing w:after="80" w:line="276"/>
+      </w:pPr>
+      <w:r>
+        <w:rPr>
+          <w:rFonts w:ascii="Calibri" w:cs="Calibri" w:eastAsia="Calibri" w:hAnsi="Calibri"/>
+          <w:b/>
+          <w:bCs/>
+          <w:color w:val="1F2328"/>
+        </w:rPr>
+        <w:t xml:space="preserve">Players:</w:t>
+      </w:r>
+      <w:r>
+        <w:rPr>
+          <w:rFonts w:ascii="Calibri" w:cs="Calibri" w:eastAsia="Calibri" w:hAnsi="Calibri"/>
+          <w:color w:val="1F2328"/>
+        </w:rPr>
+        <w:t xml:space="preserve"> posing and animating the players on court costs about </w:t>
+      </w:r>
+      <w:r>
+        <w:rPr>
+          <w:rFonts w:ascii="Calibri" w:cs="Calibri" w:eastAsia="Calibri" w:hAnsi="Calibri"/>
+          <w:b/>
+          <w:bCs/>
+          <w:color w:val="1F2328"/>
+        </w:rPr>
+        <w:t xml:space="preserve">25% less</w:t>
+      </w:r>
+      <w:r>
+        <w:rPr>
+          <w:rFonts w:ascii="Calibri" w:cs="Calibri" w:eastAsia="Calibri" w:hAnsi="Calibri"/>
+          <w:color w:val="1F2328"/>
+        </w:rPr>
+        <w:t xml:space="preserve"> per frame.</w:t>
+      </w:r>
+    </w:p>
+    <w:p>
+      <w:pPr>
+        <w:pStyle w:val="ListParagraph"/>
+        <w:numPr>
+          <w:ilvl w:val="0"/>
+          <w:numId w:val="2"/>
+        </w:numPr>
+        <w:spacing w:after="80" w:line="276"/>
+      </w:pPr>
+      <w:r>
+        <w:rPr>
+          <w:rFonts w:ascii="Calibri" w:cs="Calibri" w:eastAsia="Calibri" w:hAnsi="Calibri"/>
+          <w:b/>
+          <w:bCs/>
+          <w:color w:val="1F2328"/>
+        </w:rPr>
+        <w:t xml:space="preserve">Drawing the scene:</w:t>
+      </w:r>
+      <w:r>
+        <w:rPr>
+          <w:rFonts w:ascii="Calibri" w:cs="Calibri" w:eastAsia="Calibri" w:hAnsi="Calibri"/>
+          <w:color w:val="1F2328"/>
+        </w:rPr>
+        <w:t xml:space="preserve"> each frame makes about </w:t>
+      </w:r>
+      <w:r>
+        <w:rPr>
+          <w:rFonts w:ascii="Calibri" w:cs="Calibri" w:eastAsia="Calibri" w:hAnsi="Calibri"/>
+          <w:b/>
+          <w:bCs/>
+          <w:color w:val="1F2328"/>
+        </w:rPr>
+        <w:t xml:space="preserve">28% fewer</w:t>
+      </w:r>
+      <w:r>
+        <w:rPr>
+          <w:rFonts w:ascii="Calibri" w:cs="Calibri" w:eastAsia="Calibri" w:hAnsi="Calibri"/>
+          <w:color w:val="1F2328"/>
+        </w:rPr>
+        <w:t xml:space="preserve"> graphics calls. Busy moments full of effect particles no longer allocate memory for every particle on every frame, so they stay smooth.</w:t>
+      </w:r>
+    </w:p>
+    <w:p>
+      <w:pPr>
+        <w:pStyle w:val="ListParagraph"/>
+        <w:numPr>
+          <w:ilvl w:val="0"/>
+          <w:numId w:val="2"/>
+        </w:numPr>
+        <w:spacing w:after="80" w:line="276"/>
+      </w:pPr>
+      <w:r>
+        <w:rPr>
+          <w:rFonts w:ascii="Calibri" w:cs="Calibri" w:eastAsia="Calibri" w:hAnsi="Calibri"/>
+          <w:b/>
+          <w:bCs/>
+          <w:color w:val="1F2328"/>
+        </w:rPr>
+        <w:t xml:space="preserve">Going back to a park:</w:t>
+      </w:r>
+      <w:r>
+        <w:rPr>
+          <w:rFonts w:ascii="Calibri" w:cs="Calibri" w:eastAsia="Calibri" w:hAnsi="Calibri"/>
+          <w:color w:val="1F2328"/>
+        </w:rPr>
+        <w:t xml:space="preserve"> parks you've already visited this session load </w:t>
+      </w:r>
+      <w:r>
+        <w:rPr>
+          <w:rFonts w:ascii="Calibri" w:cs="Calibri" w:eastAsia="Calibri" w:hAnsi="Calibri"/>
+          <w:b/>
+          <w:bCs/>
+          <w:color w:val="1F2328"/>
+        </w:rPr>
+        <w:t xml:space="preserve">2 to 5 times faster</w:t>
+      </w:r>
+      <w:r>
+        <w:rPr>
+          <w:rFonts w:ascii="Calibri" w:cs="Calibri" w:eastAsia="Calibri" w:hAnsi="Calibri"/>
+          <w:color w:val="1F2328"/>
+        </w:rPr>
+        <w:t xml:space="preserve">: Old Brick Yard 0.8 s to 0.2 s, King Tut 0.19 s to 0.04 s. The courts' painted lines and the parks' brick and stone walls are made once and kept.</w:t>
+      </w:r>
+    </w:p>
+    <w:p>
+      <w:pPr>
+        <w:pStyle w:val="ListParagraph"/>
+        <w:numPr>
+          <w:ilvl w:val="0"/>
+          <w:numId w:val="2"/>
+        </w:numPr>
+        <w:spacing w:after="80" w:line="276"/>
+      </w:pPr>
+      <w:r>
+        <w:rPr>
+          <w:rFonts w:ascii="Calibri" w:cs="Calibri" w:eastAsia="Calibri" w:hAnsi="Calibri"/>
+          <w:b/>
+          <w:bCs/>
+          <w:color w:val="1F2328"/>
+        </w:rPr>
+        <w:t xml:space="preserve">Fewer copies on the graphics card:</w:t>
+      </w:r>
+      <w:r>
+        <w:rPr>
+          <w:rFonts w:ascii="Calibri" w:cs="Calibri" w:eastAsia="Calibri" w:hAnsi="Calibri"/>
+          <w:color w:val="1F2328"/>
+        </w:rPr>
+        <w:t xml:space="preserve"> players with the same hair style and colour share one hair texture. A return visit to a park no longer uploads its court textures a second time (about 200 MB less).</w:t>
+      </w:r>
+    </w:p>
+    <w:p>
+      <w:pPr>
+        <w:pStyle w:val="ListParagraph"/>
+        <w:numPr>
+          <w:ilvl w:val="0"/>
+          <w:numId w:val="2"/>
+        </w:numPr>
+        <w:spacing w:after="80" w:line="276"/>
+      </w:pPr>
+      <w:r>
+        <w:rPr>
+          <w:rFonts w:ascii="Calibri" w:cs="Calibri" w:eastAsia="Calibri" w:hAnsi="Calibri"/>
+          <w:b/>
+          <w:bCs/>
+          <w:color w:val="1F2328"/>
+        </w:rPr>
+        <w:t xml:space="preserve">Making players:</w:t>
+      </w:r>
+      <w:r>
+        <w:rPr>
+          <w:rFonts w:ascii="Calibri" w:cs="Calibri" w:eastAsia="Calibri" w:hAnsi="Calibri"/>
+          <w:color w:val="1F2328"/>
+        </w:rPr>
+        <w:t xml:space="preserve"> building AI players for the park, the AI world and the Gauntlet's cast is about </w:t>
+      </w:r>
+      <w:r>
+        <w:rPr>
+          <w:rFonts w:ascii="Calibri" w:cs="Calibri" w:eastAsia="Calibri" w:hAnsi="Calibri"/>
+          <w:b/>
+          <w:bCs/>
+          <w:color w:val="1F2328"/>
+        </w:rPr>
+        <w:t xml:space="preserve">2.2 times faster</w:t>
+      </w:r>
+      <w:r>
+        <w:rPr>
+          <w:rFonts w:ascii="Calibri" w:cs="Calibri" w:eastAsia="Calibri" w:hAnsi="Calibri"/>
+          <w:color w:val="1F2328"/>
+        </w:rPr>
+        <w:t xml:space="preserve">.</w:t>
+      </w:r>
+    </w:p>
+    <w:p>
+      <w:pPr>
+        <w:pStyle w:val="ListParagraph"/>
+        <w:numPr>
+          <w:ilvl w:val="0"/>
+          <w:numId w:val="2"/>
+        </w:numPr>
+        <w:spacing w:after="80" w:line="276"/>
+      </w:pPr>
+      <w:r>
+        <w:rPr>
+          <w:rFonts w:ascii="Calibri" w:cs="Calibri" w:eastAsia="Calibri" w:hAnsi="Calibri"/>
+          <w:b/>
+          <w:bCs/>
+          <w:color w:val="1F2328"/>
+        </w:rPr>
+        <w:t xml:space="preserve">Pro-Am:</w:t>
+      </w:r>
+      <w:r>
+        <w:rPr>
+          <w:rFonts w:ascii="Calibri" w:cs="Calibri" w:eastAsia="Calibri" w:hAnsi="Calibri"/>
+          <w:color w:val="1F2328"/>
+        </w:rPr>
+        <w:t xml:space="preserve"> the simulation runs about 9% faster in Pro-Am games.</w:t>
+      </w:r>
+    </w:p>
+    <w:p>
+      <w:pPr>
+        <w:pStyle w:val="Heading2"/>
+        <w:spacing w:after="80" w:before="200"/>
+      </w:pPr>
+      <w:r>
+        <w:rPr>
+          <w:rFonts w:ascii="Calibri" w:cs="Calibri" w:eastAsia="Calibri" w:hAnsi="Calibri"/>
+          <w:b/>
+          <w:bCs/>
+          <w:color w:val="1F2328"/>
+          <w:sz w:val="26"/>
+          <w:szCs w:val="26"/>
+        </w:rPr>
+        <w:t xml:space="preserve">Faster online server</w:t>
+      </w:r>
+    </w:p>
+    <w:p>
+      <w:pPr>
+        <w:pStyle w:val="ListParagraph"/>
+        <w:numPr>
+          <w:ilvl w:val="0"/>
+          <w:numId w:val="2"/>
+        </w:numPr>
+        <w:spacing w:after="80" w:line="276"/>
+      </w:pPr>
+      <w:r>
+        <w:rPr>
+          <w:rFonts w:ascii="Calibri" w:cs="Calibri" w:eastAsia="Calibri" w:hAnsi="Calibri"/>
+          <w:b/>
+          <w:bCs/>
+          <w:color w:val="1F2328"/>
+        </w:rPr>
+        <w:t xml:space="preserve">Your profile:</w:t>
+      </w:r>
+      <w:r>
+        <w:rPr>
+          <w:rFonts w:ascii="Calibri" w:cs="Calibri" w:eastAsia="Calibri" w:hAnsi="Calibri"/>
+          <w:color w:val="1F2328"/>
+        </w:rPr>
+        <w:t xml:space="preserve"> the server answers the MyPLAYER and profile request about </w:t>
+      </w:r>
+      <w:r>
+        <w:rPr>
+          <w:rFonts w:ascii="Calibri" w:cs="Calibri" w:eastAsia="Calibri" w:hAnsi="Calibri"/>
+          <w:b/>
+          <w:bCs/>
+          <w:color w:val="1F2328"/>
+        </w:rPr>
+        <w:t xml:space="preserve">6 times faster</w:t>
+      </w:r>
+      <w:r>
+        <w:rPr>
+          <w:rFonts w:ascii="Calibri" w:cs="Calibri" w:eastAsia="Calibri" w:hAnsi="Calibri"/>
+          <w:color w:val="1F2328"/>
+        </w:rPr>
+        <w:t xml:space="preserve"> (21 ms to 3 ms).</w:t>
+      </w:r>
+    </w:p>
+    <w:p>
+      <w:pPr>
+        <w:pStyle w:val="ListParagraph"/>
+        <w:numPr>
+          <w:ilvl w:val="0"/>
+          <w:numId w:val="2"/>
+        </w:numPr>
+        <w:spacing w:after="80" w:line="276"/>
+      </w:pPr>
+      <w:r>
+        <w:rPr>
+          <w:rFonts w:ascii="Calibri" w:cs="Calibri" w:eastAsia="Calibri" w:hAnsi="Calibri"/>
+          <w:b/>
+          <w:bCs/>
+          <w:color w:val="1F2328"/>
+        </w:rPr>
+        <w:t xml:space="preserve">Park games:</w:t>
+      </w:r>
+      <w:r>
+        <w:rPr>
+          <w:rFonts w:ascii="Calibri" w:cs="Calibri" w:eastAsia="Calibri" w:hAnsi="Calibri"/>
+          <w:color w:val="1F2328"/>
+        </w:rPr>
+        <w:t xml:space="preserve"> starting and finishing a park game is about 1.6 times faster on the server.</w:t>
+      </w:r>
+    </w:p>
+    <w:p>
+      <w:pPr>
+        <w:pStyle w:val="ListParagraph"/>
+        <w:numPr>
+          <w:ilvl w:val="0"/>
+          <w:numId w:val="2"/>
+        </w:numPr>
+        <w:spacing w:after="80" w:line="276"/>
+      </w:pPr>
+      <w:r>
+        <w:rPr>
+          <w:rFonts w:ascii="Calibri" w:cs="Calibri" w:eastAsia="Calibri" w:hAnsi="Calibri"/>
+          <w:b/>
+          <w:bCs/>
+          <w:color w:val="1F2328"/>
+        </w:rPr>
+        <w:t xml:space="preserve">Gauntlet:</w:t>
+      </w:r>
+      <w:r>
+        <w:rPr>
+          <w:rFonts w:ascii="Calibri" w:cs="Calibri" w:eastAsia="Calibri" w:hAnsi="Calibri"/>
+          <w:color w:val="1F2328"/>
+        </w:rPr>
+        <w:t xml:space="preserve"> the server's replay check of a finished Gauntlet run takes about 0.14 s instead of 0.23 s.</w:t>
+      </w:r>
+    </w:p>
+    <w:p>
+      <w:pPr>
+        <w:pStyle w:val="ListParagraph"/>
+        <w:numPr>
+          <w:ilvl w:val="0"/>
+          <w:numId w:val="2"/>
+        </w:numPr>
+        <w:spacing w:after="80" w:line="276"/>
+      </w:pPr>
+      <w:r>
+        <w:rPr>
+          <w:rFonts w:ascii="Calibri" w:cs="Calibri" w:eastAsia="Calibri" w:hAnsi="Calibri"/>
+          <w:b/>
+          <w:bCs/>
+          <w:color w:val="1F2328"/>
+        </w:rPr>
+        <w:t xml:space="preserve">Memory:</w:t>
+      </w:r>
+      <w:r>
+        <w:rPr>
+          <w:rFonts w:ascii="Calibri" w:cs="Calibri" w:eastAsia="Calibri" w:hAnsi="Calibri"/>
+          <w:color w:val="1F2328"/>
+        </w:rPr>
+        <w:t xml:space="preserve"> the sign-in rate limiter now forgets old addresses instead of keeping every one forever.</w:t>
+      </w:r>
+    </w:p>
+    <w:p>
+      <w:pPr>
+        <w:pStyle w:val="Heading2"/>
+        <w:spacing w:after="80" w:before="200"/>
+      </w:pPr>
+      <w:r>
+        <w:rPr>
+          <w:rFonts w:ascii="Calibri" w:cs="Calibri" w:eastAsia="Calibri" w:hAnsi="Calibri"/>
+          <w:b/>
+          <w:bCs/>
+          <w:color w:val="1F2328"/>
+          <w:sz w:val="26"/>
+          <w:szCs w:val="26"/>
+        </w:rPr>
+        <w:t xml:space="preserve">Cleaner code</w:t>
+      </w:r>
+    </w:p>
+    <w:p>
+      <w:pPr>
+        <w:pStyle w:val="ListParagraph"/>
+        <w:numPr>
+          <w:ilvl w:val="0"/>
+          <w:numId w:val="2"/>
+        </w:numPr>
+        <w:spacing w:after="80" w:line="276"/>
+      </w:pPr>
+      <w:r>
+        <w:rPr>
+          <w:rFonts w:ascii="Calibri" w:cs="Calibri" w:eastAsia="Calibri" w:hAnsi="Calibri"/>
+          <w:b/>
+          <w:bCs/>
+          <w:color w:val="1F2328"/>
+        </w:rPr>
+        <w:t xml:space="preserve">Tidied:</w:t>
+      </w:r>
+      <w:r>
+        <w:rPr>
+          <w:rFonts w:ascii="Calibri" w:cs="Calibri" w:eastAsia="Calibri" w:hAnsi="Calibri"/>
+          <w:color w:val="1F2328"/>
+        </w:rPr>
+        <w:t xml:space="preserve"> unused code and imports removed throughout.</w:t>
+      </w:r>
+    </w:p>
+    <w:p>
+      <w:pPr>
+        <w:pStyle w:val="ListParagraph"/>
+        <w:numPr>
+          <w:ilvl w:val="0"/>
+          <w:numId w:val="2"/>
+        </w:numPr>
+        <w:spacing w:after="80" w:line="276"/>
+      </w:pPr>
+      <w:r>
+        <w:rPr>
+          <w:rFonts w:ascii="Calibri" w:cs="Calibri" w:eastAsia="Calibri" w:hAnsi="Calibri"/>
+          <w:b/>
+          <w:bCs/>
+          <w:color w:val="1F2328"/>
+        </w:rPr>
+        <w:t xml:space="preserve">Easier to follow:</w:t>
+      </w:r>
+      <w:r>
+        <w:rPr>
+          <w:rFonts w:ascii="Calibri" w:cs="Calibri" w:eastAsia="Calibri" w:hAnsi="Calibri"/>
+          <w:color w:val="1F2328"/>
+        </w:rPr>
+        <w:t xml:space="preserve"> every major file now starts with a short note on what it does and who uses it, with clear section headings inside. The server's routes are grouped by feature (session, online, builds, store, AI world, games, crews and the Cup, Pro-Am, the Gauntlet).</w:t>
+      </w:r>
+    </w:p>
     <w:sectPr>
       <w:pgSz w:w="12240" w:h="15840" w:orient="portrait"/>
       <w:pgMar w:top="1440" w:right="1440" w:bottom="1440" w:left="1440" w:header="708" w:footer="708" w:gutter="0"/>

</xml_diff>

<commit_message>
Fix GPU leaks and improve runtime performance
Quick patch 3 releases scene-owned graphics resources while retaining shared assets within a bounded cache, and reduces rendering and simulation overhead. It also prepaints ground textures in a worker and improves server save, lookup, and replay-check performance.
</commit_message>
<xml_diff>
--- a/PATCH_NOTES_v0.4.8.9.docx
+++ b/PATCH_NOTES_v0.4.8.9.docx
@@ -2992,6 +2992,554 @@
         <w:t xml:space="preserve"> every major file now starts with a short note on what it does and who uses it, with clear section headings inside. The server's routes are grouped by feature (session, online, builds, store, AI world, games, crews and the Cup, Pro-Am, the Gauntlet).</w:t>
       </w:r>
     </w:p>
+    <w:p>
+      <w:pPr>
+        <w:pBdr>
+          <w:bottom w:val="single" w:color="D0D7DE" w:sz="4" w:space="1"/>
+        </w:pBdr>
+        <w:spacing w:after="160" w:before="80"/>
+      </w:pPr>
+    </w:p>
+    <w:p>
+      <w:pPr>
+        <w:pStyle w:val="Heading1"/>
+        <w:spacing w:after="120" w:before="280"/>
+      </w:pPr>
+      <w:r>
+        <w:rPr>
+          <w:rFonts w:ascii="Calibri" w:cs="Calibri" w:eastAsia="Calibri" w:hAnsi="Calibri"/>
+          <w:b/>
+          <w:bCs/>
+          <w:color w:val="C8102E"/>
+          <w:sz w:val="32"/>
+          <w:szCs w:val="32"/>
+        </w:rPr>
+        <w:t xml:space="preserve">Quick patch 3 (Oct 23): Memory leak fix + performance</w:t>
+      </w:r>
+    </w:p>
+    <w:p>
+      <w:pPr>
+        <w:pStyle w:val="Heading2"/>
+        <w:spacing w:after="80" w:before="200"/>
+      </w:pPr>
+      <w:r>
+        <w:rPr>
+          <w:rFonts w:ascii="Calibri" w:cs="Calibri" w:eastAsia="Calibri" w:hAnsi="Calibri"/>
+          <w:b/>
+          <w:bCs/>
+          <w:color w:val="1F2328"/>
+          <w:sz w:val="26"/>
+          <w:szCs w:val="26"/>
+        </w:rPr>
+        <w:t xml:space="preserve">Fixed: the game kept using more graphics memory the longer you played</w:t>
+      </w:r>
+    </w:p>
+    <w:p>
+      <w:pPr>
+        <w:spacing w:after="140" w:line="288"/>
+      </w:pPr>
+      <w:r>
+        <w:rPr>
+          <w:rFonts w:ascii="Calibri" w:cs="Calibri" w:eastAsia="Calibri" w:hAnsi="Calibri"/>
+          <w:color w:val="1F2328"/>
+        </w:rPr>
+        <w:t xml:space="preserve">Every time you left a place, the game kept its whole scene on your graphics card: the park, Crew HQ, the Pro-Am HUB, a match's venue, the Gauntlet court. Each round of the park, HQ, HUB, a Pro-Am game and the Gauntlet added about </w:t>
+      </w:r>
+      <w:r>
+        <w:rPr>
+          <w:rFonts w:ascii="Calibri" w:cs="Calibri" w:eastAsia="Calibri" w:hAnsi="Calibri"/>
+          <w:b/>
+          <w:bCs/>
+          <w:color w:val="1F2328"/>
+        </w:rPr>
+        <w:t xml:space="preserve">77 MB</w:t>
+      </w:r>
+      <w:r>
+        <w:rPr>
+          <w:rFonts w:ascii="Calibri" w:cs="Calibri" w:eastAsia="Calibri" w:hAnsi="Calibri"/>
+          <w:color w:val="1F2328"/>
+        </w:rPr>
+        <w:t xml:space="preserve"> that never came back, so long sessions got slower and could run out of graphics memory.</w:t>
+      </w:r>
+    </w:p>
+    <w:p>
+      <w:pPr>
+        <w:pStyle w:val="ListParagraph"/>
+        <w:numPr>
+          <w:ilvl w:val="0"/>
+          <w:numId w:val="2"/>
+        </w:numPr>
+        <w:spacing w:after="80" w:line="276"/>
+      </w:pPr>
+      <w:r>
+        <w:rPr>
+          <w:rFonts w:ascii="Calibri" w:cs="Calibri" w:eastAsia="Calibri" w:hAnsi="Calibri"/>
+          <w:b/>
+          <w:bCs/>
+          <w:color w:val="1F2328"/>
+        </w:rPr>
+        <w:t xml:space="preserve">Now:</w:t>
+      </w:r>
+      <w:r>
+        <w:rPr>
+          <w:rFonts w:ascii="Calibri" w:cs="Calibri" w:eastAsia="Calibri" w:hAnsi="Calibri"/>
+          <w:color w:val="1F2328"/>
+        </w:rPr>
+        <w:t xml:space="preserve"> leaving a place frees everything it built. In testing, graphics memory stays flat after the first lap at under 500 MB; before, it passed 1 GB after five laps and kept climbing.</w:t>
+      </w:r>
+    </w:p>
+    <w:p>
+      <w:pPr>
+        <w:pStyle w:val="ListParagraph"/>
+        <w:numPr>
+          <w:ilvl w:val="0"/>
+          <w:numId w:val="2"/>
+        </w:numPr>
+        <w:spacing w:after="80" w:line="276"/>
+      </w:pPr>
+      <w:r>
+        <w:rPr>
+          <w:rFonts w:ascii="Calibri" w:cs="Calibri" w:eastAsia="Calibri" w:hAnsi="Calibri"/>
+          <w:b/>
+          <w:bCs/>
+          <w:color w:val="1F2328"/>
+        </w:rPr>
+        <w:t xml:space="preserve">Walking between places:</w:t>
+      </w:r>
+      <w:r>
+        <w:rPr>
+          <w:rFonts w:ascii="Calibri" w:cs="Calibri" w:eastAsia="Calibri" w:hAnsi="Calibri"/>
+          <w:color w:val="1F2328"/>
+        </w:rPr>
+        <w:t xml:space="preserve"> the park, Crew HQ and the Pro-Am HUB stay ready together, so going back and forth between them doesn't rebuild anything. Places you haven't visited for a while are freed first when the game needs room.</w:t>
+      </w:r>
+    </w:p>
+    <w:p>
+      <w:pPr>
+        <w:pStyle w:val="Heading2"/>
+        <w:spacing w:after="80" w:before="200"/>
+      </w:pPr>
+      <w:r>
+        <w:rPr>
+          <w:rFonts w:ascii="Calibri" w:cs="Calibri" w:eastAsia="Calibri" w:hAnsi="Calibri"/>
+          <w:b/>
+          <w:bCs/>
+          <w:color w:val="1F2328"/>
+          <w:sz w:val="26"/>
+          <w:szCs w:val="26"/>
+        </w:rPr>
+        <w:t xml:space="preserve">Smoother on your PC</w:t>
+      </w:r>
+    </w:p>
+    <w:p>
+      <w:pPr>
+        <w:pStyle w:val="ListParagraph"/>
+        <w:numPr>
+          <w:ilvl w:val="0"/>
+          <w:numId w:val="2"/>
+        </w:numPr>
+        <w:spacing w:after="80" w:line="276"/>
+      </w:pPr>
+      <w:r>
+        <w:rPr>
+          <w:rFonts w:ascii="Calibri" w:cs="Calibri" w:eastAsia="Calibri" w:hAnsi="Calibri"/>
+          <w:b/>
+          <w:bCs/>
+          <w:color w:val="1F2328"/>
+        </w:rPr>
+        <w:t xml:space="preserve">Nets:</w:t>
+      </w:r>
+      <w:r>
+        <w:rPr>
+          <w:rFonts w:ascii="Calibri" w:cs="Calibri" w:eastAsia="Calibri" w:hAnsi="Calibri"/>
+          <w:color w:val="1F2328"/>
+        </w:rPr>
+        <w:t xml:space="preserve"> a park's nets cost about </w:t>
+      </w:r>
+      <w:r>
+        <w:rPr>
+          <w:rFonts w:ascii="Calibri" w:cs="Calibri" w:eastAsia="Calibri" w:hAnsi="Calibri"/>
+          <w:b/>
+          <w:bCs/>
+          <w:color w:val="1F2328"/>
+        </w:rPr>
+        <w:t xml:space="preserve">70% less</w:t>
+      </w:r>
+      <w:r>
+        <w:rPr>
+          <w:rFonts w:ascii="Calibri" w:cs="Calibri" w:eastAsia="Calibri" w:hAnsi="Calibri"/>
+          <w:color w:val="1F2328"/>
+        </w:rPr>
+        <w:t xml:space="preserve"> per frame.</w:t>
+      </w:r>
+    </w:p>
+    <w:p>
+      <w:pPr>
+        <w:pStyle w:val="ListParagraph"/>
+        <w:numPr>
+          <w:ilvl w:val="0"/>
+          <w:numId w:val="2"/>
+        </w:numPr>
+        <w:spacing w:after="80" w:line="276"/>
+      </w:pPr>
+      <w:r>
+        <w:rPr>
+          <w:rFonts w:ascii="Calibri" w:cs="Calibri" w:eastAsia="Calibri" w:hAnsi="Calibri"/>
+          <w:b/>
+          <w:bCs/>
+          <w:color w:val="1F2328"/>
+        </w:rPr>
+        <w:t xml:space="preserve">Players:</w:t>
+      </w:r>
+      <w:r>
+        <w:rPr>
+          <w:rFonts w:ascii="Calibri" w:cs="Calibri" w:eastAsia="Calibri" w:hAnsi="Calibri"/>
+          <w:color w:val="1F2328"/>
+        </w:rPr>
+        <w:t xml:space="preserve"> posing and animating them costs about 10% less again, with a third less memory churned every frame.</w:t>
+      </w:r>
+    </w:p>
+    <w:p>
+      <w:pPr>
+        <w:pStyle w:val="ListParagraph"/>
+        <w:numPr>
+          <w:ilvl w:val="0"/>
+          <w:numId w:val="2"/>
+        </w:numPr>
+        <w:spacing w:after="80" w:line="276"/>
+      </w:pPr>
+      <w:r>
+        <w:rPr>
+          <w:rFonts w:ascii="Calibri" w:cs="Calibri" w:eastAsia="Calibri" w:hAnsi="Calibri"/>
+          <w:b/>
+          <w:bCs/>
+          <w:color w:val="1F2328"/>
+        </w:rPr>
+        <w:t xml:space="preserve">Score bug:</w:t>
+      </w:r>
+      <w:r>
+        <w:rPr>
+          <w:rFonts w:ascii="Calibri" w:cs="Calibri" w:eastAsia="Calibri" w:hAnsi="Calibri"/>
+          <w:color w:val="1F2328"/>
+        </w:rPr>
+        <w:t xml:space="preserve"> the score display no longer redraws 60 times a second during live play; it updates when something on it changes.</w:t>
+      </w:r>
+    </w:p>
+    <w:p>
+      <w:pPr>
+        <w:pStyle w:val="ListParagraph"/>
+        <w:numPr>
+          <w:ilvl w:val="0"/>
+          <w:numId w:val="2"/>
+        </w:numPr>
+        <w:spacing w:after="80" w:line="276"/>
+      </w:pPr>
+      <w:r>
+        <w:rPr>
+          <w:rFonts w:ascii="Calibri" w:cs="Calibri" w:eastAsia="Calibri" w:hAnsi="Calibri"/>
+          <w:b/>
+          <w:bCs/>
+          <w:color w:val="1F2328"/>
+        </w:rPr>
+        <w:t xml:space="preserve">Effects:</w:t>
+      </w:r>
+      <w:r>
+        <w:rPr>
+          <w:rFonts w:ascii="Calibri" w:cs="Calibri" w:eastAsia="Calibri" w:hAnsi="Calibri"/>
+          <w:color w:val="1F2328"/>
+        </w:rPr>
+        <w:t xml:space="preserve"> busy moments with lots of particles do less work per frame.</w:t>
+      </w:r>
+    </w:p>
+    <w:p>
+      <w:pPr>
+        <w:pStyle w:val="ListParagraph"/>
+        <w:numPr>
+          <w:ilvl w:val="0"/>
+          <w:numId w:val="2"/>
+        </w:numPr>
+        <w:spacing w:after="80" w:line="276"/>
+      </w:pPr>
+      <w:r>
+        <w:rPr>
+          <w:rFonts w:ascii="Calibri" w:cs="Calibri" w:eastAsia="Calibri" w:hAnsi="Calibri"/>
+          <w:b/>
+          <w:bCs/>
+          <w:color w:val="1F2328"/>
+        </w:rPr>
+        <w:t xml:space="preserve">Ground textures:</w:t>
+      </w:r>
+      <w:r>
+        <w:rPr>
+          <w:rFonts w:ascii="Calibri" w:cs="Calibri" w:eastAsia="Calibri" w:hAnsi="Calibri"/>
+          <w:color w:val="1F2328"/>
+        </w:rPr>
+        <w:t xml:space="preserve"> the park asphalt and the Harbor sand are painted in the background right after you sign in, so entering the park no longer waits on them. Painting them is also up to </w:t>
+      </w:r>
+      <w:r>
+        <w:rPr>
+          <w:rFonts w:ascii="Calibri" w:cs="Calibri" w:eastAsia="Calibri" w:hAnsi="Calibri"/>
+          <w:b/>
+          <w:bCs/>
+          <w:color w:val="1F2328"/>
+        </w:rPr>
+        <w:t xml:space="preserve">twice as fast</w:t>
+      </w:r>
+      <w:r>
+        <w:rPr>
+          <w:rFonts w:ascii="Calibri" w:cs="Calibri" w:eastAsia="Calibri" w:hAnsi="Calibri"/>
+          <w:color w:val="1F2328"/>
+        </w:rPr>
+        <w:t xml:space="preserve"> when it does happen.</w:t>
+      </w:r>
+    </w:p>
+    <w:p>
+      <w:pPr>
+        <w:pStyle w:val="ListParagraph"/>
+        <w:numPr>
+          <w:ilvl w:val="0"/>
+          <w:numId w:val="2"/>
+        </w:numPr>
+        <w:spacing w:after="80" w:line="276"/>
+      </w:pPr>
+      <w:r>
+        <w:rPr>
+          <w:rFonts w:ascii="Calibri" w:cs="Calibri" w:eastAsia="Calibri" w:hAnsi="Calibri"/>
+          <w:b/>
+          <w:bCs/>
+          <w:color w:val="1F2328"/>
+        </w:rPr>
+        <w:t xml:space="preserve">Court lines:</w:t>
+      </w:r>
+      <w:r>
+        <w:rPr>
+          <w:rFonts w:ascii="Calibri" w:cs="Calibri" w:eastAsia="Calibri" w:hAnsi="Calibri"/>
+          <w:color w:val="1F2328"/>
+        </w:rPr>
+        <w:t xml:space="preserve"> each court's line texture now frees its 30 MB painting copy as soon as it's on the graphics card. The texture itself stays the same size, because shrinking it would have changed what you see.</w:t>
+      </w:r>
+    </w:p>
+    <w:p>
+      <w:pPr>
+        <w:pStyle w:val="ListParagraph"/>
+        <w:numPr>
+          <w:ilvl w:val="0"/>
+          <w:numId w:val="2"/>
+        </w:numPr>
+        <w:spacing w:after="80" w:line="276"/>
+      </w:pPr>
+      <w:r>
+        <w:rPr>
+          <w:rFonts w:ascii="Calibri" w:cs="Calibri" w:eastAsia="Calibri" w:hAnsi="Calibri"/>
+          <w:b/>
+          <w:bCs/>
+          <w:color w:val="1F2328"/>
+        </w:rPr>
+        <w:t xml:space="preserve">Simulation:</w:t>
+      </w:r>
+      <w:r>
+        <w:rPr>
+          <w:rFonts w:ascii="Calibri" w:cs="Calibri" w:eastAsia="Calibri" w:hAnsi="Calibri"/>
+          <w:color w:val="1F2328"/>
+        </w:rPr>
+        <w:t xml:space="preserve"> it churns 7–10% less memory every tick, with identical results.</w:t>
+      </w:r>
+    </w:p>
+    <w:p>
+      <w:pPr>
+        <w:pStyle w:val="Heading2"/>
+        <w:spacing w:after="80" w:before="200"/>
+      </w:pPr>
+      <w:r>
+        <w:rPr>
+          <w:rFonts w:ascii="Calibri" w:cs="Calibri" w:eastAsia="Calibri" w:hAnsi="Calibri"/>
+          <w:b/>
+          <w:bCs/>
+          <w:color w:val="1F2328"/>
+          <w:sz w:val="26"/>
+          <w:szCs w:val="26"/>
+        </w:rPr>
+        <w:t xml:space="preserve">Faster online server</w:t>
+      </w:r>
+    </w:p>
+    <w:p>
+      <w:pPr>
+        <w:pStyle w:val="ListParagraph"/>
+        <w:numPr>
+          <w:ilvl w:val="0"/>
+          <w:numId w:val="2"/>
+        </w:numPr>
+        <w:spacing w:after="80" w:line="276"/>
+      </w:pPr>
+      <w:r>
+        <w:rPr>
+          <w:rFonts w:ascii="Calibri" w:cs="Calibri" w:eastAsia="Calibri" w:hAnsi="Calibri"/>
+          <w:b/>
+          <w:bCs/>
+          <w:color w:val="1F2328"/>
+        </w:rPr>
+        <w:t xml:space="preserve">Saving:</w:t>
+      </w:r>
+      <w:r>
+        <w:rPr>
+          <w:rFonts w:ascii="Calibri" w:cs="Calibri" w:eastAsia="Calibri" w:hAnsi="Calibri"/>
+          <w:color w:val="1F2328"/>
+        </w:rPr>
+        <w:t xml:space="preserve"> the server no longer waits for the disk on every save. Saves are written to disk about once a second instead, so the server answers saves up to </w:t>
+      </w:r>
+      <w:r>
+        <w:rPr>
+          <w:rFonts w:ascii="Calibri" w:cs="Calibri" w:eastAsia="Calibri" w:hAnsi="Calibri"/>
+          <w:b/>
+          <w:bCs/>
+          <w:color w:val="1F2328"/>
+        </w:rPr>
+        <w:t xml:space="preserve">3 times faster</w:t>
+      </w:r>
+      <w:r>
+        <w:rPr>
+          <w:rFonts w:ascii="Calibri" w:cs="Calibri" w:eastAsia="Calibri" w:hAnsi="Calibri"/>
+          <w:color w:val="1F2328"/>
+        </w:rPr>
+        <w:t xml:space="preserve"> on a typical cloud disk. If the server program crashes, nothing is lost. Only a power cut or a crash of the whole machine could lose about the last second of saves. A server owner can set </w:t>
+      </w:r>
+      <w:r>
+        <w:rPr>
+          <w:rFonts w:ascii="Consolas" w:cs="Consolas" w:eastAsia="Consolas" w:hAnsi="Consolas"/>
+          <w:color w:val="0B5394"/>
+          <w:sz w:val="19"/>
+          <w:szCs w:val="19"/>
+        </w:rPr>
+        <w:t xml:space="preserve">RIMRIFT_DB_SYNC=full</w:t>
+      </w:r>
+      <w:r>
+        <w:rPr>
+          <w:rFonts w:ascii="Calibri" w:cs="Calibri" w:eastAsia="Calibri" w:hAnsi="Calibri"/>
+          <w:color w:val="1F2328"/>
+        </w:rPr>
+        <w:t xml:space="preserve"> to go back to waiting on every save.</w:t>
+      </w:r>
+    </w:p>
+    <w:p>
+      <w:pPr>
+        <w:pStyle w:val="ListParagraph"/>
+        <w:numPr>
+          <w:ilvl w:val="0"/>
+          <w:numId w:val="2"/>
+        </w:numPr>
+        <w:spacing w:after="80" w:line="276"/>
+      </w:pPr>
+      <w:r>
+        <w:rPr>
+          <w:rFonts w:ascii="Calibri" w:cs="Calibri" w:eastAsia="Calibri" w:hAnsi="Calibri"/>
+          <w:b/>
+          <w:bCs/>
+          <w:color w:val="1F2328"/>
+        </w:rPr>
+        <w:t xml:space="preserve">Database lookups:</w:t>
+      </w:r>
+      <w:r>
+        <w:rPr>
+          <w:rFonts w:ascii="Calibri" w:cs="Calibri" w:eastAsia="Calibri" w:hAnsi="Calibri"/>
+          <w:color w:val="1F2328"/>
+        </w:rPr>
+        <w:t xml:space="preserve"> looking up a build's games, crew members, sign-ins and Pro-Am requests uses an index now, instead of reading the whole table.</w:t>
+      </w:r>
+    </w:p>
+    <w:p>
+      <w:pPr>
+        <w:pStyle w:val="ListParagraph"/>
+        <w:numPr>
+          <w:ilvl w:val="0"/>
+          <w:numId w:val="2"/>
+        </w:numPr>
+        <w:spacing w:after="80" w:line="276"/>
+      </w:pPr>
+      <w:r>
+        <w:rPr>
+          <w:rFonts w:ascii="Calibri" w:cs="Calibri" w:eastAsia="Calibri" w:hAnsi="Calibri"/>
+          <w:b/>
+          <w:bCs/>
+          <w:color w:val="1F2328"/>
+        </w:rPr>
+        <w:t xml:space="preserve">Game setup:</w:t>
+      </w:r>
+      <w:r>
+        <w:rPr>
+          <w:rFonts w:ascii="Calibri" w:cs="Calibri" w:eastAsia="Calibri" w:hAnsi="Calibri"/>
+          <w:color w:val="1F2328"/>
+        </w:rPr>
+        <w:t xml:space="preserve"> it's sent about 1.7 times faster. The server keeps the store catalog ready instead of rebuilding it for every player.</w:t>
+      </w:r>
+    </w:p>
+    <w:p>
+      <w:pPr>
+        <w:pStyle w:val="ListParagraph"/>
+        <w:numPr>
+          <w:ilvl w:val="0"/>
+          <w:numId w:val="2"/>
+        </w:numPr>
+        <w:spacing w:after="80" w:line="276"/>
+      </w:pPr>
+      <w:r>
+        <w:rPr>
+          <w:rFonts w:ascii="Calibri" w:cs="Calibri" w:eastAsia="Calibri" w:hAnsi="Calibri"/>
+          <w:b/>
+          <w:bCs/>
+          <w:color w:val="1F2328"/>
+        </w:rPr>
+        <w:t xml:space="preserve">Gauntlet checks:</w:t>
+      </w:r>
+      <w:r>
+        <w:rPr>
+          <w:rFonts w:ascii="Calibri" w:cs="Calibri" w:eastAsia="Calibri" w:hAnsi="Calibri"/>
+          <w:color w:val="1F2328"/>
+        </w:rPr>
+        <w:t xml:space="preserve"> two helpers stay running to check finished Gauntlet runs, so a check takes about </w:t>
+      </w:r>
+      <w:r>
+        <w:rPr>
+          <w:rFonts w:ascii="Calibri" w:cs="Calibri" w:eastAsia="Calibri" w:hAnsi="Calibri"/>
+          <w:b/>
+          <w:bCs/>
+          <w:color w:val="1F2328"/>
+        </w:rPr>
+        <w:t xml:space="preserve">0.03 s instead of 0.15 s</w:t>
+      </w:r>
+      <w:r>
+        <w:rPr>
+          <w:rFonts w:ascii="Calibri" w:cs="Calibri" w:eastAsia="Calibri" w:hAnsi="Calibri"/>
+          <w:color w:val="1F2328"/>
+        </w:rPr>
+        <w:t xml:space="preserve">. The same helpers will check park and Pro-Am results once the new engine is in.</w:t>
+      </w:r>
+    </w:p>
+    <w:p>
+      <w:pPr>
+        <w:pStyle w:val="ListParagraph"/>
+        <w:numPr>
+          <w:ilvl w:val="0"/>
+          <w:numId w:val="2"/>
+        </w:numPr>
+        <w:spacing w:after="80" w:line="276"/>
+      </w:pPr>
+      <w:r>
+        <w:rPr>
+          <w:rFonts w:ascii="Calibri" w:cs="Calibri" w:eastAsia="Calibri" w:hAnsi="Calibri"/>
+          <w:b/>
+          <w:bCs/>
+          <w:color w:val="1F2328"/>
+        </w:rPr>
+        <w:t xml:space="preserve">Park memory:</w:t>
+      </w:r>
+      <w:r>
+        <w:rPr>
+          <w:rFonts w:ascii="Calibri" w:cs="Calibri" w:eastAsia="Calibri" w:hAnsi="Calibri"/>
+          <w:color w:val="1F2328"/>
+        </w:rPr>
+        <w:t xml:space="preserve"> the park's per-player records are tidied up, so they no longer grow forever on a long-running server.</w:t>
+      </w:r>
+    </w:p>
     <w:sectPr>
       <w:pgSz w:w="12240" w:h="15840" w:orient="portrait"/>
       <w:pgMar w:top="1440" w:right="1440" w:bottom="1440" w:left="1440" w:header="708" w:footer="708" w:gutter="0"/>

</xml_diff>

<commit_message>
Bound player look textures (athlete texture leases + look canvas caches)
v0.4.8.9 quick patch 3 follow-up: shared athlete textures are leased per AthleteView with a separate 96 MB idle budget (400-look churn 1.2 GB -> flat 120 MB); hair/body/cloth canvas caches LRU-capped. Pixels identical, golden identical; Node 762/764.

Co-Authored-By: Claude Opus 5.5 <noreply@anthropic.com>
Claude-Session: https://claude.ai/code/session_01KoV53Zch3m9KKpFXygU1Rw
</commit_message>
<xml_diff>
--- a/PATCH_NOTES_v0.4.8.9.docx
+++ b/PATCH_NOTES_v0.4.8.9.docx
@@ -3116,6 +3116,32 @@
     </w:p>
     <w:p>
       <w:pPr>
+        <w:pStyle w:val="ListParagraph"/>
+        <w:numPr>
+          <w:ilvl w:val="0"/>
+          <w:numId w:val="2"/>
+        </w:numPr>
+        <w:spacing w:after="80" w:line="276"/>
+      </w:pPr>
+      <w:r>
+        <w:rPr>
+          <w:rFonts w:ascii="Calibri" w:cs="Calibri" w:eastAsia="Calibri" w:hAnsi="Calibri"/>
+          <w:b/>
+          <w:bCs/>
+          <w:color w:val="1F2328"/>
+        </w:rPr>
+        <w:t xml:space="preserve">Player looks:</w:t>
+      </w:r>
+      <w:r>
+        <w:rPr>
+          <w:rFonts w:ascii="Calibri" w:cs="Calibri" w:eastAsia="Calibri" w:hAnsi="Calibri"/>
+          <w:color w:val="1F2328"/>
+        </w:rPr>
+        <w:t xml:space="preserve"> every hair, shoe, chain, bandana and skin look used to keep its own texture on the graphics card forever, so a long session meeting lots of different players kept growing. Looks nobody is wearing are now kept up to a limit (96 MB) and the least recently seen are freed; a look that comes back is painted again, identically. In testing, 400 different looks used to take about 1.2 GB; now it holds at about 120 MB.</w:t>
+      </w:r>
+    </w:p>
+    <w:p>
+      <w:pPr>
         <w:pStyle w:val="Heading2"/>
         <w:spacing w:after="80" w:before="200"/>
       </w:pPr>

</xml_diff>

<commit_message>
The Gauntlet plays in possessions + its own tab (quick patch 4)
Tip-off, offense/defense turns with committed opponent sets you can read (hidden for The Shadow, The Professor, Showtime's fast breaks, poker_face, Screened), the clash O vs D (higher number wins, defense wins ties), assists/blocks/steals/fast breaks/second chances/and-ones from the card combinations, held off-phase cards. Heart/Health, cards, VC and balance unchanged. Engine version 2: old clients are told to update; pre-update runs are paid by count checks. Top-bar Gauntlet tab. Node 778/780, Python 347 OK; game sim golden unchanged.

Co-Authored-By: Claude Opus 5.5 <noreply@anthropic.com>
Claude-Session: https://claude.ai/code/session_01KoV53Zch3m9KKpFXygU1Rw
</commit_message>
<xml_diff>
--- a/PATCH_NOTES_v0.4.8.9.docx
+++ b/PATCH_NOTES_v0.4.8.9.docx
@@ -3566,6 +3566,721 @@
         <w:t xml:space="preserve"> the park's per-player records are tidied up, so they no longer grow forever on a long-running server.</w:t>
       </w:r>
     </w:p>
+    <w:p>
+      <w:pPr>
+        <w:pBdr>
+          <w:bottom w:val="single" w:color="D0D7DE" w:sz="4" w:space="1"/>
+        </w:pBdr>
+        <w:spacing w:after="160" w:before="80"/>
+      </w:pPr>
+    </w:p>
+    <w:p>
+      <w:pPr>
+        <w:pStyle w:val="Heading1"/>
+        <w:spacing w:after="120" w:before="280"/>
+      </w:pPr>
+      <w:r>
+        <w:rPr>
+          <w:rFonts w:ascii="Calibri" w:cs="Calibri" w:eastAsia="Calibri" w:hAnsi="Calibri"/>
+          <w:b/>
+          <w:bCs/>
+          <w:color w:val="C8102E"/>
+          <w:sz w:val="32"/>
+          <w:szCs w:val="32"/>
+        </w:rPr>
+        <w:t xml:space="preserve">Quick patch 4 (Oct 23): The Gauntlet plays like a real game</w:t>
+      </w:r>
+    </w:p>
+    <w:p>
+      <w:pPr>
+        <w:spacing w:after="140" w:line="288"/>
+      </w:pPr>
+      <w:r>
+        <w:rPr>
+          <w:rFonts w:ascii="Calibri" w:cs="Calibri" w:eastAsia="Calibri" w:hAnsi="Calibri"/>
+          <w:b/>
+          <w:bCs/>
+          <w:color w:val="1F2328"/>
+        </w:rPr>
+        <w:t xml:space="preserve">The Gauntlet has its own tab</w:t>
+      </w:r>
+      <w:r>
+        <w:rPr>
+          <w:rFonts w:ascii="Calibri" w:cs="Calibri" w:eastAsia="Calibri" w:hAnsi="Calibri"/>
+          <w:color w:val="1F2328"/>
+        </w:rPr>
+        <w:t xml:space="preserve"> at the top of the menu, between PRO-AM and PRACTICE. The Home tile is still there.</w:t>
+      </w:r>
+    </w:p>
+    <w:p>
+      <w:pPr>
+        <w:pStyle w:val="Heading2"/>
+        <w:spacing w:after="80" w:before="200"/>
+      </w:pPr>
+      <w:r>
+        <w:rPr>
+          <w:rFonts w:ascii="Calibri" w:cs="Calibri" w:eastAsia="Calibri" w:hAnsi="Calibri"/>
+          <w:b/>
+          <w:bCs/>
+          <w:color w:val="1F2328"/>
+          <w:sz w:val="26"/>
+          <w:szCs w:val="26"/>
+        </w:rPr>
+        <w:t xml:space="preserve">Matches are played in possessions</w:t>
+      </w:r>
+    </w:p>
+    <w:p>
+      <w:pPr>
+        <w:pStyle w:val="ListParagraph"/>
+        <w:numPr>
+          <w:ilvl w:val="0"/>
+          <w:numId w:val="2"/>
+        </w:numPr>
+        <w:spacing w:after="80" w:line="276"/>
+      </w:pPr>
+      <w:r>
+        <w:rPr>
+          <w:rFonts w:ascii="Calibri" w:cs="Calibri" w:eastAsia="Calibri" w:hAnsi="Calibri"/>
+          <w:b/>
+          <w:bCs/>
+          <w:color w:val="1F2328"/>
+        </w:rPr>
+        <w:t xml:space="preserve">Tip-off:</w:t>
+      </w:r>
+      <w:r>
+        <w:rPr>
+          <w:rFonts w:ascii="Calibri" w:cs="Calibri" w:eastAsia="Calibri" w:hAnsi="Calibri"/>
+          <w:color w:val="1F2328"/>
+        </w:rPr>
+        <w:t xml:space="preserve"> every match starts with a jump ball. Whoever wins it has the ball first.</w:t>
+      </w:r>
+    </w:p>
+    <w:p>
+      <w:pPr>
+        <w:pStyle w:val="ListParagraph"/>
+        <w:numPr>
+          <w:ilvl w:val="0"/>
+          <w:numId w:val="2"/>
+        </w:numPr>
+        <w:spacing w:after="80" w:line="276"/>
+      </w:pPr>
+      <w:r>
+        <w:rPr>
+          <w:rFonts w:ascii="Calibri" w:cs="Calibri" w:eastAsia="Calibri" w:hAnsi="Calibri"/>
+          <w:b/>
+          <w:bCs/>
+          <w:color w:val="1F2328"/>
+        </w:rPr>
+        <w:t xml:space="preserve">Your ball:</w:t>
+      </w:r>
+      <w:r>
+        <w:rPr>
+          <w:rFonts w:ascii="Calibri" w:cs="Calibri" w:eastAsia="Calibri" w:hAnsi="Calibri"/>
+          <w:color w:val="1F2328"/>
+        </w:rPr>
+        <w:t xml:space="preserve"> you spend your energy on your offense: Shots, Moves, Plays and Mentalities. At the same moment your opponent commits his defense.</w:t>
+      </w:r>
+    </w:p>
+    <w:p>
+      <w:pPr>
+        <w:pStyle w:val="ListParagraph"/>
+        <w:numPr>
+          <w:ilvl w:val="0"/>
+          <w:numId w:val="2"/>
+        </w:numPr>
+        <w:spacing w:after="80" w:line="276"/>
+      </w:pPr>
+      <w:r>
+        <w:rPr>
+          <w:rFonts w:ascii="Calibri" w:cs="Calibri" w:eastAsia="Calibri" w:hAnsi="Calibri"/>
+          <w:b/>
+          <w:bCs/>
+          <w:color w:val="1F2328"/>
+        </w:rPr>
+        <w:t xml:space="preserve">Their ball:</w:t>
+      </w:r>
+      <w:r>
+        <w:rPr>
+          <w:rFonts w:ascii="Calibri" w:cs="Calibri" w:eastAsia="Calibri" w:hAnsi="Calibri"/>
+          <w:color w:val="1F2328"/>
+        </w:rPr>
+        <w:t xml:space="preserve"> he commits his play and you pick your defense: Defense cards, Plays and Mentalities.</w:t>
+      </w:r>
+    </w:p>
+    <w:p>
+      <w:pPr>
+        <w:pStyle w:val="ListParagraph"/>
+        <w:numPr>
+          <w:ilvl w:val="0"/>
+          <w:numId w:val="2"/>
+        </w:numPr>
+        <w:spacing w:after="80" w:line="276"/>
+      </w:pPr>
+      <w:r>
+        <w:rPr>
+          <w:rFonts w:ascii="Calibri" w:cs="Calibri" w:eastAsia="Calibri" w:hAnsi="Calibri"/>
+          <w:b/>
+          <w:bCs/>
+          <w:color w:val="1F2328"/>
+        </w:rPr>
+        <w:t xml:space="preserve">End Turn</w:t>
+      </w:r>
+      <w:r>
+        <w:rPr>
+          <w:rFonts w:ascii="Calibri" w:cs="Calibri" w:eastAsia="Calibri" w:hAnsi="Calibri"/>
+          <w:color w:val="1F2328"/>
+        </w:rPr>
+        <w:t xml:space="preserve"> plays the whole possession out on the court: both sides' cards, every shot, then who has the ball next.</w:t>
+      </w:r>
+    </w:p>
+    <w:p>
+      <w:pPr>
+        <w:pStyle w:val="ListParagraph"/>
+        <w:numPr>
+          <w:ilvl w:val="0"/>
+          <w:numId w:val="2"/>
+        </w:numPr>
+        <w:spacing w:after="80" w:line="276"/>
+      </w:pPr>
+      <w:r>
+        <w:rPr>
+          <w:rFonts w:ascii="Calibri" w:cs="Calibri" w:eastAsia="Calibri" w:hAnsi="Calibri"/>
+          <w:b/>
+          <w:bCs/>
+          <w:color w:val="1F2328"/>
+        </w:rPr>
+        <w:t xml:space="preserve">Held cards:</w:t>
+      </w:r>
+      <w:r>
+        <w:rPr>
+          <w:rFonts w:ascii="Calibri" w:cs="Calibri" w:eastAsia="Calibri" w:hAnsi="Calibri"/>
+          <w:color w:val="1F2328"/>
+        </w:rPr>
+        <w:t xml:space="preserve"> cards you can't use on this side of the ball stay in your hand for your next possession (up to 10), so a hand full of Shots on defense isn't wasted.</w:t>
+      </w:r>
+    </w:p>
+    <w:p>
+      <w:pPr>
+        <w:pStyle w:val="Heading2"/>
+        <w:spacing w:after="80" w:before="200"/>
+      </w:pPr>
+      <w:r>
+        <w:rPr>
+          <w:rFonts w:ascii="Calibri" w:cs="Calibri" w:eastAsia="Calibri" w:hAnsi="Calibri"/>
+          <w:b/>
+          <w:bCs/>
+          <w:color w:val="1F2328"/>
+          <w:sz w:val="26"/>
+          <w:szCs w:val="26"/>
+        </w:rPr>
+        <w:t xml:space="preserve">You can read his cards</w:t>
+      </w:r>
+    </w:p>
+    <w:p>
+      <w:pPr>
+        <w:pStyle w:val="ListParagraph"/>
+        <w:numPr>
+          <w:ilvl w:val="0"/>
+          <w:numId w:val="2"/>
+        </w:numPr>
+        <w:spacing w:after="80" w:line="276"/>
+      </w:pPr>
+      <w:r>
+        <w:rPr>
+          <w:rFonts w:ascii="Calibri" w:cs="Calibri" w:eastAsia="Calibri" w:hAnsi="Calibri"/>
+          <w:b/>
+          <w:bCs/>
+          <w:color w:val="1F2328"/>
+        </w:rPr>
+        <w:t xml:space="preserve">Before you play,</w:t>
+      </w:r>
+      <w:r>
+        <w:rPr>
+          <w:rFonts w:ascii="Calibri" w:cs="Calibri" w:eastAsia="Calibri" w:hAnsi="Calibri"/>
+          <w:color w:val="1F2328"/>
+        </w:rPr>
+        <w:t xml:space="preserve"> you see the cards your opponent has committed and their total, next to a live </w:t>
+      </w:r>
+      <w:r>
+        <w:rPr>
+          <w:rFonts w:ascii="Calibri" w:cs="Calibri" w:eastAsia="Calibri" w:hAnsi="Calibri"/>
+          <w:b/>
+          <w:bCs/>
+          <w:color w:val="1F2328"/>
+        </w:rPr>
+        <w:t xml:space="preserve">You vs Them</w:t>
+      </w:r>
+      <w:r>
+        <w:rPr>
+          <w:rFonts w:ascii="Calibri" w:cs="Calibri" w:eastAsia="Calibri" w:hAnsi="Calibri"/>
+          <w:color w:val="1F2328"/>
+        </w:rPr>
+        <w:t xml:space="preserve"> number.</w:t>
+      </w:r>
+    </w:p>
+    <w:p>
+      <w:pPr>
+        <w:pStyle w:val="ListParagraph"/>
+        <w:numPr>
+          <w:ilvl w:val="0"/>
+          <w:numId w:val="2"/>
+        </w:numPr>
+        <w:spacing w:after="80" w:line="276"/>
+      </w:pPr>
+      <w:r>
+        <w:rPr>
+          <w:rFonts w:ascii="Calibri" w:cs="Calibri" w:eastAsia="Calibri" w:hAnsi="Calibri"/>
+          <w:b/>
+          <w:bCs/>
+          <w:color w:val="1F2328"/>
+        </w:rPr>
+        <w:t xml:space="preserve">Some players can't be read:</w:t>
+      </w:r>
+    </w:p>
+    <w:p>
+      <w:pPr>
+        <w:pStyle w:val="ListParagraph"/>
+        <w:numPr>
+          <w:ilvl w:val="1"/>
+          <w:numId w:val="2"/>
+        </w:numPr>
+        <w:spacing w:after="80" w:line="276"/>
+      </w:pPr>
+      <w:r>
+        <w:rPr>
+          <w:rFonts w:ascii="Calibri" w:cs="Calibri" w:eastAsia="Calibri" w:hAnsi="Calibri"/>
+          <w:color w:val="1F2328"/>
+        </w:rPr>
+        <w:t xml:space="preserve">The Shadow hides everything.</w:t>
+      </w:r>
+    </w:p>
+    <w:p>
+      <w:pPr>
+        <w:pStyle w:val="ListParagraph"/>
+        <w:numPr>
+          <w:ilvl w:val="1"/>
+          <w:numId w:val="2"/>
+        </w:numPr>
+        <w:spacing w:after="80" w:line="276"/>
+      </w:pPr>
+      <w:r>
+        <w:rPr>
+          <w:rFonts w:ascii="Calibri" w:cs="Calibri" w:eastAsia="Calibri" w:hAnsi="Calibri"/>
+          <w:color w:val="1F2328"/>
+        </w:rPr>
+        <w:t xml:space="preserve">The Professor hides his cards but not his total.</w:t>
+      </w:r>
+    </w:p>
+    <w:p>
+      <w:pPr>
+        <w:pStyle w:val="ListParagraph"/>
+        <w:numPr>
+          <w:ilvl w:val="1"/>
+          <w:numId w:val="2"/>
+        </w:numPr>
+        <w:spacing w:after="80" w:line="276"/>
+      </w:pPr>
+      <w:r>
+        <w:rPr>
+          <w:rFonts w:ascii="Calibri" w:cs="Calibri" w:eastAsia="Calibri" w:hAnsi="Calibri"/>
+          <w:color w:val="1F2328"/>
+        </w:rPr>
+        <w:t xml:space="preserve">Showtime hides his fast breaks.</w:t>
+      </w:r>
+    </w:p>
+    <w:p>
+      <w:pPr>
+        <w:pStyle w:val="ListParagraph"/>
+        <w:numPr>
+          <w:ilvl w:val="1"/>
+          <w:numId w:val="2"/>
+        </w:numPr>
+        <w:spacing w:after="80" w:line="276"/>
+      </w:pPr>
+      <w:r>
+        <w:rPr>
+          <w:rFonts w:ascii="Calibri" w:cs="Calibri" w:eastAsia="Calibri" w:hAnsi="Calibri"/>
+          <w:color w:val="1F2328"/>
+        </w:rPr>
+        <w:t xml:space="preserve">Rivals who learn to keep a poker face hide their cards but not their total.</w:t>
+      </w:r>
+    </w:p>
+    <w:p>
+      <w:pPr>
+        <w:pStyle w:val="ListParagraph"/>
+        <w:numPr>
+          <w:ilvl w:val="1"/>
+          <w:numId w:val="2"/>
+        </w:numPr>
+        <w:spacing w:after="80" w:line="276"/>
+      </w:pPr>
+      <w:r>
+        <w:rPr>
+          <w:rFonts w:ascii="Calibri" w:cs="Calibri" w:eastAsia="Calibri" w:hAnsi="Calibri"/>
+          <w:color w:val="1F2328"/>
+        </w:rPr>
+        <w:t xml:space="preserve">Some players can </w:t>
+      </w:r>
+      <w:r>
+        <w:rPr>
+          <w:rFonts w:ascii="Calibri" w:cs="Calibri" w:eastAsia="Calibri" w:hAnsi="Calibri"/>
+          <w:b/>
+          <w:bCs/>
+          <w:color w:val="1F2328"/>
+        </w:rPr>
+        <w:t xml:space="preserve">Screen</w:t>
+      </w:r>
+      <w:r>
+        <w:rPr>
+          <w:rFonts w:ascii="Calibri" w:cs="Calibri" w:eastAsia="Calibri" w:hAnsi="Calibri"/>
+          <w:color w:val="1F2328"/>
+        </w:rPr>
+        <w:t xml:space="preserve"> you, so you can't see their next set.</w:t>
+      </w:r>
+    </w:p>
+    <w:p>
+      <w:pPr>
+        <w:pStyle w:val="Heading2"/>
+        <w:spacing w:after="80" w:before="200"/>
+      </w:pPr>
+      <w:r>
+        <w:rPr>
+          <w:rFonts w:ascii="Calibri" w:cs="Calibri" w:eastAsia="Calibri" w:hAnsi="Calibri"/>
+          <w:b/>
+          <w:bCs/>
+          <w:color w:val="1F2328"/>
+          <w:sz w:val="26"/>
+          <w:szCs w:val="26"/>
+        </w:rPr>
+        <w:t xml:space="preserve">The higher number wins</w:t>
+      </w:r>
+    </w:p>
+    <w:p>
+      <w:pPr>
+        <w:pStyle w:val="ListParagraph"/>
+        <w:numPr>
+          <w:ilvl w:val="0"/>
+          <w:numId w:val="2"/>
+        </w:numPr>
+        <w:spacing w:after="80" w:line="276"/>
+      </w:pPr>
+      <w:r>
+        <w:rPr>
+          <w:rFonts w:ascii="Calibri" w:cs="Calibri" w:eastAsia="Calibri" w:hAnsi="Calibri"/>
+          <w:b/>
+          <w:bCs/>
+          <w:color w:val="1F2328"/>
+        </w:rPr>
+        <w:t xml:space="preserve">Your number vs his:</w:t>
+      </w:r>
+      <w:r>
+        <w:rPr>
+          <w:rFonts w:ascii="Calibri" w:cs="Calibri" w:eastAsia="Calibri" w:hAnsi="Calibri"/>
+          <w:color w:val="1F2328"/>
+        </w:rPr>
+        <w:t xml:space="preserve"> the offense's number is its Shots' points, worked out exactly as before. The defense's number is its Stops.</w:t>
+      </w:r>
+    </w:p>
+    <w:p>
+      <w:pPr>
+        <w:pStyle w:val="ListParagraph"/>
+        <w:numPr>
+          <w:ilvl w:val="0"/>
+          <w:numId w:val="2"/>
+        </w:numPr>
+        <w:spacing w:after="80" w:line="276"/>
+      </w:pPr>
+      <w:r>
+        <w:rPr>
+          <w:rFonts w:ascii="Calibri" w:cs="Calibri" w:eastAsia="Calibri" w:hAnsi="Calibri"/>
+          <w:b/>
+          <w:bCs/>
+          <w:color w:val="1F2328"/>
+        </w:rPr>
+        <w:t xml:space="preserve">Scoring:</w:t>
+      </w:r>
+      <w:r>
+        <w:rPr>
+          <w:rFonts w:ascii="Calibri" w:cs="Calibri" w:eastAsia="Calibri" w:hAnsi="Calibri"/>
+          <w:color w:val="1F2328"/>
+        </w:rPr>
+        <w:t xml:space="preserve"> if the offense's number is higher, it scores the difference. If not, the shot is stopped. </w:t>
+      </w:r>
+      <w:r>
+        <w:rPr>
+          <w:rFonts w:ascii="Calibri" w:cs="Calibri" w:eastAsia="Calibri" w:hAnsi="Calibri"/>
+          <w:b/>
+          <w:bCs/>
+          <w:color w:val="1F2328"/>
+        </w:rPr>
+        <w:t xml:space="preserve">Ties go to the defense.</w:t>
+      </w:r>
+      <w:r>
+        <w:rPr>
+          <w:rFonts w:ascii="Calibri" w:cs="Calibri" w:eastAsia="Calibri" w:hAnsi="Calibri"/>
+          <w:color w:val="1F2328"/>
+        </w:rPr>
+        <w:t xml:space="preserve"> No hidden luck can change it.</w:t>
+      </w:r>
+    </w:p>
+    <w:p>
+      <w:pPr>
+        <w:pStyle w:val="ListParagraph"/>
+        <w:numPr>
+          <w:ilvl w:val="0"/>
+          <w:numId w:val="2"/>
+        </w:numPr>
+        <w:spacing w:after="80" w:line="276"/>
+      </w:pPr>
+      <w:r>
+        <w:rPr>
+          <w:rFonts w:ascii="Calibri" w:cs="Calibri" w:eastAsia="Calibri" w:hAnsi="Calibri"/>
+          <w:b/>
+          <w:bCs/>
+          <w:color w:val="1F2328"/>
+        </w:rPr>
+        <w:t xml:space="preserve">How it plays out comes from the cards on both sides:</w:t>
+      </w:r>
+    </w:p>
+    <w:p>
+      <w:pPr>
+        <w:pStyle w:val="ListParagraph"/>
+        <w:numPr>
+          <w:ilvl w:val="1"/>
+          <w:numId w:val="2"/>
+        </w:numPr>
+        <w:spacing w:after="80" w:line="276"/>
+      </w:pPr>
+      <w:r>
+        <w:rPr>
+          <w:rFonts w:ascii="Calibri" w:cs="Calibri" w:eastAsia="Calibri" w:hAnsi="Calibri"/>
+          <w:color w:val="1F2328"/>
+        </w:rPr>
+        <w:t xml:space="preserve">a pass before the shot is an </w:t>
+      </w:r>
+      <w:r>
+        <w:rPr>
+          <w:rFonts w:ascii="Calibri" w:cs="Calibri" w:eastAsia="Calibri" w:hAnsi="Calibri"/>
+          <w:b/>
+          <w:bCs/>
+          <w:color w:val="1F2328"/>
+        </w:rPr>
+        <w:t xml:space="preserve">assist</w:t>
+      </w:r>
+      <w:r>
+        <w:rPr>
+          <w:rFonts w:ascii="Calibri" w:cs="Calibri" w:eastAsia="Calibri" w:hAnsi="Calibri"/>
+          <w:color w:val="1F2328"/>
+        </w:rPr>
+        <w:t xml:space="preserve">;</w:t>
+      </w:r>
+    </w:p>
+    <w:p>
+      <w:pPr>
+        <w:pStyle w:val="ListParagraph"/>
+        <w:numPr>
+          <w:ilvl w:val="1"/>
+          <w:numId w:val="2"/>
+        </w:numPr>
+        <w:spacing w:after="80" w:line="276"/>
+      </w:pPr>
+      <w:r>
+        <w:rPr>
+          <w:rFonts w:ascii="Calibri" w:cs="Calibri" w:eastAsia="Calibri" w:hAnsi="Calibri"/>
+          <w:color w:val="1F2328"/>
+        </w:rPr>
+        <w:t xml:space="preserve">a block card against a drive or a post shot is a </w:t>
+      </w:r>
+      <w:r>
+        <w:rPr>
+          <w:rFonts w:ascii="Calibri" w:cs="Calibri" w:eastAsia="Calibri" w:hAnsi="Calibri"/>
+          <w:b/>
+          <w:bCs/>
+          <w:color w:val="1F2328"/>
+        </w:rPr>
+        <w:t xml:space="preserve">block</w:t>
+      </w:r>
+      <w:r>
+        <w:rPr>
+          <w:rFonts w:ascii="Calibri" w:cs="Calibri" w:eastAsia="Calibri" w:hAnsi="Calibri"/>
+          <w:color w:val="1F2328"/>
+        </w:rPr>
+        <w:t xml:space="preserve">;</w:t>
+      </w:r>
+    </w:p>
+    <w:p>
+      <w:pPr>
+        <w:pStyle w:val="ListParagraph"/>
+        <w:numPr>
+          <w:ilvl w:val="1"/>
+          <w:numId w:val="2"/>
+        </w:numPr>
+        <w:spacing w:after="80" w:line="276"/>
+      </w:pPr>
+      <w:r>
+        <w:rPr>
+          <w:rFonts w:ascii="Calibri" w:cs="Calibri" w:eastAsia="Calibri" w:hAnsi="Calibri"/>
+          <w:color w:val="1F2328"/>
+        </w:rPr>
+        <w:t xml:space="preserve">a steal card against a ball handler is a </w:t>
+      </w:r>
+      <w:r>
+        <w:rPr>
+          <w:rFonts w:ascii="Calibri" w:cs="Calibri" w:eastAsia="Calibri" w:hAnsi="Calibri"/>
+          <w:b/>
+          <w:bCs/>
+          <w:color w:val="1F2328"/>
+        </w:rPr>
+        <w:t xml:space="preserve">steal</w:t>
+      </w:r>
+      <w:r>
+        <w:rPr>
+          <w:rFonts w:ascii="Calibri" w:cs="Calibri" w:eastAsia="Calibri" w:hAnsi="Calibri"/>
+          <w:color w:val="1F2328"/>
+        </w:rPr>
+        <w:t xml:space="preserve">, and the stealer gets a </w:t>
+      </w:r>
+      <w:r>
+        <w:rPr>
+          <w:rFonts w:ascii="Calibri" w:cs="Calibri" w:eastAsia="Calibri" w:hAnsi="Calibri"/>
+          <w:b/>
+          <w:bCs/>
+          <w:color w:val="1F2328"/>
+        </w:rPr>
+        <w:t xml:space="preserve">fast break</w:t>
+      </w:r>
+      <w:r>
+        <w:rPr>
+          <w:rFonts w:ascii="Calibri" w:cs="Calibri" w:eastAsia="Calibri" w:hAnsi="Calibri"/>
+          <w:color w:val="1F2328"/>
+        </w:rPr>
+        <w:t xml:space="preserve"> against a defense caught out of position;</w:t>
+      </w:r>
+    </w:p>
+    <w:p>
+      <w:pPr>
+        <w:pStyle w:val="ListParagraph"/>
+        <w:numPr>
+          <w:ilvl w:val="1"/>
+          <w:numId w:val="2"/>
+        </w:numPr>
+        <w:spacing w:after="80" w:line="276"/>
+      </w:pPr>
+      <w:r>
+        <w:rPr>
+          <w:rFonts w:ascii="Calibri" w:cs="Calibri" w:eastAsia="Calibri" w:hAnsi="Calibri"/>
+          <w:color w:val="1F2328"/>
+        </w:rPr>
+        <w:t xml:space="preserve">otherwise a stopped shot is a contested miss, and whoever played more Hustle wins the rebound; winning it on offense is a </w:t>
+      </w:r>
+      <w:r>
+        <w:rPr>
+          <w:rFonts w:ascii="Calibri" w:cs="Calibri" w:eastAsia="Calibri" w:hAnsi="Calibri"/>
+          <w:b/>
+          <w:bCs/>
+          <w:color w:val="1F2328"/>
+        </w:rPr>
+        <w:t xml:space="preserve">second chance</w:t>
+      </w:r>
+      <w:r>
+        <w:rPr>
+          <w:rFonts w:ascii="Calibri" w:cs="Calibri" w:eastAsia="Calibri" w:hAnsi="Calibri"/>
+          <w:color w:val="1F2328"/>
+        </w:rPr>
+        <w:t xml:space="preserve">;</w:t>
+      </w:r>
+    </w:p>
+    <w:p>
+      <w:pPr>
+        <w:pStyle w:val="ListParagraph"/>
+        <w:numPr>
+          <w:ilvl w:val="1"/>
+          <w:numId w:val="2"/>
+        </w:numPr>
+        <w:spacing w:after="80" w:line="276"/>
+      </w:pPr>
+      <w:r>
+        <w:rPr>
+          <w:rFonts w:ascii="Calibri" w:cs="Calibri" w:eastAsia="Calibri" w:hAnsi="Calibri"/>
+          <w:color w:val="1F2328"/>
+        </w:rPr>
+        <w:t xml:space="preserve">Physical Night and some drives draw fouls: an </w:t>
+      </w:r>
+      <w:r>
+        <w:rPr>
+          <w:rFonts w:ascii="Calibri" w:cs="Calibri" w:eastAsia="Calibri" w:hAnsi="Calibri"/>
+          <w:b/>
+          <w:bCs/>
+          <w:color w:val="1F2328"/>
+        </w:rPr>
+        <w:t xml:space="preserve">and-one</w:t>
+      </w:r>
+      <w:r>
+        <w:rPr>
+          <w:rFonts w:ascii="Calibri" w:cs="Calibri" w:eastAsia="Calibri" w:hAnsi="Calibri"/>
+          <w:color w:val="1F2328"/>
+        </w:rPr>
+        <w:t xml:space="preserve"> or free throws.</w:t>
+      </w:r>
+    </w:p>
+    <w:p>
+      <w:pPr>
+        <w:pStyle w:val="Heading2"/>
+        <w:spacing w:after="80" w:before="200"/>
+      </w:pPr>
+      <w:r>
+        <w:rPr>
+          <w:rFonts w:ascii="Calibri" w:cs="Calibri" w:eastAsia="Calibri" w:hAnsi="Calibri"/>
+          <w:b/>
+          <w:bCs/>
+          <w:color w:val="1F2328"/>
+          <w:sz w:val="26"/>
+          <w:szCs w:val="26"/>
+        </w:rPr>
+        <w:t xml:space="preserve">What stays the same</w:t>
+      </w:r>
+    </w:p>
+    <w:p>
+      <w:pPr>
+        <w:spacing w:after="140" w:line="288"/>
+      </w:pPr>
+      <w:r>
+        <w:rPr>
+          <w:rFonts w:ascii="Calibri" w:cs="Calibri" w:eastAsia="Calibri" w:hAnsi="Calibri"/>
+          <w:color w:val="1F2328"/>
+        </w:rPr>
+        <w:t xml:space="preserve">Heart and Health work as before. Your baskets take away your opponent's Heart, his take away your run Health, and you win the match when his Heart is gone. The stats, the cards, combos and Flow, the brackets, bosses, rewards, abilities, the rivals who remember you and the VC are all unchanged. A good run with a starter still wins about one time in five.</w:t>
+      </w:r>
+    </w:p>
+    <w:p>
+      <w:pPr>
+        <w:pStyle w:val="Heading2"/>
+        <w:spacing w:after="80" w:before="200"/>
+      </w:pPr>
+      <w:r>
+        <w:rPr>
+          <w:rFonts w:ascii="Calibri" w:cs="Calibri" w:eastAsia="Calibri" w:hAnsi="Calibri"/>
+          <w:b/>
+          <w:bCs/>
+          <w:color w:val="1F2328"/>
+          <w:sz w:val="26"/>
+          <w:szCs w:val="26"/>
+        </w:rPr>
+        <w:t xml:space="preserve">Runs from before this update</w:t>
+      </w:r>
+    </w:p>
+    <w:p>
+      <w:pPr>
+        <w:spacing w:after="140" w:line="288"/>
+      </w:pPr>
+      <w:r>
+        <w:rPr>
+          <w:rFonts w:ascii="Calibri" w:cs="Calibri" w:eastAsia="Calibri" w:hAnsi="Calibri"/>
+          <w:color w:val="1F2328"/>
+        </w:rPr>
+        <w:t xml:space="preserve">A Gauntlet run you started before this update can't continue under the new rules. When you open the Gauntlet, you can end it and get paid what it earned. To start a run, your game has to be up to date; an old version is told to update.</w:t>
+      </w:r>
+    </w:p>
     <w:sectPr>
       <w:pgSz w:w="12240" w:h="15840" w:orient="portrait"/>
       <w:pgMar w:top="1440" w:right="1440" w:bottom="1440" w:left="1440" w:header="708" w:footer="708" w:gutter="0"/>

</xml_diff>

<commit_message>
Controller keybind for auto-play: D-pad down (quick patch 5)
D-pad down toggles auto-play like H (PADMAP.assist, remappable on the controls screen); the feed names the button for the device in use; controls table row. New test qp5padauto.

Co-Authored-By: Claude Opus 5.5 <noreply@anthropic.com>
Claude-Session: https://claude.ai/code/session_01KoV53Zch3m9KKpFXygU1Rw
</commit_message>
<xml_diff>
--- a/PATCH_NOTES_v0.4.8.9.docx
+++ b/PATCH_NOTES_v0.4.8.9.docx
@@ -4281,6 +4281,141 @@
         <w:t xml:space="preserve">A Gauntlet run you started before this update can't continue under the new rules. When you open the Gauntlet, you can end it and get paid what it earned. To start a run, your game has to be up to date; an old version is told to update.</w:t>
       </w:r>
     </w:p>
+    <w:p>
+      <w:pPr>
+        <w:pBdr>
+          <w:bottom w:val="single" w:color="D0D7DE" w:sz="4" w:space="1"/>
+        </w:pBdr>
+        <w:spacing w:after="160" w:before="80"/>
+      </w:pPr>
+    </w:p>
+    <w:p>
+      <w:pPr>
+        <w:pStyle w:val="Heading1"/>
+        <w:spacing w:after="120" w:before="280"/>
+      </w:pPr>
+      <w:r>
+        <w:rPr>
+          <w:rFonts w:ascii="Calibri" w:cs="Calibri" w:eastAsia="Calibri" w:hAnsi="Calibri"/>
+          <w:b/>
+          <w:bCs/>
+          <w:color w:val="C8102E"/>
+          <w:sz w:val="32"/>
+          <w:szCs w:val="32"/>
+        </w:rPr>
+        <w:t xml:space="preserve">Quick patch 5 (Oct 25): Auto-play on a controller</w:t>
+      </w:r>
+    </w:p>
+    <w:p>
+      <w:pPr>
+        <w:pStyle w:val="ListParagraph"/>
+        <w:numPr>
+          <w:ilvl w:val="0"/>
+          <w:numId w:val="2"/>
+        </w:numPr>
+        <w:spacing w:after="80" w:line="276"/>
+      </w:pPr>
+      <w:r>
+        <w:rPr>
+          <w:rFonts w:ascii="Calibri" w:cs="Calibri" w:eastAsia="Calibri" w:hAnsi="Calibri"/>
+          <w:b/>
+          <w:bCs/>
+          <w:color w:val="1F2328"/>
+        </w:rPr>
+        <w:t xml:space="preserve">Auto-play has a controller button:</w:t>
+      </w:r>
+      <w:r>
+        <w:rPr>
+          <w:rFonts w:ascii="Calibri" w:cs="Calibri" w:eastAsia="Calibri" w:hAnsi="Calibri"/>
+          <w:color w:val="1F2328"/>
+        </w:rPr>
+        <w:t xml:space="preserve"> </w:t>
+      </w:r>
+      <w:r>
+        <w:rPr>
+          <w:rFonts w:ascii="Calibri" w:cs="Calibri" w:eastAsia="Calibri" w:hAnsi="Calibri"/>
+          <w:b/>
+          <w:bCs/>
+          <w:color w:val="1F2328"/>
+        </w:rPr>
+        <w:t xml:space="preserve">D-pad down</w:t>
+      </w:r>
+      <w:r>
+        <w:rPr>
+          <w:rFonts w:ascii="Calibri" w:cs="Calibri" w:eastAsia="Calibri" w:hAnsi="Calibri"/>
+          <w:color w:val="1F2328"/>
+        </w:rPr>
+        <w:t xml:space="preserve"> turns auto-play on and off, just like </w:t>
+      </w:r>
+      <w:r>
+        <w:rPr>
+          <w:rFonts w:ascii="Calibri" w:cs="Calibri" w:eastAsia="Calibri" w:hAnsi="Calibri"/>
+          <w:b/>
+          <w:bCs/>
+          <w:color w:val="1F2328"/>
+        </w:rPr>
+        <w:t xml:space="preserve">H</w:t>
+      </w:r>
+      <w:r>
+        <w:rPr>
+          <w:rFonts w:ascii="Calibri" w:cs="Calibri" w:eastAsia="Calibri" w:hAnsi="Calibri"/>
+          <w:color w:val="1F2328"/>
+        </w:rPr>
+        <w:t xml:space="preserve"> on the keyboard, anywhere auto-play works. That's offline games and online Pro-Am.</w:t>
+      </w:r>
+    </w:p>
+    <w:p>
+      <w:pPr>
+        <w:pStyle w:val="ListParagraph"/>
+        <w:numPr>
+          <w:ilvl w:val="0"/>
+          <w:numId w:val="2"/>
+        </w:numPr>
+        <w:spacing w:after="80" w:line="276"/>
+      </w:pPr>
+      <w:r>
+        <w:rPr>
+          <w:rFonts w:ascii="Calibri" w:cs="Calibri" w:eastAsia="Calibri" w:hAnsi="Calibri"/>
+          <w:b/>
+          <w:bCs/>
+          <w:color w:val="1F2328"/>
+        </w:rPr>
+        <w:t xml:space="preserve">Remapping:</w:t>
+      </w:r>
+      <w:r>
+        <w:rPr>
+          <w:rFonts w:ascii="Calibri" w:cs="Calibri" w:eastAsia="Calibri" w:hAnsi="Calibri"/>
+          <w:color w:val="1F2328"/>
+        </w:rPr>
+        <w:t xml:space="preserve"> you can change the button on the controls screen, under Controller ("Auto-play on / off").</w:t>
+      </w:r>
+    </w:p>
+    <w:p>
+      <w:pPr>
+        <w:pStyle w:val="ListParagraph"/>
+        <w:numPr>
+          <w:ilvl w:val="0"/>
+          <w:numId w:val="2"/>
+        </w:numPr>
+        <w:spacing w:after="80" w:line="276"/>
+      </w:pPr>
+      <w:r>
+        <w:rPr>
+          <w:rFonts w:ascii="Calibri" w:cs="Calibri" w:eastAsia="Calibri" w:hAnsi="Calibri"/>
+          <w:b/>
+          <w:bCs/>
+          <w:color w:val="1F2328"/>
+        </w:rPr>
+        <w:t xml:space="preserve">Showing the right button:</w:t>
+      </w:r>
+      <w:r>
+        <w:rPr>
+          <w:rFonts w:ascii="Calibri" w:cs="Calibri" w:eastAsia="Calibri" w:hAnsi="Calibri"/>
+          <w:color w:val="1F2328"/>
+        </w:rPr>
+        <w:t xml:space="preserve"> the on-screen messages name the button for the device you're using ("Auto-play ON (D-pad down)"), and the controls list shows both.</w:t>
+      </w:r>
+    </w:p>
     <w:sectPr>
       <w:pgSz w:w="12240" w:h="15840" w:orient="portrait"/>
       <w:pgMar w:top="1440" w:right="1440" w:bottom="1440" w:left="1440" w:header="708" w:footer="708" w:gutter="0"/>

</xml_diff>

<commit_message>
Share Pro-Am teams online
Keep teams, rosters, queues, and series on the shared online service so friends can join and play together. Preserve each player's builds and progression in their own save, and report and settle shared series results across services. Add server, client, migration, documentation, and test support.
</commit_message>
<xml_diff>
--- a/PATCH_NOTES_v0.4.8.9.docx
+++ b/PATCH_NOTES_v0.4.8.9.docx
@@ -4416,6 +4416,208 @@
         <w:t xml:space="preserve"> the on-screen messages name the button for the device you're using ("Auto-play ON (D-pad down)"), and the controls list shows both.</w:t>
       </w:r>
     </w:p>
+    <w:p>
+      <w:pPr>
+        <w:pBdr>
+          <w:bottom w:val="single" w:color="D0D7DE" w:sz="4" w:space="1"/>
+        </w:pBdr>
+        <w:spacing w:after="160" w:before="80"/>
+      </w:pPr>
+    </w:p>
+    <w:p>
+      <w:pPr>
+        <w:pStyle w:val="Heading1"/>
+        <w:spacing w:after="120" w:before="280"/>
+      </w:pPr>
+      <w:r>
+        <w:rPr>
+          <w:rFonts w:ascii="Calibri" w:cs="Calibri" w:eastAsia="Calibri" w:hAnsi="Calibri"/>
+          <w:b/>
+          <w:bCs/>
+          <w:color w:val="C8102E"/>
+          <w:sz w:val="32"/>
+          <w:szCs w:val="32"/>
+        </w:rPr>
+        <w:t xml:space="preserve">Quick patch 6 (Oct 25): Pro-Am teams with your friends online</w:t>
+      </w:r>
+    </w:p>
+    <w:p>
+      <w:pPr>
+        <w:spacing w:after="140" w:line="288"/>
+      </w:pPr>
+      <w:r>
+        <w:rPr>
+          <w:rFonts w:ascii="Calibri" w:cs="Calibri" w:eastAsia="Calibri" w:hAnsi="Calibri"/>
+          <w:b/>
+          <w:bCs/>
+          <w:color w:val="1F2328"/>
+        </w:rPr>
+        <w:t xml:space="preserve">Friends can now be on the same Pro-Am team online.</w:t>
+      </w:r>
+      <w:r>
+        <w:rPr>
+          <w:rFonts w:ascii="Calibri" w:cs="Calibri" w:eastAsia="Calibri" w:hAnsi="Calibri"/>
+          <w:color w:val="1F2328"/>
+        </w:rPr>
+        <w:t xml:space="preserve"> Before, each player's Pro-Am team stayed on their own PC, so a friend could never find it or join it, even while you were playing online together.</w:t>
+      </w:r>
+    </w:p>
+    <w:p>
+      <w:pPr>
+        <w:pStyle w:val="ListParagraph"/>
+        <w:numPr>
+          <w:ilvl w:val="0"/>
+          <w:numId w:val="2"/>
+        </w:numPr>
+        <w:spacing w:after="80" w:line="276"/>
+      </w:pPr>
+      <w:r>
+        <w:rPr>
+          <w:rFonts w:ascii="Calibri" w:cs="Calibri" w:eastAsia="Calibri" w:hAnsi="Calibri"/>
+          <w:b/>
+          <w:bCs/>
+          <w:color w:val="1F2328"/>
+        </w:rPr>
+        <w:t xml:space="preserve">Your team lives where you meet:</w:t>
+      </w:r>
+      <w:r>
+        <w:rPr>
+          <w:rFonts w:ascii="Calibri" w:cs="Calibri" w:eastAsia="Calibri" w:hAnsi="Calibri"/>
+          <w:color w:val="1F2328"/>
+        </w:rPr>
+        <w:t xml:space="preserve"> while you're connected, your Pro-Am team lives on the online server you're both on (or on the host's PC when a friend hosts). Friends find it in the team search and join it: straight in if it's open, or by request if it's invite-only. They stay on it through reloads, reconnects and server restarts.</w:t>
+      </w:r>
+    </w:p>
+    <w:p>
+      <w:pPr>
+        <w:pStyle w:val="ListParagraph"/>
+        <w:numPr>
+          <w:ilvl w:val="0"/>
+          <w:numId w:val="2"/>
+        </w:numPr>
+        <w:spacing w:after="80" w:line="276"/>
+      </w:pPr>
+      <w:r>
+        <w:rPr>
+          <w:rFonts w:ascii="Calibri" w:cs="Calibri" w:eastAsia="Calibri" w:hAnsi="Calibri"/>
+          <w:b/>
+          <w:bCs/>
+          <w:color w:val="1F2328"/>
+        </w:rPr>
+        <w:t xml:space="preserve">One HUB:</w:t>
+      </w:r>
+      <w:r>
+        <w:rPr>
+          <w:rFonts w:ascii="Calibri" w:cs="Calibri" w:eastAsia="Calibri" w:hAnsi="Calibri"/>
+          <w:color w:val="1F2328"/>
+        </w:rPr>
+        <w:t xml:space="preserve"> teammates walk into the same HUB and see each other. Whoever has been there longest is the Captain.</w:t>
+      </w:r>
+    </w:p>
+    <w:p>
+      <w:pPr>
+        <w:pStyle w:val="ListParagraph"/>
+        <w:numPr>
+          <w:ilvl w:val="0"/>
+          <w:numId w:val="2"/>
+        </w:numPr>
+        <w:spacing w:after="80" w:line="276"/>
+      </w:pPr>
+      <w:r>
+        <w:rPr>
+          <w:rFonts w:ascii="Calibri" w:cs="Calibri" w:eastAsia="Calibri" w:hAnsi="Calibri"/>
+          <w:b/>
+          <w:bCs/>
+          <w:color w:val="1F2328"/>
+        </w:rPr>
+        <w:t xml:space="preserve">Series games together:</w:t>
+      </w:r>
+      <w:r>
+        <w:rPr>
+          <w:rFonts w:ascii="Calibri" w:cs="Calibri" w:eastAsia="Calibri" w:hAnsi="Calibri"/>
+          <w:color w:val="1F2328"/>
+        </w:rPr>
+        <w:t xml:space="preserve"> when the Captain queues, everyone on the team in the HUB gets the ready check, and only the empty spots are filled with your drafted or AI players. You play one shared game, all on the same side.</w:t>
+      </w:r>
+    </w:p>
+    <w:p>
+      <w:pPr>
+        <w:pStyle w:val="ListParagraph"/>
+        <w:numPr>
+          <w:ilvl w:val="0"/>
+          <w:numId w:val="2"/>
+        </w:numPr>
+        <w:spacing w:after="80" w:line="276"/>
+      </w:pPr>
+      <w:r>
+        <w:rPr>
+          <w:rFonts w:ascii="Calibri" w:cs="Calibri" w:eastAsia="Calibri" w:hAnsi="Calibri"/>
+          <w:b/>
+          <w:bCs/>
+          <w:color w:val="1F2328"/>
+        </w:rPr>
+        <w:t xml:space="preserve">Your progress stays yours:</w:t>
+      </w:r>
+      <w:r>
+        <w:rPr>
+          <w:rFonts w:ascii="Calibri" w:cs="Calibri" w:eastAsia="Calibri" w:hAnsi="Calibri"/>
+          <w:color w:val="1F2328"/>
+        </w:rPr>
+        <w:t xml:space="preserve"> each of you keeps your own build, rank, RP, VC and items in your own save. A series game counts for each player's RP. When a series ends, each member moves up or down a division once and gets the series bonus.</w:t>
+      </w:r>
+    </w:p>
+    <w:p>
+      <w:pPr>
+        <w:pStyle w:val="ListParagraph"/>
+        <w:numPr>
+          <w:ilvl w:val="0"/>
+          <w:numId w:val="2"/>
+        </w:numPr>
+        <w:spacing w:after="80" w:line="276"/>
+      </w:pPr>
+      <w:r>
+        <w:rPr>
+          <w:rFonts w:ascii="Calibri" w:cs="Calibri" w:eastAsia="Calibri" w:hAnsi="Calibri"/>
+          <w:b/>
+          <w:bCs/>
+          <w:color w:val="1F2328"/>
+        </w:rPr>
+        <w:t xml:space="preserve">Still your choice:</w:t>
+      </w:r>
+      <w:r>
+        <w:rPr>
+          <w:rFonts w:ascii="Calibri" w:cs="Calibri" w:eastAsia="Calibri" w:hAnsi="Calibri"/>
+          <w:color w:val="1F2328"/>
+        </w:rPr>
+        <w:t xml:space="preserve"> you can still make separate teams, or play on your own team with AI teammates, online and offline.</w:t>
+      </w:r>
+    </w:p>
+    <w:p>
+      <w:pPr>
+        <w:pStyle w:val="ListParagraph"/>
+        <w:numPr>
+          <w:ilvl w:val="0"/>
+          <w:numId w:val="2"/>
+        </w:numPr>
+        <w:spacing w:after="80" w:line="276"/>
+      </w:pPr>
+      <w:r>
+        <w:rPr>
+          <w:rFonts w:ascii="Calibri" w:cs="Calibri" w:eastAsia="Calibri" w:hAnsi="Calibri"/>
+          <w:b/>
+          <w:bCs/>
+          <w:color w:val="1F2328"/>
+        </w:rPr>
+        <w:t xml:space="preserve">Teams made offline:</w:t>
+      </w:r>
+      <w:r>
+        <w:rPr>
+          <w:rFonts w:ascii="Calibri" w:cs="Calibri" w:eastAsia="Calibri" w:hAnsi="Calibri"/>
+          <w:color w:val="1F2328"/>
+        </w:rPr>
+        <w:t xml:space="preserve"> a team you made while playing offline stays offline. Online, create a team or join one there.</w:t>
+      </w:r>
+    </w:p>
     <w:sectPr>
       <w:pgSz w:w="12240" w:h="15840" w:orient="portrait"/>
       <w:pgMar w:top="1440" w:right="1440" w:bottom="1440" w:left="1440" w:header="708" w:footer="708" w:gutter="0"/>

</xml_diff>

<commit_message>
Add Gauntlet hand limit and freeze safeguards
Cap hands at five with discard-or-refuse draws, upgrade replay support to engine v3, and add court recovery and a pause menu. Remove the per-run VC cap while retaining the time-based limit; update balance, documentation, and tests.
</commit_message>
<xml_diff>
--- a/PATCH_NOTES_v0.4.8.9.docx
+++ b/PATCH_NOTES_v0.4.8.9.docx
@@ -4618,6 +4618,453 @@
         <w:t xml:space="preserve"> a team you made while playing offline stays offline. Online, create a team or join one there.</w:t>
       </w:r>
     </w:p>
+    <w:p>
+      <w:pPr>
+        <w:pBdr>
+          <w:bottom w:val="single" w:color="D0D7DE" w:sz="4" w:space="1"/>
+        </w:pBdr>
+        <w:spacing w:after="160" w:before="80"/>
+      </w:pPr>
+    </w:p>
+    <w:p>
+      <w:pPr>
+        <w:pStyle w:val="Heading1"/>
+        <w:spacing w:after="120" w:before="280"/>
+      </w:pPr>
+      <w:r>
+        <w:rPr>
+          <w:rFonts w:ascii="Calibri" w:cs="Calibri" w:eastAsia="Calibri" w:hAnsi="Calibri"/>
+          <w:b/>
+          <w:bCs/>
+          <w:color w:val="C8102E"/>
+          <w:sz w:val="32"/>
+          <w:szCs w:val="32"/>
+        </w:rPr>
+        <w:t xml:space="preserve">Quick patch 7 (Oct 25): Gauntlet hand limit, the freeze fix, no VC cap per run</w:t>
+      </w:r>
+    </w:p>
+    <w:p>
+      <w:pPr>
+        <w:pStyle w:val="Heading2"/>
+        <w:spacing w:after="80" w:before="200"/>
+      </w:pPr>
+      <w:r>
+        <w:rPr>
+          <w:rFonts w:ascii="Calibri" w:cs="Calibri" w:eastAsia="Calibri" w:hAnsi="Calibri"/>
+          <w:b/>
+          <w:bCs/>
+          <w:color w:val="1F2328"/>
+          <w:sz w:val="26"/>
+          <w:szCs w:val="26"/>
+        </w:rPr>
+        <w:t xml:space="preserve">Fixed: the Gauntlet could freeze</w:t>
+      </w:r>
+    </w:p>
+    <w:p>
+      <w:pPr>
+        <w:spacing w:after="140" w:line="288"/>
+      </w:pPr>
+      <w:r>
+        <w:rPr>
+          <w:rFonts w:ascii="Calibri" w:cs="Calibri" w:eastAsia="Calibri" w:hAnsi="Calibri"/>
+          <w:color w:val="1F2328"/>
+        </w:rPr>
+        <w:t xml:space="preserve">Sometimes card picks and End Turn stopped doing anything, and the only way out was signing out. The cause: pressing Continue at the final buzzer while the last play was still running left a stale flag behind. That flag wiped the next match's pre-match screen while the game still thought the screen was open, so every click on the table was ignored. Pressing T or F on the pre-match screen could do the same thing.</w:t>
+      </w:r>
+    </w:p>
+    <w:p>
+      <w:pPr>
+        <w:pStyle w:val="ListParagraph"/>
+        <w:numPr>
+          <w:ilvl w:val="0"/>
+          <w:numId w:val="2"/>
+        </w:numPr>
+        <w:spacing w:after="80" w:line="276"/>
+      </w:pPr>
+      <w:r>
+        <w:rPr>
+          <w:rFonts w:ascii="Calibri" w:cs="Calibri" w:eastAsia="Calibri" w:hAnsi="Calibri"/>
+          <w:b/>
+          <w:bCs/>
+          <w:color w:val="1F2328"/>
+        </w:rPr>
+        <w:t xml:space="preserve">That's fixed.</w:t>
+      </w:r>
+      <w:r>
+        <w:rPr>
+          <w:rFonts w:ascii="Calibri" w:cs="Calibri" w:eastAsia="Calibri" w:hAnsi="Calibri"/>
+          <w:color w:val="1F2328"/>
+        </w:rPr>
+        <w:t xml:space="preserve"> On the pre-match screen, Enter, Space, E or Y tips off.</w:t>
+      </w:r>
+    </w:p>
+    <w:p>
+      <w:pPr>
+        <w:pStyle w:val="ListParagraph"/>
+        <w:numPr>
+          <w:ilvl w:val="0"/>
+          <w:numId w:val="2"/>
+        </w:numPr>
+        <w:spacing w:after="80" w:line="276"/>
+      </w:pPr>
+      <w:r>
+        <w:rPr>
+          <w:rFonts w:ascii="Calibri" w:cs="Calibri" w:eastAsia="Calibri" w:hAnsi="Calibri"/>
+          <w:b/>
+          <w:bCs/>
+          <w:color w:val="1F2328"/>
+        </w:rPr>
+        <w:t xml:space="preserve">Safety nets:</w:t>
+      </w:r>
+      <w:r>
+        <w:rPr>
+          <w:rFonts w:ascii="Calibri" w:cs="Calibri" w:eastAsia="Calibri" w:hAnsi="Calibri"/>
+          <w:color w:val="1F2328"/>
+        </w:rPr>
+        <w:t xml:space="preserve"> if something goes wrong anyway, the game puts your run back to its last save and keeps going. A stuck play on the court finishes by itself.</w:t>
+      </w:r>
+    </w:p>
+    <w:p>
+      <w:pPr>
+        <w:pStyle w:val="ListParagraph"/>
+        <w:numPr>
+          <w:ilvl w:val="0"/>
+          <w:numId w:val="2"/>
+        </w:numPr>
+        <w:spacing w:after="80" w:line="276"/>
+      </w:pPr>
+      <w:r>
+        <w:rPr>
+          <w:rFonts w:ascii="Calibri" w:cs="Calibri" w:eastAsia="Calibri" w:hAnsi="Calibri"/>
+          <w:b/>
+          <w:bCs/>
+          <w:color w:val="1F2328"/>
+        </w:rPr>
+        <w:t xml:space="preserve">New Menu:</w:t>
+      </w:r>
+      <w:r>
+        <w:rPr>
+          <w:rFonts w:ascii="Calibri" w:cs="Calibri" w:eastAsia="Calibri" w:hAnsi="Calibri"/>
+          <w:color w:val="1F2328"/>
+        </w:rPr>
+        <w:t xml:space="preserve"> a </w:t>
+      </w:r>
+      <w:r>
+        <w:rPr>
+          <w:rFonts w:ascii="Calibri" w:cs="Calibri" w:eastAsia="Calibri" w:hAnsi="Calibri"/>
+          <w:b/>
+          <w:bCs/>
+          <w:color w:val="1F2328"/>
+        </w:rPr>
+        <w:t xml:space="preserve">Menu</w:t>
+      </w:r>
+      <w:r>
+        <w:rPr>
+          <w:rFonts w:ascii="Calibri" w:cs="Calibri" w:eastAsia="Calibri" w:hAnsi="Calibri"/>
+          <w:color w:val="1F2328"/>
+        </w:rPr>
+        <w:t xml:space="preserve"> button (Esc, or B on a controller) opens Resume, </w:t>
+      </w:r>
+      <w:r>
+        <w:rPr>
+          <w:rFonts w:ascii="Calibri" w:cs="Calibri" w:eastAsia="Calibri" w:hAnsi="Calibri"/>
+          <w:b/>
+          <w:bCs/>
+          <w:color w:val="1F2328"/>
+        </w:rPr>
+        <w:t xml:space="preserve">Back to the bracket</w:t>
+      </w:r>
+      <w:r>
+        <w:rPr>
+          <w:rFonts w:ascii="Calibri" w:cs="Calibri" w:eastAsia="Calibri" w:hAnsi="Calibri"/>
+          <w:color w:val="1F2328"/>
+        </w:rPr>
+        <w:t xml:space="preserve"> and </w:t>
+      </w:r>
+      <w:r>
+        <w:rPr>
+          <w:rFonts w:ascii="Calibri" w:cs="Calibri" w:eastAsia="Calibri" w:hAnsi="Calibri"/>
+          <w:b/>
+          <w:bCs/>
+          <w:color w:val="1F2328"/>
+        </w:rPr>
+        <w:t xml:space="preserve">Leave the Gauntlet</w:t>
+      </w:r>
+      <w:r>
+        <w:rPr>
+          <w:rFonts w:ascii="Calibri" w:cs="Calibri" w:eastAsia="Calibri" w:hAnsi="Calibri"/>
+          <w:color w:val="1F2328"/>
+        </w:rPr>
+        <w:t xml:space="preserve">. You never have to sign out to get unstuck.</w:t>
+      </w:r>
+    </w:p>
+    <w:p>
+      <w:pPr>
+        <w:pStyle w:val="Heading2"/>
+        <w:spacing w:after="80" w:before="200"/>
+      </w:pPr>
+      <w:r>
+        <w:rPr>
+          <w:rFonts w:ascii="Calibri" w:cs="Calibri" w:eastAsia="Calibri" w:hAnsi="Calibri"/>
+          <w:b/>
+          <w:bCs/>
+          <w:color w:val="1F2328"/>
+          <w:sz w:val="26"/>
+          <w:szCs w:val="26"/>
+        </w:rPr>
+        <w:t xml:space="preserve">Your hand holds 5 cards</w:t>
+      </w:r>
+    </w:p>
+    <w:p>
+      <w:pPr>
+        <w:pStyle w:val="ListParagraph"/>
+        <w:numPr>
+          <w:ilvl w:val="0"/>
+          <w:numId w:val="2"/>
+        </w:numPr>
+        <w:spacing w:after="80" w:line="276"/>
+      </w:pPr>
+      <w:r>
+        <w:rPr>
+          <w:rFonts w:ascii="Calibri" w:cs="Calibri" w:eastAsia="Calibri" w:hAnsi="Calibri"/>
+          <w:b/>
+          <w:bCs/>
+          <w:color w:val="1F2328"/>
+        </w:rPr>
+        <w:t xml:space="preserve">The limit:</w:t>
+      </w:r>
+      <w:r>
+        <w:rPr>
+          <w:rFonts w:ascii="Calibri" w:cs="Calibri" w:eastAsia="Calibri" w:hAnsi="Calibri"/>
+          <w:color w:val="1F2328"/>
+        </w:rPr>
+        <w:t xml:space="preserve"> your hand holds at most </w:t>
+      </w:r>
+      <w:r>
+        <w:rPr>
+          <w:rFonts w:ascii="Calibri" w:cs="Calibri" w:eastAsia="Calibri" w:hAnsi="Calibri"/>
+          <w:b/>
+          <w:bCs/>
+          <w:color w:val="1F2328"/>
+        </w:rPr>
+        <w:t xml:space="preserve">5 cards</w:t>
+      </w:r>
+      <w:r>
+        <w:rPr>
+          <w:rFonts w:ascii="Calibri" w:cs="Calibri" w:eastAsia="Calibri" w:hAnsi="Calibri"/>
+          <w:color w:val="1F2328"/>
+        </w:rPr>
+        <w:t xml:space="preserve">, held cards included. Each possession you draw up to 5.</w:t>
+      </w:r>
+    </w:p>
+    <w:p>
+      <w:pPr>
+        <w:pStyle w:val="ListParagraph"/>
+        <w:numPr>
+          <w:ilvl w:val="0"/>
+          <w:numId w:val="2"/>
+        </w:numPr>
+        <w:spacing w:after="80" w:line="276"/>
+      </w:pPr>
+      <w:r>
+        <w:rPr>
+          <w:rFonts w:ascii="Calibri" w:cs="Calibri" w:eastAsia="Calibri" w:hAnsi="Calibri"/>
+          <w:b/>
+          <w:bCs/>
+          <w:color w:val="1F2328"/>
+        </w:rPr>
+        <w:t xml:space="preserve">Drawing past 5:</w:t>
+      </w:r>
+      <w:r>
+        <w:rPr>
+          <w:rFonts w:ascii="Calibri" w:cs="Calibri" w:eastAsia="Calibri" w:hAnsi="Calibri"/>
+          <w:color w:val="1F2328"/>
+        </w:rPr>
+        <w:t xml:space="preserve"> a card that would take you past your limit (Outlet Pass, Flow, Make-It-Take-It) asks you to </w:t>
+      </w:r>
+      <w:r>
+        <w:rPr>
+          <w:rFonts w:ascii="Calibri" w:cs="Calibri" w:eastAsia="Calibri" w:hAnsi="Calibri"/>
+          <w:b/>
+          <w:bCs/>
+          <w:color w:val="1F2328"/>
+        </w:rPr>
+        <w:t xml:space="preserve">discard a card to take it</w:t>
+      </w:r>
+      <w:r>
+        <w:rPr>
+          <w:rFonts w:ascii="Calibri" w:cs="Calibri" w:eastAsia="Calibri" w:hAnsi="Calibri"/>
+          <w:color w:val="1F2328"/>
+        </w:rPr>
+        <w:t xml:space="preserve">, or </w:t>
+      </w:r>
+      <w:r>
+        <w:rPr>
+          <w:rFonts w:ascii="Calibri" w:cs="Calibri" w:eastAsia="Calibri" w:hAnsi="Calibri"/>
+          <w:b/>
+          <w:bCs/>
+          <w:color w:val="1F2328"/>
+        </w:rPr>
+        <w:t xml:space="preserve">refuse it</w:t>
+      </w:r>
+      <w:r>
+        <w:rPr>
+          <w:rFonts w:ascii="Calibri" w:cs="Calibri" w:eastAsia="Calibri" w:hAnsi="Calibri"/>
+          <w:color w:val="1F2328"/>
+        </w:rPr>
+        <w:t xml:space="preserve">.</w:t>
+      </w:r>
+    </w:p>
+    <w:p>
+      <w:pPr>
+        <w:pStyle w:val="ListParagraph"/>
+        <w:numPr>
+          <w:ilvl w:val="0"/>
+          <w:numId w:val="2"/>
+        </w:numPr>
+        <w:spacing w:after="80" w:line="276"/>
+      </w:pPr>
+      <w:r>
+        <w:rPr>
+          <w:rFonts w:ascii="Calibri" w:cs="Calibri" w:eastAsia="Calibri" w:hAnsi="Calibri"/>
+          <w:b/>
+          <w:bCs/>
+          <w:color w:val="1F2328"/>
+        </w:rPr>
+        <w:t xml:space="preserve">Raising the limit:</w:t>
+      </w:r>
+      <w:r>
+        <w:rPr>
+          <w:rFonts w:ascii="Calibri" w:cs="Calibri" w:eastAsia="Calibri" w:hAnsi="Calibri"/>
+          <w:color w:val="1F2328"/>
+        </w:rPr>
+        <w:t xml:space="preserve"> Playbook and Superteam give +1, Next Play gives +1 (+2 upgraded), Motion Offense gives +1, and the Up-Tempo rule plays with 6 cards. The hand shows your count, like "Hand 5/5".</w:t>
+      </w:r>
+    </w:p>
+    <w:p>
+      <w:pPr>
+        <w:pStyle w:val="ListParagraph"/>
+        <w:numPr>
+          <w:ilvl w:val="0"/>
+          <w:numId w:val="2"/>
+        </w:numPr>
+        <w:spacing w:after="80" w:line="276"/>
+      </w:pPr>
+      <w:r>
+        <w:rPr>
+          <w:rFonts w:ascii="Calibri" w:cs="Calibri" w:eastAsia="Calibri" w:hAnsi="Calibri"/>
+          <w:b/>
+          <w:bCs/>
+          <w:color w:val="1F2328"/>
+        </w:rPr>
+        <w:t xml:space="preserve">Rebalanced:</w:t>
+      </w:r>
+      <w:r>
+        <w:rPr>
+          <w:rFonts w:ascii="Calibri" w:cs="Calibri" w:eastAsia="Calibri" w:hAnsi="Calibri"/>
+          <w:color w:val="1F2328"/>
+        </w:rPr>
+        <w:t xml:space="preserve"> opponents hit a little softer to match. A good run with a starter still wins about one time in five.</w:t>
+      </w:r>
+    </w:p>
+    <w:p>
+      <w:pPr>
+        <w:pStyle w:val="Heading2"/>
+        <w:spacing w:after="80" w:before="200"/>
+      </w:pPr>
+      <w:r>
+        <w:rPr>
+          <w:rFonts w:ascii="Calibri" w:cs="Calibri" w:eastAsia="Calibri" w:hAnsi="Calibri"/>
+          <w:b/>
+          <w:bCs/>
+          <w:color w:val="1F2328"/>
+          <w:sz w:val="26"/>
+          <w:szCs w:val="26"/>
+        </w:rPr>
+        <w:t xml:space="preserve">No VC cap per run</w:t>
+      </w:r>
+    </w:p>
+    <w:p>
+      <w:pPr>
+        <w:pStyle w:val="ListParagraph"/>
+        <w:numPr>
+          <w:ilvl w:val="0"/>
+          <w:numId w:val="2"/>
+        </w:numPr>
+        <w:spacing w:after="80" w:line="276"/>
+      </w:pPr>
+      <w:r>
+        <w:rPr>
+          <w:rFonts w:ascii="Calibri" w:cs="Calibri" w:eastAsia="Calibri" w:hAnsi="Calibri"/>
+          <w:b/>
+          <w:bCs/>
+          <w:color w:val="1F2328"/>
+        </w:rPr>
+        <w:t xml:space="preserve">Paid in full:</w:t>
+      </w:r>
+      <w:r>
+        <w:rPr>
+          <w:rFonts w:ascii="Calibri" w:cs="Calibri" w:eastAsia="Calibri" w:hAnsi="Calibri"/>
+          <w:color w:val="1F2328"/>
+        </w:rPr>
+        <w:t xml:space="preserve"> a run pays everything it earns: 140 a match, 300 a Rival, 900 a boss, 2,000 for the Final. A completed run usually pays about 8,500–9,600 VC.</w:t>
+      </w:r>
+    </w:p>
+    <w:p>
+      <w:pPr>
+        <w:pStyle w:val="ListParagraph"/>
+        <w:numPr>
+          <w:ilvl w:val="0"/>
+          <w:numId w:val="2"/>
+        </w:numPr>
+        <w:spacing w:after="80" w:line="276"/>
+      </w:pPr>
+      <w:r>
+        <w:rPr>
+          <w:rFonts w:ascii="Calibri" w:cs="Calibri" w:eastAsia="Calibri" w:hAnsi="Calibri"/>
+          <w:b/>
+          <w:bCs/>
+          <w:color w:val="1F2328"/>
+        </w:rPr>
+        <w:t xml:space="preserve">Speed check:</w:t>
+      </w:r>
+      <w:r>
+        <w:rPr>
+          <w:rFonts w:ascii="Calibri" w:cs="Calibri" w:eastAsia="Calibri" w:hAnsi="Calibri"/>
+          <w:color w:val="1F2328"/>
+        </w:rPr>
+        <w:t xml:space="preserve"> the only limit left is a check against impossibly fast runs, at 300 VC per real minute. It never trims an honest run.</w:t>
+      </w:r>
+    </w:p>
+    <w:p>
+      <w:pPr>
+        <w:pStyle w:val="Heading2"/>
+        <w:spacing w:after="80" w:before="200"/>
+      </w:pPr>
+      <w:r>
+        <w:rPr>
+          <w:rFonts w:ascii="Calibri" w:cs="Calibri" w:eastAsia="Calibri" w:hAnsi="Calibri"/>
+          <w:b/>
+          <w:bCs/>
+          <w:color w:val="1F2328"/>
+          <w:sz w:val="26"/>
+          <w:szCs w:val="26"/>
+        </w:rPr>
+        <w:t xml:space="preserve">Runs from before this update</w:t>
+      </w:r>
+    </w:p>
+    <w:p>
+      <w:pPr>
+        <w:spacing w:after="140" w:line="288"/>
+      </w:pPr>
+      <w:r>
+        <w:rPr>
+          <w:rFonts w:ascii="Calibri" w:cs="Calibri" w:eastAsia="Calibri" w:hAnsi="Calibri"/>
+          <w:color w:val="1F2328"/>
+        </w:rPr>
+        <w:t xml:space="preserve">A run started before this update can't continue under the new hand rule. You can end it from the Gauntlet screen, and it's paid what it earned.</w:t>
+      </w:r>
+    </w:p>
     <w:sectPr>
       <w:pgSz w:w="12240" w:h="15840" w:orient="portrait"/>
       <w:pgMar w:top="1440" w:right="1440" w:bottom="1440" w:left="1440" w:header="708" w:footer="708" w:gutter="0"/>

</xml_diff>

<commit_message>
Align AI and player Pro-Am team progression
Show team rank and progress toward the next HUB building across Pro-Am screens. Bank RP earned past 100, carry the excess on series wins, and apply the same series-only promotion and demotion rules to AI teams.
</commit_message>
<xml_diff>
--- a/PATCH_NOTES_v0.4.8.9.docx
+++ b/PATCH_NOTES_v0.4.8.9.docx
@@ -5065,6 +5065,584 @@
         <w:t xml:space="preserve">A run started before this update can't continue under the new hand rule. You can end it from the Gauntlet screen, and it's paid what it earned.</w:t>
       </w:r>
     </w:p>
+    <w:p>
+      <w:pPr>
+        <w:pBdr>
+          <w:bottom w:val="single" w:color="D0D7DE" w:sz="4" w:space="1"/>
+        </w:pBdr>
+        <w:spacing w:after="160" w:before="80"/>
+      </w:pPr>
+    </w:p>
+    <w:p>
+      <w:pPr>
+        <w:pStyle w:val="Heading1"/>
+        <w:spacing w:after="120" w:before="280"/>
+      </w:pPr>
+      <w:r>
+        <w:rPr>
+          <w:rFonts w:ascii="Calibri" w:cs="Calibri" w:eastAsia="Calibri" w:hAnsi="Calibri"/>
+          <w:b/>
+          <w:bCs/>
+          <w:color w:val="C8102E"/>
+          <w:sz w:val="32"/>
+          <w:szCs w:val="32"/>
+        </w:rPr>
+        <w:t xml:space="preserve">Quick patch 8 (Oct 25): your Pro-Am team's own rank, where you can see it</w:t>
+      </w:r>
+    </w:p>
+    <w:p>
+      <w:pPr>
+        <w:spacing w:after="140" w:line="288"/>
+      </w:pPr>
+      <w:r>
+        <w:rPr>
+          <w:rFonts w:ascii="Calibri" w:cs="Calibri" w:eastAsia="Calibri" w:hAnsi="Calibri"/>
+          <w:color w:val="1F2328"/>
+        </w:rPr>
+        <w:t xml:space="preserve">Your Pro-Am team has its own rank: a division and RP, separate from each player's own rank. It decides which HUB building the team plays out of. It now shows clearly everywhere:</w:t>
+      </w:r>
+    </w:p>
+    <w:p>
+      <w:pPr>
+        <w:pStyle w:val="ListParagraph"/>
+        <w:numPr>
+          <w:ilvl w:val="0"/>
+          <w:numId w:val="2"/>
+        </w:numPr>
+        <w:spacing w:after="80" w:line="276"/>
+      </w:pPr>
+      <w:r>
+        <w:rPr>
+          <w:rFonts w:ascii="Calibri" w:cs="Calibri" w:eastAsia="Calibri" w:hAnsi="Calibri"/>
+          <w:b/>
+          <w:bCs/>
+          <w:color w:val="1F2328"/>
+        </w:rPr>
+        <w:t xml:space="preserve">Team page:</w:t>
+      </w:r>
+      <w:r>
+        <w:rPr>
+          <w:rFonts w:ascii="Calibri" w:cs="Calibri" w:eastAsia="Calibri" w:hAnsi="Calibri"/>
+          <w:color w:val="1F2328"/>
+        </w:rPr>
+        <w:t xml:space="preserve"> a </w:t>
+      </w:r>
+      <w:r>
+        <w:rPr>
+          <w:rFonts w:ascii="Calibri" w:cs="Calibri" w:eastAsia="Calibri" w:hAnsi="Calibri"/>
+          <w:b/>
+          <w:bCs/>
+          <w:color w:val="1F2328"/>
+        </w:rPr>
+        <w:t xml:space="preserve">TEAM RANK</w:t>
+      </w:r>
+      <w:r>
+        <w:rPr>
+          <w:rFonts w:ascii="Calibri" w:cs="Calibri" w:eastAsia="Calibri" w:hAnsi="Calibri"/>
+          <w:color w:val="1F2328"/>
+        </w:rPr>
+        <w:t xml:space="preserve"> panel shows the team's division, its RP, its games and series record, and how far the next building is, like "3 series wins to Silver: Northgate High School Gym". The roster's rank column is labelled </w:t>
+      </w:r>
+      <w:r>
+        <w:rPr>
+          <w:rFonts w:ascii="Calibri" w:cs="Calibri" w:eastAsia="Calibri" w:hAnsi="Calibri"/>
+          <w:b/>
+          <w:bCs/>
+          <w:color w:val="1F2328"/>
+        </w:rPr>
+        <w:t xml:space="preserve">Their own rank</w:t>
+      </w:r>
+      <w:r>
+        <w:rPr>
+          <w:rFonts w:ascii="Calibri" w:cs="Calibri" w:eastAsia="Calibri" w:hAnsi="Calibri"/>
+          <w:color w:val="1F2328"/>
+        </w:rPr>
+        <w:t xml:space="preserve">, so the two are never mixed up.</w:t>
+      </w:r>
+    </w:p>
+    <w:p>
+      <w:pPr>
+        <w:pStyle w:val="ListParagraph"/>
+        <w:numPr>
+          <w:ilvl w:val="0"/>
+          <w:numId w:val="2"/>
+        </w:numPr>
+        <w:spacing w:after="80" w:line="276"/>
+      </w:pPr>
+      <w:r>
+        <w:rPr>
+          <w:rFonts w:ascii="Calibri" w:cs="Calibri" w:eastAsia="Calibri" w:hAnsi="Calibri"/>
+          <w:b/>
+          <w:bCs/>
+          <w:color w:val="1F2328"/>
+        </w:rPr>
+        <w:t xml:space="preserve">The office whiteboard:</w:t>
+      </w:r>
+      <w:r>
+        <w:rPr>
+          <w:rFonts w:ascii="Calibri" w:cs="Calibri" w:eastAsia="Calibri" w:hAnsi="Calibri"/>
+          <w:color w:val="1F2328"/>
+        </w:rPr>
+        <w:t xml:space="preserve"> both the menu's whiteboard and the one on the wall in the HUB show the team's division and RP, and the line to the next building.</w:t>
+      </w:r>
+    </w:p>
+    <w:p>
+      <w:pPr>
+        <w:pStyle w:val="ListParagraph"/>
+        <w:numPr>
+          <w:ilvl w:val="0"/>
+          <w:numId w:val="2"/>
+        </w:numPr>
+        <w:spacing w:after="80" w:line="276"/>
+      </w:pPr>
+      <w:r>
+        <w:rPr>
+          <w:rFonts w:ascii="Calibri" w:cs="Calibri" w:eastAsia="Calibri" w:hAnsi="Calibri"/>
+          <w:b/>
+          <w:bCs/>
+          <w:color w:val="1F2328"/>
+        </w:rPr>
+        <w:t xml:space="preserve">In the HUB:</w:t>
+      </w:r>
+      <w:r>
+        <w:rPr>
+          <w:rFonts w:ascii="Calibri" w:cs="Calibri" w:eastAsia="Calibri" w:hAnsi="Calibri"/>
+          <w:color w:val="1F2328"/>
+        </w:rPr>
+        <w:t xml:space="preserve"> the badge at the top shows "Team Bronze 1 · 0 RP · 3 series wins to Silver…".</w:t>
+      </w:r>
+    </w:p>
+    <w:p>
+      <w:pPr>
+        <w:spacing w:after="140" w:line="288"/>
+      </w:pPr>
+      <w:r>
+        <w:rPr>
+          <w:rFonts w:ascii="Calibri" w:cs="Calibri" w:eastAsia="Calibri" w:hAnsi="Calibri"/>
+          <w:color w:val="1F2328"/>
+        </w:rPr>
+        <w:t xml:space="preserve">A series win moves the team up one division. Losing a series puts the team back to 0 RP, and drops it a division if it was already at 0. Platinum's clubhouse is the top building for now.</w:t>
+      </w:r>
+    </w:p>
+    <w:p>
+      <w:pPr>
+        <w:pBdr>
+          <w:bottom w:val="single" w:color="D0D7DE" w:sz="4" w:space="1"/>
+        </w:pBdr>
+        <w:spacing w:after="160" w:before="80"/>
+      </w:pPr>
+    </w:p>
+    <w:p>
+      <w:pPr>
+        <w:pStyle w:val="Heading1"/>
+        <w:spacing w:after="120" w:before="280"/>
+      </w:pPr>
+      <w:r>
+        <w:rPr>
+          <w:rFonts w:ascii="Calibri" w:cs="Calibri" w:eastAsia="Calibri" w:hAnsi="Calibri"/>
+          <w:b/>
+          <w:bCs/>
+          <w:color w:val="C8102E"/>
+          <w:sz w:val="32"/>
+          <w:szCs w:val="32"/>
+        </w:rPr>
+        <w:t xml:space="preserve">Quick patch 9 (Oct 25): team RP past 100 carries into the next division</w:t>
+      </w:r>
+    </w:p>
+    <w:p>
+      <w:pPr>
+        <w:pStyle w:val="ListParagraph"/>
+        <w:numPr>
+          <w:ilvl w:val="0"/>
+          <w:numId w:val="2"/>
+        </w:numPr>
+        <w:spacing w:after="80" w:line="276"/>
+      </w:pPr>
+      <w:r>
+        <w:rPr>
+          <w:rFonts w:ascii="Calibri" w:cs="Calibri" w:eastAsia="Calibri" w:hAnsi="Calibri"/>
+          <w:b/>
+          <w:bCs/>
+          <w:color w:val="1F2328"/>
+        </w:rPr>
+        <w:t xml:space="preserve">No more wasted RP:</w:t>
+      </w:r>
+      <w:r>
+        <w:rPr>
+          <w:rFonts w:ascii="Calibri" w:cs="Calibri" w:eastAsia="Calibri" w:hAnsi="Calibri"/>
+          <w:color w:val="1F2328"/>
+        </w:rPr>
+        <w:t xml:space="preserve"> a team's RP used to stop at 100, so anything it earned past that while finishing its series was lost. Now it keeps counting.</w:t>
+      </w:r>
+    </w:p>
+    <w:p>
+      <w:pPr>
+        <w:pStyle w:val="ListParagraph"/>
+        <w:numPr>
+          <w:ilvl w:val="0"/>
+          <w:numId w:val="2"/>
+        </w:numPr>
+        <w:spacing w:after="80" w:line="276"/>
+      </w:pPr>
+      <w:r>
+        <w:rPr>
+          <w:rFonts w:ascii="Calibri" w:cs="Calibri" w:eastAsia="Calibri" w:hAnsi="Calibri"/>
+          <w:b/>
+          <w:bCs/>
+          <w:color w:val="1F2328"/>
+        </w:rPr>
+        <w:t xml:space="preserve">On promotion:</w:t>
+      </w:r>
+      <w:r>
+        <w:rPr>
+          <w:rFonts w:ascii="Calibri" w:cs="Calibri" w:eastAsia="Calibri" w:hAnsi="Calibri"/>
+          <w:color w:val="1F2328"/>
+        </w:rPr>
+        <w:t xml:space="preserve"> when the team wins its series and moves up, the division's 100 is used up and </w:t>
+      </w:r>
+      <w:r>
+        <w:rPr>
+          <w:rFonts w:ascii="Calibri" w:cs="Calibri" w:eastAsia="Calibri" w:hAnsi="Calibri"/>
+          <w:b/>
+          <w:bCs/>
+          <w:color w:val="1F2328"/>
+        </w:rPr>
+        <w:t xml:space="preserve">everything over 100 starts the next division</w:t>
+      </w:r>
+      <w:r>
+        <w:rPr>
+          <w:rFonts w:ascii="Calibri" w:cs="Calibri" w:eastAsia="Calibri" w:hAnsi="Calibri"/>
+          <w:color w:val="1F2328"/>
+        </w:rPr>
+        <w:t xml:space="preserve">. For example, 130 RP becomes 30. A team promoted below 100 starts the next division at 0.</w:t>
+      </w:r>
+    </w:p>
+    <w:p>
+      <w:pPr>
+        <w:pStyle w:val="ListParagraph"/>
+        <w:numPr>
+          <w:ilvl w:val="0"/>
+          <w:numId w:val="2"/>
+        </w:numPr>
+        <w:spacing w:after="80" w:line="276"/>
+      </w:pPr>
+      <w:r>
+        <w:rPr>
+          <w:rFonts w:ascii="Calibri" w:cs="Calibri" w:eastAsia="Calibri" w:hAnsi="Calibri"/>
+          <w:b/>
+          <w:bCs/>
+          <w:color w:val="1F2328"/>
+        </w:rPr>
+        <w:t xml:space="preserve">RP never promotes a team by itself:</w:t>
+      </w:r>
+      <w:r>
+        <w:rPr>
+          <w:rFonts w:ascii="Calibri" w:cs="Calibri" w:eastAsia="Calibri" w:hAnsi="Calibri"/>
+          <w:color w:val="1F2328"/>
+        </w:rPr>
+        <w:t xml:space="preserve"> only a series win does, as before. A lost series still puts the team back to 0 RP.</w:t>
+      </w:r>
+    </w:p>
+    <w:p>
+      <w:pPr>
+        <w:pStyle w:val="ListParagraph"/>
+        <w:numPr>
+          <w:ilvl w:val="0"/>
+          <w:numId w:val="2"/>
+        </w:numPr>
+        <w:spacing w:after="80" w:line="276"/>
+      </w:pPr>
+      <w:r>
+        <w:rPr>
+          <w:rFonts w:ascii="Calibri" w:cs="Calibri" w:eastAsia="Calibri" w:hAnsi="Calibri"/>
+          <w:b/>
+          <w:bCs/>
+          <w:color w:val="1F2328"/>
+        </w:rPr>
+        <w:t xml:space="preserve">On screen:</w:t>
+      </w:r>
+      <w:r>
+        <w:rPr>
+          <w:rFonts w:ascii="Calibri" w:cs="Calibri" w:eastAsia="Calibri" w:hAnsi="Calibri"/>
+          <w:color w:val="1F2328"/>
+        </w:rPr>
+        <w:t xml:space="preserve"> the team page, whiteboards and HUB badge show the full RP and how much carries, for example "+30 RP carries into the next division".</w:t>
+      </w:r>
+    </w:p>
+    <w:p>
+      <w:pPr>
+        <w:pStyle w:val="ListParagraph"/>
+        <w:numPr>
+          <w:ilvl w:val="0"/>
+          <w:numId w:val="2"/>
+        </w:numPr>
+        <w:spacing w:after="80" w:line="276"/>
+      </w:pPr>
+      <w:r>
+        <w:rPr>
+          <w:rFonts w:ascii="Calibri" w:cs="Calibri" w:eastAsia="Calibri" w:hAnsi="Calibri"/>
+          <w:b/>
+          <w:bCs/>
+          <w:color w:val="1F2328"/>
+        </w:rPr>
+        <w:t xml:space="preserve">Your own rank:</w:t>
+      </w:r>
+      <w:r>
+        <w:rPr>
+          <w:rFonts w:ascii="Calibri" w:cs="Calibri" w:eastAsia="Calibri" w:hAnsi="Calibri"/>
+          <w:color w:val="1F2328"/>
+        </w:rPr>
+        <w:t xml:space="preserve"> each player's own RP works as it always has. 100 moves you up a division and the rest carries.</w:t>
+      </w:r>
+    </w:p>
+    <w:p>
+      <w:pPr>
+        <w:pBdr>
+          <w:bottom w:val="single" w:color="D0D7DE" w:sz="4" w:space="1"/>
+        </w:pBdr>
+        <w:spacing w:after="160" w:before="80"/>
+      </w:pPr>
+    </w:p>
+    <w:p>
+      <w:pPr>
+        <w:pStyle w:val="Heading1"/>
+        <w:spacing w:after="120" w:before="280"/>
+      </w:pPr>
+      <w:r>
+        <w:rPr>
+          <w:rFonts w:ascii="Calibri" w:cs="Calibri" w:eastAsia="Calibri" w:hAnsi="Calibri"/>
+          <w:b/>
+          <w:bCs/>
+          <w:color w:val="C8102E"/>
+          <w:sz w:val="32"/>
+          <w:szCs w:val="32"/>
+        </w:rPr>
+        <w:t xml:space="preserve">Quick patch 10 (Oct 25): losing a series with banked RP</w:t>
+      </w:r>
+    </w:p>
+    <w:p>
+      <w:pPr>
+        <w:pStyle w:val="ListParagraph"/>
+        <w:numPr>
+          <w:ilvl w:val="0"/>
+          <w:numId w:val="2"/>
+        </w:numPr>
+        <w:spacing w:after="80" w:line="276"/>
+      </w:pPr>
+      <w:r>
+        <w:rPr>
+          <w:rFonts w:ascii="Calibri" w:cs="Calibri" w:eastAsia="Calibri" w:hAnsi="Calibri"/>
+          <w:b/>
+          <w:bCs/>
+          <w:color w:val="1F2328"/>
+        </w:rPr>
+        <w:t xml:space="preserve">Drop to the max, not to zero:</w:t>
+      </w:r>
+      <w:r>
+        <w:rPr>
+          <w:rFonts w:ascii="Calibri" w:cs="Calibri" w:eastAsia="Calibri" w:hAnsi="Calibri"/>
+          <w:color w:val="1F2328"/>
+        </w:rPr>
+        <w:t xml:space="preserve"> a team with RP banked past 100 that loses a series now drops to </w:t>
+      </w:r>
+      <w:r>
+        <w:rPr>
+          <w:rFonts w:ascii="Calibri" w:cs="Calibri" w:eastAsia="Calibri" w:hAnsi="Calibri"/>
+          <w:b/>
+          <w:bCs/>
+          <w:color w:val="1F2328"/>
+        </w:rPr>
+        <w:t xml:space="preserve">100</w:t>
+      </w:r>
+      <w:r>
+        <w:rPr>
+          <w:rFonts w:ascii="Calibri" w:cs="Calibri" w:eastAsia="Calibri" w:hAnsi="Calibri"/>
+          <w:color w:val="1F2328"/>
+        </w:rPr>
+        <w:t xml:space="preserve">, the most a division holds, instead of 0.</w:t>
+      </w:r>
+    </w:p>
+    <w:p>
+      <w:pPr>
+        <w:pStyle w:val="ListParagraph"/>
+        <w:numPr>
+          <w:ilvl w:val="0"/>
+          <w:numId w:val="2"/>
+        </w:numPr>
+        <w:spacing w:after="80" w:line="276"/>
+      </w:pPr>
+      <w:r>
+        <w:rPr>
+          <w:rFonts w:ascii="Calibri" w:cs="Calibri" w:eastAsia="Calibri" w:hAnsi="Calibri"/>
+          <w:b/>
+          <w:bCs/>
+          <w:color w:val="1F2328"/>
+        </w:rPr>
+        <w:t xml:space="preserve">Losing again:</w:t>
+      </w:r>
+      <w:r>
+        <w:rPr>
+          <w:rFonts w:ascii="Calibri" w:cs="Calibri" w:eastAsia="Calibri" w:hAnsi="Calibri"/>
+          <w:color w:val="1F2328"/>
+        </w:rPr>
+        <w:t xml:space="preserve"> if it loses another series from there, it goes back to 0 as usual.</w:t>
+      </w:r>
+    </w:p>
+    <w:p>
+      <w:pPr>
+        <w:pStyle w:val="ListParagraph"/>
+        <w:numPr>
+          <w:ilvl w:val="0"/>
+          <w:numId w:val="2"/>
+        </w:numPr>
+        <w:spacing w:after="80" w:line="276"/>
+      </w:pPr>
+      <w:r>
+        <w:rPr>
+          <w:rFonts w:ascii="Calibri" w:cs="Calibri" w:eastAsia="Calibri" w:hAnsi="Calibri"/>
+          <w:b/>
+          <w:bCs/>
+          <w:color w:val="1F2328"/>
+        </w:rPr>
+        <w:t xml:space="preserve">At 0:</w:t>
+      </w:r>
+      <w:r>
+        <w:rPr>
+          <w:rFonts w:ascii="Calibri" w:cs="Calibri" w:eastAsia="Calibri" w:hAnsi="Calibri"/>
+          <w:color w:val="1F2328"/>
+        </w:rPr>
+        <w:t xml:space="preserve"> a team already at 0 RP that loses a series still drops a division, and any other team still goes to 0.</w:t>
+      </w:r>
+    </w:p>
+    <w:p>
+      <w:pPr>
+        <w:pBdr>
+          <w:bottom w:val="single" w:color="D0D7DE" w:sz="4" w:space="1"/>
+        </w:pBdr>
+        <w:spacing w:after="160" w:before="80"/>
+      </w:pPr>
+    </w:p>
+    <w:p>
+      <w:pPr>
+        <w:pStyle w:val="Heading1"/>
+        <w:spacing w:after="120" w:before="280"/>
+      </w:pPr>
+      <w:r>
+        <w:rPr>
+          <w:rFonts w:ascii="Calibri" w:cs="Calibri" w:eastAsia="Calibri" w:hAnsi="Calibri"/>
+          <w:b/>
+          <w:bCs/>
+          <w:color w:val="C8102E"/>
+          <w:sz w:val="32"/>
+          <w:szCs w:val="32"/>
+        </w:rPr>
+        <w:t xml:space="preserve">Quick patch 11 (Oct 25): AI teams climb by the same rules as you</w:t>
+      </w:r>
+    </w:p>
+    <w:p>
+      <w:pPr>
+        <w:pStyle w:val="ListParagraph"/>
+        <w:numPr>
+          <w:ilvl w:val="0"/>
+          <w:numId w:val="2"/>
+        </w:numPr>
+        <w:spacing w:after="80" w:line="276"/>
+      </w:pPr>
+      <w:r>
+        <w:rPr>
+          <w:rFonts w:ascii="Calibri" w:cs="Calibri" w:eastAsia="Calibri" w:hAnsi="Calibri"/>
+          <w:b/>
+          <w:bCs/>
+          <w:color w:val="1F2328"/>
+        </w:rPr>
+        <w:t xml:space="preserve">Series only:</w:t>
+      </w:r>
+      <w:r>
+        <w:rPr>
+          <w:rFonts w:ascii="Calibri" w:cs="Calibri" w:eastAsia="Calibri" w:hAnsi="Calibri"/>
+          <w:color w:val="1F2328"/>
+        </w:rPr>
+        <w:t xml:space="preserve"> AI Pro-Am teams had an easier way up. Reaching 100 RP promoted them on the spot, and one lost game at 0 RP could drop them. Now they move up and down only by winning or losing series, exactly like player teams.</w:t>
+      </w:r>
+    </w:p>
+    <w:p>
+      <w:pPr>
+        <w:pStyle w:val="ListParagraph"/>
+        <w:numPr>
+          <w:ilvl w:val="0"/>
+          <w:numId w:val="2"/>
+        </w:numPr>
+        <w:spacing w:after="80" w:line="276"/>
+      </w:pPr>
+      <w:r>
+        <w:rPr>
+          <w:rFonts w:ascii="Calibri" w:cs="Calibri" w:eastAsia="Calibri" w:hAnsi="Calibri"/>
+          <w:b/>
+          <w:bCs/>
+          <w:color w:val="1F2328"/>
+        </w:rPr>
+        <w:t xml:space="preserve">Single games:</w:t>
+      </w:r>
+      <w:r>
+        <w:rPr>
+          <w:rFonts w:ascii="Calibri" w:cs="Calibri" w:eastAsia="Calibri" w:hAnsi="Calibri"/>
+          <w:color w:val="1F2328"/>
+        </w:rPr>
+        <w:t xml:space="preserve"> a single game only changes an AI team's RP and record.</w:t>
+      </w:r>
+    </w:p>
+    <w:p>
+      <w:pPr>
+        <w:pStyle w:val="ListParagraph"/>
+        <w:numPr>
+          <w:ilvl w:val="0"/>
+          <w:numId w:val="2"/>
+        </w:numPr>
+        <w:spacing w:after="80" w:line="276"/>
+      </w:pPr>
+      <w:r>
+        <w:rPr>
+          <w:rFonts w:ascii="Calibri" w:cs="Calibri" w:eastAsia="Calibri" w:hAnsi="Calibri"/>
+          <w:b/>
+          <w:bCs/>
+          <w:color w:val="1F2328"/>
+        </w:rPr>
+        <w:t xml:space="preserve">The same RP rules:</w:t>
+      </w:r>
+      <w:r>
+        <w:rPr>
+          <w:rFonts w:ascii="Calibri" w:cs="Calibri" w:eastAsia="Calibri" w:hAnsi="Calibri"/>
+          <w:color w:val="1F2328"/>
+        </w:rPr>
+        <w:t xml:space="preserve"> RP past 100 is kept and carries into the next division on promotion. A lost series with RP over 100 drops the team to 100, a loss at 0 drops it a division, and any other loss resets it to 0.</w:t>
+      </w:r>
+    </w:p>
+    <w:p>
+      <w:pPr>
+        <w:pStyle w:val="ListParagraph"/>
+        <w:numPr>
+          <w:ilvl w:val="0"/>
+          <w:numId w:val="2"/>
+        </w:numPr>
+        <w:spacing w:after="80" w:line="276"/>
+      </w:pPr>
+      <w:r>
+        <w:rPr>
+          <w:rFonts w:ascii="Calibri" w:cs="Calibri" w:eastAsia="Calibri" w:hAnsi="Calibri"/>
+          <w:b/>
+          <w:bCs/>
+          <w:color w:val="1F2328"/>
+        </w:rPr>
+        <w:t xml:space="preserve">AI series:</w:t>
+      </w:r>
+      <w:r>
+        <w:rPr>
+          <w:rFonts w:ascii="Calibri" w:cs="Calibri" w:eastAsia="Calibri" w:hAnsi="Calibri"/>
+          <w:color w:val="1F2328"/>
+        </w:rPr>
+        <w:t xml:space="preserve"> AI teams still play series against each other every few hours, so the standings keep moving.</w:t>
+      </w:r>
+    </w:p>
     <w:sectPr>
       <w:pgSz w:w="12240" w:h="15840" w:orient="portrait"/>
       <w:pgMar w:top="1440" w:right="1440" w:bottom="1440" w:left="1440" w:header="708" w:footer="708" w:gutter="0"/>

</xml_diff>

<commit_message>
Add Pro-Am club features and quiet soundtrack
Add AI club members, player invites, spare-time series games, and expanded HUB lineups. Play the main soundtrack in Pro-Am at 10% volume.
</commit_message>
<xml_diff>
--- a/PATCH_NOTES_v0.4.8.9.docx
+++ b/PATCH_NOTES_v0.4.8.9.docx
@@ -5643,6 +5643,550 @@
         <w:t xml:space="preserve"> AI teams still play series against each other every few hours, so the standings keep moving.</w:t>
       </w:r>
     </w:p>
+    <w:p>
+      <w:pPr>
+        <w:pBdr>
+          <w:bottom w:val="single" w:color="D0D7DE" w:sz="4" w:space="1"/>
+        </w:pBdr>
+        <w:spacing w:after="160" w:before="80"/>
+      </w:pPr>
+    </w:p>
+    <w:p>
+      <w:pPr>
+        <w:pStyle w:val="Heading1"/>
+        <w:spacing w:after="120" w:before="280"/>
+      </w:pPr>
+      <w:r>
+        <w:rPr>
+          <w:rFonts w:ascii="Calibri" w:cs="Calibri" w:eastAsia="Calibri" w:hAnsi="Calibri"/>
+          <w:b/>
+          <w:bCs/>
+          <w:color w:val="C8102E"/>
+          <w:sz w:val="32"/>
+          <w:szCs w:val="32"/>
+        </w:rPr>
+        <w:t xml:space="preserve">Quick patch 12 (Oct 25): AI friends and online players in your Pro-Am club</w:t>
+      </w:r>
+    </w:p>
+    <w:p>
+      <w:pPr>
+        <w:pStyle w:val="Heading2"/>
+        <w:spacing w:after="80" w:before="200"/>
+      </w:pPr>
+      <w:r>
+        <w:rPr>
+          <w:rFonts w:ascii="Calibri" w:cs="Calibri" w:eastAsia="Calibri" w:hAnsi="Calibri"/>
+          <w:b/>
+          <w:bCs/>
+          <w:color w:val="1F2328"/>
+          <w:sz w:val="26"/>
+          <w:szCs w:val="26"/>
+        </w:rPr>
+        <w:t xml:space="preserve">Your club can have AI members</w:t>
+      </w:r>
+    </w:p>
+    <w:p>
+      <w:pPr>
+        <w:pStyle w:val="ListParagraph"/>
+        <w:numPr>
+          <w:ilvl w:val="0"/>
+          <w:numId w:val="2"/>
+        </w:numPr>
+        <w:spacing w:after="80" w:line="276"/>
+      </w:pPr>
+      <w:r>
+        <w:rPr>
+          <w:rFonts w:ascii="Calibri" w:cs="Calibri" w:eastAsia="Calibri" w:hAnsi="Calibri"/>
+          <w:b/>
+          <w:bCs/>
+          <w:color w:val="1F2328"/>
+        </w:rPr>
+        <w:t xml:space="preserve">Inviting AI friends:</w:t>
+      </w:r>
+      <w:r>
+        <w:rPr>
+          <w:rFonts w:ascii="Calibri" w:cs="Calibri" w:eastAsia="Calibri" w:hAnsi="Calibri"/>
+          <w:color w:val="1F2328"/>
+        </w:rPr>
+        <w:t xml:space="preserve"> invite AI friends from your friends list to your Pro-Am team and they join right away, like a crew. A club holds </w:t>
+      </w:r>
+      <w:r>
+        <w:rPr>
+          <w:rFonts w:ascii="Calibri" w:cs="Calibri" w:eastAsia="Calibri" w:hAnsi="Calibri"/>
+          <w:b/>
+          <w:bCs/>
+          <w:color w:val="1F2328"/>
+        </w:rPr>
+        <w:t xml:space="preserve">10 members in all</w:t>
+      </w:r>
+      <w:r>
+        <w:rPr>
+          <w:rFonts w:ascii="Calibri" w:cs="Calibri" w:eastAsia="Calibri" w:hAnsi="Calibri"/>
+          <w:color w:val="1F2328"/>
+        </w:rPr>
+        <w:t xml:space="preserve">, real players and AI together. </w:t>
+      </w:r>
+      <w:r>
+        <w:rPr>
+          <w:rFonts w:ascii="Calibri" w:cs="Calibri" w:eastAsia="Calibri" w:hAnsi="Calibri"/>
+          <w:b/>
+          <w:bCs/>
+          <w:color w:val="1F2328"/>
+        </w:rPr>
+        <w:t xml:space="preserve">Any member can invite</w:t>
+      </w:r>
+      <w:r>
+        <w:rPr>
+          <w:rFonts w:ascii="Calibri" w:cs="Calibri" w:eastAsia="Calibri" w:hAnsi="Calibri"/>
+          <w:color w:val="1F2328"/>
+        </w:rPr>
+        <w:t xml:space="preserve">, and the founder can remove anyone.</w:t>
+      </w:r>
+    </w:p>
+    <w:p>
+      <w:pPr>
+        <w:pStyle w:val="ListParagraph"/>
+        <w:numPr>
+          <w:ilvl w:val="0"/>
+          <w:numId w:val="2"/>
+        </w:numPr>
+        <w:spacing w:after="80" w:line="276"/>
+      </w:pPr>
+      <w:r>
+        <w:rPr>
+          <w:rFonts w:ascii="Calibri" w:cs="Calibri" w:eastAsia="Calibri" w:hAnsi="Calibri"/>
+          <w:b/>
+          <w:bCs/>
+          <w:color w:val="1F2328"/>
+        </w:rPr>
+        <w:t xml:space="preserve">They play in their spare time:</w:t>
+      </w:r>
+      <w:r>
+        <w:rPr>
+          <w:rFonts w:ascii="Calibri" w:cs="Calibri" w:eastAsia="Calibri" w:hAnsi="Calibri"/>
+          <w:color w:val="1F2328"/>
+        </w:rPr>
+        <w:t xml:space="preserve"> AI members play your club's own series games while you're away, by their usual schedules. Wins add team RP and losses take it away (15 a game), their games count on the series, and a series they finish moves the team up or down by the same rules as any other.</w:t>
+      </w:r>
+    </w:p>
+    <w:p>
+      <w:pPr>
+        <w:pStyle w:val="ListParagraph"/>
+        <w:numPr>
+          <w:ilvl w:val="1"/>
+          <w:numId w:val="2"/>
+        </w:numPr>
+        <w:spacing w:after="80" w:line="276"/>
+      </w:pPr>
+      <w:r>
+        <w:rPr>
+          <w:rFonts w:ascii="Calibri" w:cs="Calibri" w:eastAsia="Calibri" w:hAnsi="Calibri"/>
+          <w:b/>
+          <w:bCs/>
+          <w:color w:val="1F2328"/>
+        </w:rPr>
+        <w:t xml:space="preserve">Pace:</w:t>
+      </w:r>
+      <w:r>
+        <w:rPr>
+          <w:rFonts w:ascii="Calibri" w:cs="Calibri" w:eastAsia="Calibri" w:hAnsi="Calibri"/>
+          <w:color w:val="1F2328"/>
+        </w:rPr>
+        <w:t xml:space="preserve"> they only play when at least 3 of them are on, and never faster than one series every 6 hours.</w:t>
+      </w:r>
+    </w:p>
+    <w:p>
+      <w:pPr>
+        <w:pStyle w:val="ListParagraph"/>
+        <w:numPr>
+          <w:ilvl w:val="1"/>
+          <w:numId w:val="2"/>
+        </w:numPr>
+        <w:spacing w:after="80" w:line="276"/>
+      </w:pPr>
+      <w:r>
+        <w:rPr>
+          <w:rFonts w:ascii="Calibri" w:cs="Calibri" w:eastAsia="Calibri" w:hAnsi="Calibri"/>
+          <w:b/>
+          <w:bCs/>
+          <w:color w:val="1F2328"/>
+        </w:rPr>
+        <w:t xml:space="preserve">Fair rewards:</w:t>
+      </w:r>
+      <w:r>
+        <w:rPr>
+          <w:rFonts w:ascii="Calibri" w:cs="Calibri" w:eastAsia="Calibri" w:hAnsi="Calibri"/>
+          <w:color w:val="1F2328"/>
+        </w:rPr>
+        <w:t xml:space="preserve"> they never touch your own RP or VC.</w:t>
+      </w:r>
+    </w:p>
+    <w:p>
+      <w:pPr>
+        <w:pStyle w:val="ListParagraph"/>
+        <w:numPr>
+          <w:ilvl w:val="1"/>
+          <w:numId w:val="2"/>
+        </w:numPr>
+        <w:spacing w:after="80" w:line="276"/>
+      </w:pPr>
+      <w:r>
+        <w:rPr>
+          <w:rFonts w:ascii="Calibri" w:cs="Calibri" w:eastAsia="Calibri" w:hAnsi="Calibri"/>
+          <w:b/>
+          <w:bCs/>
+          <w:color w:val="1F2328"/>
+        </w:rPr>
+        <w:t xml:space="preserve">Seeing it:</w:t>
+      </w:r>
+      <w:r>
+        <w:rPr>
+          <w:rFonts w:ascii="Calibri" w:cs="Calibri" w:eastAsia="Calibri" w:hAnsi="Calibri"/>
+          <w:color w:val="1F2328"/>
+        </w:rPr>
+        <w:t xml:space="preserve"> the whiteboard shows which games they played, and you get a "while you were away" summary.</w:t>
+      </w:r>
+    </w:p>
+    <w:p>
+      <w:pPr>
+        <w:pStyle w:val="Heading2"/>
+        <w:spacing w:after="80" w:before="200"/>
+      </w:pPr>
+      <w:r>
+        <w:rPr>
+          <w:rFonts w:ascii="Calibri" w:cs="Calibri" w:eastAsia="Calibri" w:hAnsi="Calibri"/>
+          <w:b/>
+          <w:bCs/>
+          <w:color w:val="1F2328"/>
+          <w:sz w:val="26"/>
+          <w:szCs w:val="26"/>
+        </w:rPr>
+        <w:t xml:space="preserve">Squad mates and AI members come to the HUB</w:t>
+      </w:r>
+    </w:p>
+    <w:p>
+      <w:pPr>
+        <w:pStyle w:val="ListParagraph"/>
+        <w:numPr>
+          <w:ilvl w:val="0"/>
+          <w:numId w:val="2"/>
+        </w:numPr>
+        <w:spacing w:after="80" w:line="276"/>
+      </w:pPr>
+      <w:r>
+        <w:rPr>
+          <w:rFonts w:ascii="Calibri" w:cs="Calibri" w:eastAsia="Calibri" w:hAnsi="Calibri"/>
+          <w:b/>
+          <w:bCs/>
+          <w:color w:val="1F2328"/>
+        </w:rPr>
+        <w:t xml:space="preserve">Squad mates:</w:t>
+      </w:r>
+      <w:r>
+        <w:rPr>
+          <w:rFonts w:ascii="Calibri" w:cs="Calibri" w:eastAsia="Calibri" w:hAnsi="Calibri"/>
+          <w:color w:val="1F2328"/>
+        </w:rPr>
+        <w:t xml:space="preserve"> AI friends in your squad walk into the Pro-Am HUB with you, offline and online.</w:t>
+      </w:r>
+    </w:p>
+    <w:p>
+      <w:pPr>
+        <w:pStyle w:val="ListParagraph"/>
+        <w:numPr>
+          <w:ilvl w:val="0"/>
+          <w:numId w:val="2"/>
+        </w:numPr>
+        <w:spacing w:after="80" w:line="276"/>
+      </w:pPr>
+      <w:r>
+        <w:rPr>
+          <w:rFonts w:ascii="Calibri" w:cs="Calibri" w:eastAsia="Calibri" w:hAnsi="Calibri"/>
+          <w:b/>
+          <w:bCs/>
+          <w:color w:val="1F2328"/>
+        </w:rPr>
+        <w:t xml:space="preserve">AI members:</w:t>
+      </w:r>
+      <w:r>
+        <w:rPr>
+          <w:rFonts w:ascii="Calibri" w:cs="Calibri" w:eastAsia="Calibri" w:hAnsi="Calibri"/>
+          <w:color w:val="1F2328"/>
+        </w:rPr>
+        <w:t xml:space="preserve"> club members who are on by their schedule are there too, hanging around the court and shooting around, and they gather in the office when a game is queued. Online, everyone in the HUB sees the same people.</w:t>
+      </w:r>
+    </w:p>
+    <w:p>
+      <w:pPr>
+        <w:pStyle w:val="Heading2"/>
+        <w:spacing w:after="80" w:before="200"/>
+      </w:pPr>
+      <w:r>
+        <w:rPr>
+          <w:rFonts w:ascii="Calibri" w:cs="Calibri" w:eastAsia="Calibri" w:hAnsi="Calibri"/>
+          <w:b/>
+          <w:bCs/>
+          <w:color w:val="1F2328"/>
+          <w:sz w:val="26"/>
+          <w:szCs w:val="26"/>
+        </w:rPr>
+        <w:t xml:space="preserve">Lineups: real players first, the draft last</w:t>
+      </w:r>
+    </w:p>
+    <w:p>
+      <w:pPr>
+        <w:spacing w:after="140" w:line="288"/>
+      </w:pPr>
+      <w:r>
+        <w:rPr>
+          <w:rFonts w:ascii="Calibri" w:cs="Calibri" w:eastAsia="Calibri" w:hAnsi="Calibri"/>
+          <w:color w:val="1F2328"/>
+        </w:rPr>
+        <w:t xml:space="preserve">When the Captain queues, the five fill in this order: 1. Real players in the HUB. 2. AI club members who are on. 3. AI squad mates. 4. The draft, for any spots still empty.</w:t>
+      </w:r>
+    </w:p>
+    <w:p>
+      <w:pPr>
+        <w:spacing w:after="140" w:line="288"/>
+      </w:pPr>
+      <w:r>
+        <w:rPr>
+          <w:rFonts w:ascii="Calibri" w:cs="Calibri" w:eastAsia="Calibri" w:hAnsi="Calibri"/>
+          <w:color w:val="1F2328"/>
+        </w:rPr>
+        <w:t xml:space="preserve">A full five without the draft is possible, and the AI teammates play with their own builds.</w:t>
+      </w:r>
+    </w:p>
+    <w:p>
+      <w:pPr>
+        <w:pStyle w:val="Heading2"/>
+        <w:spacing w:after="80" w:before="200"/>
+      </w:pPr>
+      <w:r>
+        <w:rPr>
+          <w:rFonts w:ascii="Calibri" w:cs="Calibri" w:eastAsia="Calibri" w:hAnsi="Calibri"/>
+          <w:b/>
+          <w:bCs/>
+          <w:color w:val="1F2328"/>
+          <w:sz w:val="26"/>
+          <w:szCs w:val="26"/>
+        </w:rPr>
+        <w:t xml:space="preserve">Invite online players</w:t>
+      </w:r>
+    </w:p>
+    <w:p>
+      <w:pPr>
+        <w:pStyle w:val="ListParagraph"/>
+        <w:numPr>
+          <w:ilvl w:val="0"/>
+          <w:numId w:val="2"/>
+        </w:numPr>
+        <w:spacing w:after="80" w:line="276"/>
+      </w:pPr>
+      <w:r>
+        <w:rPr>
+          <w:rFonts w:ascii="Calibri" w:cs="Calibri" w:eastAsia="Calibri" w:hAnsi="Calibri"/>
+          <w:b/>
+          <w:bCs/>
+          <w:color w:val="1F2328"/>
+        </w:rPr>
+        <w:t xml:space="preserve">From the team page:</w:t>
+      </w:r>
+      <w:r>
+        <w:rPr>
+          <w:rFonts w:ascii="Calibri" w:cs="Calibri" w:eastAsia="Calibri" w:hAnsi="Calibri"/>
+          <w:color w:val="1F2328"/>
+        </w:rPr>
+        <w:t xml:space="preserve"> the </w:t>
+      </w:r>
+      <w:r>
+        <w:rPr>
+          <w:rFonts w:ascii="Calibri" w:cs="Calibri" w:eastAsia="Calibri" w:hAnsi="Calibri"/>
+          <w:b/>
+          <w:bCs/>
+          <w:color w:val="1F2328"/>
+        </w:rPr>
+        <w:t xml:space="preserve">Invite</w:t>
+      </w:r>
+      <w:r>
+        <w:rPr>
+          <w:rFonts w:ascii="Calibri" w:cs="Calibri" w:eastAsia="Calibri" w:hAnsi="Calibri"/>
+          <w:color w:val="1F2328"/>
+        </w:rPr>
+        <w:t xml:space="preserve"> button opens one dialog with tabs for AI friends, players (friends who are on, people here, or a username) and the invites you've sent.</w:t>
+      </w:r>
+    </w:p>
+    <w:p>
+      <w:pPr>
+        <w:pStyle w:val="ListParagraph"/>
+        <w:numPr>
+          <w:ilvl w:val="0"/>
+          <w:numId w:val="2"/>
+        </w:numPr>
+        <w:spacing w:after="80" w:line="276"/>
+      </w:pPr>
+      <w:r>
+        <w:rPr>
+          <w:rFonts w:ascii="Calibri" w:cs="Calibri" w:eastAsia="Calibri" w:hAnsi="Calibri"/>
+          <w:b/>
+          <w:bCs/>
+          <w:color w:val="1F2328"/>
+        </w:rPr>
+        <w:t xml:space="preserve">Getting an invite:</w:t>
+      </w:r>
+      <w:r>
+        <w:rPr>
+          <w:rFonts w:ascii="Calibri" w:cs="Calibri" w:eastAsia="Calibri" w:hAnsi="Calibri"/>
+          <w:color w:val="1F2328"/>
+        </w:rPr>
+        <w:t xml:space="preserve"> you get a popup if you're online, and the invite waits on your Pro-Am tab to join or decline. An invite gets you onto an invite-only team too.</w:t>
+      </w:r>
+    </w:p>
+    <w:p>
+      <w:pPr>
+        <w:pStyle w:val="ListParagraph"/>
+        <w:numPr>
+          <w:ilvl w:val="0"/>
+          <w:numId w:val="2"/>
+        </w:numPr>
+        <w:spacing w:after="80" w:line="276"/>
+      </w:pPr>
+      <w:r>
+        <w:rPr>
+          <w:rFonts w:ascii="Calibri" w:cs="Calibri" w:eastAsia="Calibri" w:hAnsi="Calibri"/>
+          <w:b/>
+          <w:bCs/>
+          <w:color w:val="1F2328"/>
+        </w:rPr>
+        <w:t xml:space="preserve">From every HUB office:</w:t>
+      </w:r>
+      <w:r>
+        <w:rPr>
+          <w:rFonts w:ascii="Calibri" w:cs="Calibri" w:eastAsia="Calibri" w:hAnsi="Calibri"/>
+          <w:color w:val="1F2328"/>
+        </w:rPr>
+        <w:t xml:space="preserve"> the middle school's tryouts sign-up sheet, the high school's varsity roster board, and the clubhouse's desk phone and roster screen all open the same invite dialog.</w:t>
+      </w:r>
+    </w:p>
+    <w:p>
+      <w:pPr>
+        <w:pBdr>
+          <w:bottom w:val="single" w:color="D0D7DE" w:sz="4" w:space="1"/>
+        </w:pBdr>
+        <w:spacing w:after="160" w:before="80"/>
+      </w:pPr>
+    </w:p>
+    <w:p>
+      <w:pPr>
+        <w:pStyle w:val="Heading1"/>
+        <w:spacing w:after="120" w:before="280"/>
+      </w:pPr>
+      <w:r>
+        <w:rPr>
+          <w:rFonts w:ascii="Calibri" w:cs="Calibri" w:eastAsia="Calibri" w:hAnsi="Calibri"/>
+          <w:b/>
+          <w:bCs/>
+          <w:color w:val="C8102E"/>
+          <w:sz w:val="32"/>
+          <w:szCs w:val="32"/>
+        </w:rPr>
+        <w:t xml:space="preserve">Quick patch 13 (Oct 25): music in Pro-Am</w:t>
+      </w:r>
+    </w:p>
+    <w:p>
+      <w:pPr>
+        <w:pStyle w:val="ListParagraph"/>
+        <w:numPr>
+          <w:ilvl w:val="0"/>
+          <w:numId w:val="2"/>
+        </w:numPr>
+        <w:spacing w:after="80" w:line="276"/>
+      </w:pPr>
+      <w:r>
+        <w:rPr>
+          <w:rFonts w:ascii="Calibri" w:cs="Calibri" w:eastAsia="Calibri" w:hAnsi="Calibri"/>
+          <w:b/>
+          <w:bCs/>
+          <w:color w:val="1F2328"/>
+        </w:rPr>
+        <w:t xml:space="preserve">The soundtrack in Pro-Am:</w:t>
+      </w:r>
+      <w:r>
+        <w:rPr>
+          <w:rFonts w:ascii="Calibri" w:cs="Calibri" w:eastAsia="Calibri" w:hAnsi="Calibri"/>
+          <w:color w:val="1F2328"/>
+        </w:rPr>
+        <w:t xml:space="preserve"> the park's music now plays in the Pro-Am HUB (the building and its home court outside) and in every Pro-Am game, offline, online and series games alike.</w:t>
+      </w:r>
+    </w:p>
+    <w:p>
+      <w:pPr>
+        <w:pStyle w:val="ListParagraph"/>
+        <w:numPr>
+          <w:ilvl w:val="0"/>
+          <w:numId w:val="2"/>
+        </w:numPr>
+        <w:spacing w:after="80" w:line="276"/>
+      </w:pPr>
+      <w:r>
+        <w:rPr>
+          <w:rFonts w:ascii="Calibri" w:cs="Calibri" w:eastAsia="Calibri" w:hAnsi="Calibri"/>
+          <w:b/>
+          <w:bCs/>
+          <w:color w:val="1F2328"/>
+        </w:rPr>
+        <w:t xml:space="preserve">Quiet on purpose:</w:t>
+      </w:r>
+      <w:r>
+        <w:rPr>
+          <w:rFonts w:ascii="Calibri" w:cs="Calibri" w:eastAsia="Calibri" w:hAnsi="Calibri"/>
+          <w:color w:val="1F2328"/>
+        </w:rPr>
+        <w:t xml:space="preserve"> it plays at about </w:t>
+      </w:r>
+      <w:r>
+        <w:rPr>
+          <w:rFonts w:ascii="Calibri" w:cs="Calibri" w:eastAsia="Calibri" w:hAnsi="Calibri"/>
+          <w:b/>
+          <w:bCs/>
+          <w:color w:val="1F2328"/>
+        </w:rPr>
+        <w:t xml:space="preserve">10%</w:t>
+      </w:r>
+      <w:r>
+        <w:rPr>
+          <w:rFonts w:ascii="Calibri" w:cs="Calibri" w:eastAsia="Calibri" w:hAnsi="Calibri"/>
+          <w:color w:val="1F2328"/>
+        </w:rPr>
+        <w:t xml:space="preserve"> of the level you hear in the park, so the arena's crowd and the game stay up front. Your music volume slider still sets that level, and turning music off still turns it off.</w:t>
+      </w:r>
+    </w:p>
+    <w:p>
+      <w:pPr>
+        <w:pStyle w:val="ListParagraph"/>
+        <w:numPr>
+          <w:ilvl w:val="0"/>
+          <w:numId w:val="2"/>
+        </w:numPr>
+        <w:spacing w:after="80" w:line="276"/>
+      </w:pPr>
+      <w:r>
+        <w:rPr>
+          <w:rFonts w:ascii="Calibri" w:cs="Calibri" w:eastAsia="Calibri" w:hAnsi="Calibri"/>
+          <w:b/>
+          <w:bCs/>
+          <w:color w:val="1F2328"/>
+        </w:rPr>
+        <w:t xml:space="preserve">Everywhere else is unchanged:</w:t>
+      </w:r>
+      <w:r>
+        <w:rPr>
+          <w:rFonts w:ascii="Calibri" w:cs="Calibri" w:eastAsia="Calibri" w:hAnsi="Calibri"/>
+          <w:color w:val="1F2328"/>
+        </w:rPr>
+        <w:t xml:space="preserve"> back in the park, the menus or the Crew HQ, the music returns to its normal level. Event parks keep their own soundtracks, and the Pro Run still has no music.</w:t>
+      </w:r>
+    </w:p>
     <w:sectPr>
       <w:pgSz w:w="12240" w:h="15840" w:orient="portrait"/>
       <w:pgMar w:top="1440" w:right="1440" w:bottom="1440" w:left="1440" w:header="708" w:footer="708" w:gutter="0"/>

</xml_diff>

<commit_message>
Add Pro-Am kits and logo artwork
Make each team's jersey selection visible in Pro-Am games and HUB runs, add custom drawings for every Pro-Am logo, and show logos and kit previews in the menus. Bind the create form's logo and jersey picks, and increase the Honey floor's gloss.
</commit_message>
<xml_diff>
--- a/PATCH_NOTES_v0.4.8.9.docx
+++ b/PATCH_NOTES_v0.4.8.9.docx
@@ -6187,6 +6187,432 @@
         <w:t xml:space="preserve"> back in the park, the menus or the Crew HQ, the music returns to its normal level. Event parks keep their own soundtracks, and the Pro Run still has no music.</w:t>
       </w:r>
     </w:p>
+    <w:p>
+      <w:pPr>
+        <w:pBdr>
+          <w:bottom w:val="single" w:color="D0D7DE" w:sz="4" w:space="1"/>
+        </w:pBdr>
+        <w:spacing w:after="160" w:before="80"/>
+      </w:pPr>
+    </w:p>
+    <w:p>
+      <w:pPr>
+        <w:pStyle w:val="Heading1"/>
+        <w:spacing w:after="120" w:before="280"/>
+      </w:pPr>
+      <w:r>
+        <w:rPr>
+          <w:rFonts w:ascii="Calibri" w:cs="Calibri" w:eastAsia="Calibri" w:hAnsi="Calibri"/>
+          <w:b/>
+          <w:bCs/>
+          <w:color w:val="C8102E"/>
+          <w:sz w:val="32"/>
+          <w:szCs w:val="32"/>
+        </w:rPr>
+        <w:t xml:space="preserve">Quick patch 14 (Oct 25): Pro-Am jerseys and logos look like their names</w:t>
+      </w:r>
+    </w:p>
+    <w:p>
+      <w:pPr>
+        <w:pStyle w:val="Heading2"/>
+        <w:spacing w:after="80" w:before="200"/>
+      </w:pPr>
+      <w:r>
+        <w:rPr>
+          <w:rFonts w:ascii="Calibri" w:cs="Calibri" w:eastAsia="Calibri" w:hAnsi="Calibri"/>
+          <w:b/>
+          <w:bCs/>
+          <w:color w:val="1F2328"/>
+          <w:sz w:val="26"/>
+          <w:szCs w:val="26"/>
+        </w:rPr>
+        <w:t xml:space="preserve">Your jersey pick is what your team wears</w:t>
+      </w:r>
+    </w:p>
+    <w:p>
+      <w:pPr>
+        <w:spacing w:after="140" w:line="288"/>
+      </w:pPr>
+      <w:r>
+        <w:rPr>
+          <w:rFonts w:ascii="Calibri" w:cs="Calibri" w:eastAsia="Calibri" w:hAnsi="Calibri"/>
+          <w:color w:val="1F2328"/>
+        </w:rPr>
+        <w:t xml:space="preserve">The Jerseys choice on your team page used to be saved and never shown: every Pro-Am team played in the same jersey. Now each one is its own kit, in every Pro-Am game (offline, online and series games) and in your HUB's home-court runs:</w:t>
+      </w:r>
+    </w:p>
+    <w:p>
+      <w:pPr>
+        <w:pStyle w:val="ListParagraph"/>
+        <w:numPr>
+          <w:ilvl w:val="0"/>
+          <w:numId w:val="2"/>
+        </w:numPr>
+        <w:spacing w:after="80" w:line="276"/>
+      </w:pPr>
+      <w:r>
+        <w:rPr>
+          <w:rFonts w:ascii="Calibri" w:cs="Calibri" w:eastAsia="Calibri" w:hAnsi="Calibri"/>
+          <w:b/>
+          <w:bCs/>
+          <w:color w:val="1F2328"/>
+        </w:rPr>
+        <w:t xml:space="preserve">Classic:</w:t>
+      </w:r>
+      <w:r>
+        <w:rPr>
+          <w:rFonts w:ascii="Calibri" w:cs="Calibri" w:eastAsia="Calibri" w:hAnsi="Calibri"/>
+          <w:color w:val="1F2328"/>
+        </w:rPr>
+        <w:t xml:space="preserve"> your color with side panels and trim in your second color, and a stripe down the sides of the shorts.</w:t>
+      </w:r>
+    </w:p>
+    <w:p>
+      <w:pPr>
+        <w:pStyle w:val="ListParagraph"/>
+        <w:numPr>
+          <w:ilvl w:val="0"/>
+          <w:numId w:val="2"/>
+        </w:numPr>
+        <w:spacing w:after="80" w:line="276"/>
+      </w:pPr>
+      <w:r>
+        <w:rPr>
+          <w:rFonts w:ascii="Calibri" w:cs="Calibri" w:eastAsia="Calibri" w:hAnsi="Calibri"/>
+          <w:b/>
+          <w:bCs/>
+          <w:color w:val="1F2328"/>
+        </w:rPr>
+        <w:t xml:space="preserve">Stripe:</w:t>
+      </w:r>
+      <w:r>
+        <w:rPr>
+          <w:rFonts w:ascii="Calibri" w:cs="Calibri" w:eastAsia="Calibri" w:hAnsi="Calibri"/>
+          <w:color w:val="1F2328"/>
+        </w:rPr>
+        <w:t xml:space="preserve"> a bold band of your second color round the waist between two thin pinlines, under the number, with matching bands round each leg of the shorts.</w:t>
+      </w:r>
+    </w:p>
+    <w:p>
+      <w:pPr>
+        <w:pStyle w:val="ListParagraph"/>
+        <w:numPr>
+          <w:ilvl w:val="0"/>
+          <w:numId w:val="2"/>
+        </w:numPr>
+        <w:spacing w:after="80" w:line="276"/>
+      </w:pPr>
+      <w:r>
+        <w:rPr>
+          <w:rFonts w:ascii="Calibri" w:cs="Calibri" w:eastAsia="Calibri" w:hAnsi="Calibri"/>
+          <w:b/>
+          <w:bCs/>
+          <w:color w:val="1F2328"/>
+        </w:rPr>
+        <w:t xml:space="preserve">Split:</w:t>
+      </w:r>
+      <w:r>
+        <w:rPr>
+          <w:rFonts w:ascii="Calibri" w:cs="Calibri" w:eastAsia="Calibri" w:hAnsi="Calibri"/>
+          <w:color w:val="1F2328"/>
+        </w:rPr>
+        <w:t xml:space="preserve"> one side of the jersey and shorts in each color, front and back. The numbers are in an outlined ink that reads on both halves.</w:t>
+      </w:r>
+    </w:p>
+    <w:p>
+      <w:pPr>
+        <w:pStyle w:val="ListParagraph"/>
+        <w:numPr>
+          <w:ilvl w:val="0"/>
+          <w:numId w:val="2"/>
+        </w:numPr>
+        <w:spacing w:after="80" w:line="276"/>
+      </w:pPr>
+      <w:r>
+        <w:rPr>
+          <w:rFonts w:ascii="Calibri" w:cs="Calibri" w:eastAsia="Calibri" w:hAnsi="Calibri"/>
+          <w:b/>
+          <w:bCs/>
+          <w:color w:val="1F2328"/>
+        </w:rPr>
+        <w:t xml:space="preserve">Fade:</w:t>
+      </w:r>
+      <w:r>
+        <w:rPr>
+          <w:rFonts w:ascii="Calibri" w:cs="Calibri" w:eastAsia="Calibri" w:hAnsi="Calibri"/>
+          <w:color w:val="1F2328"/>
+        </w:rPr>
+        <w:t xml:space="preserve"> your color at the shoulders melting into your second color at the hem, and the shorts' legs fade the same way.</w:t>
+      </w:r>
+    </w:p>
+    <w:p>
+      <w:pPr>
+        <w:pStyle w:val="Heading2"/>
+        <w:spacing w:after="80" w:before="200"/>
+      </w:pPr>
+      <w:r>
+        <w:rPr>
+          <w:rFonts w:ascii="Calibri" w:cs="Calibri" w:eastAsia="Calibri" w:hAnsi="Calibri"/>
+          <w:b/>
+          <w:bCs/>
+          <w:color w:val="1F2328"/>
+          <w:sz w:val="26"/>
+          <w:szCs w:val="26"/>
+        </w:rPr>
+        <w:t xml:space="preserve">Every logo is drawn as named</w:t>
+      </w:r>
+    </w:p>
+    <w:p>
+      <w:pPr>
+        <w:pStyle w:val="ListParagraph"/>
+        <w:numPr>
+          <w:ilvl w:val="0"/>
+          <w:numId w:val="2"/>
+        </w:numPr>
+        <w:spacing w:after="80" w:line="276"/>
+      </w:pPr>
+      <w:r>
+        <w:rPr>
+          <w:rFonts w:ascii="Calibri" w:cs="Calibri" w:eastAsia="Calibri" w:hAnsi="Calibri"/>
+          <w:b/>
+          <w:bCs/>
+          <w:color w:val="1F2328"/>
+        </w:rPr>
+        <w:t xml:space="preserve">The picture logos:</w:t>
+      </w:r>
+      <w:r>
+        <w:rPr>
+          <w:rFonts w:ascii="Calibri" w:cs="Calibri" w:eastAsia="Calibri" w:hAnsi="Calibri"/>
+          <w:color w:val="1F2328"/>
+        </w:rPr>
+        <w:t xml:space="preserve"> Flame, Wolf, Eagle, Skull and Wave used to show up as a plain circle in the HUB and a plain box on Pro-Am park courts. Each is now its own drawing: a fire, a wolf's head, an eagle's head, a skull, and a breaking wave.</w:t>
+      </w:r>
+    </w:p>
+    <w:p>
+      <w:pPr>
+        <w:pStyle w:val="ListParagraph"/>
+        <w:numPr>
+          <w:ilvl w:val="0"/>
+          <w:numId w:val="2"/>
+        </w:numPr>
+        <w:spacing w:after="80" w:line="276"/>
+      </w:pPr>
+      <w:r>
+        <w:rPr>
+          <w:rFonts w:ascii="Calibri" w:cs="Calibri" w:eastAsia="Calibri" w:hAnsi="Calibri"/>
+          <w:b/>
+          <w:bCs/>
+          <w:color w:val="1F2328"/>
+        </w:rPr>
+        <w:t xml:space="preserve">Bolt:</w:t>
+      </w:r>
+      <w:r>
+        <w:rPr>
+          <w:rFonts w:ascii="Calibri" w:cs="Calibri" w:eastAsia="Calibri" w:hAnsi="Calibri"/>
+          <w:color w:val="1F2328"/>
+        </w:rPr>
+        <w:t xml:space="preserve"> the lightning bolt now sits in a roundel with your letters on a ribbon underneath, so the letters no longer cover the bolt.</w:t>
+      </w:r>
+    </w:p>
+    <w:p>
+      <w:pPr>
+        <w:pStyle w:val="ListParagraph"/>
+        <w:numPr>
+          <w:ilvl w:val="0"/>
+          <w:numId w:val="2"/>
+        </w:numPr>
+        <w:spacing w:after="80" w:line="276"/>
+      </w:pPr>
+      <w:r>
+        <w:rPr>
+          <w:rFonts w:ascii="Calibri" w:cs="Calibri" w:eastAsia="Calibri" w:hAnsi="Calibri"/>
+          <w:b/>
+          <w:bCs/>
+          <w:color w:val="1F2328"/>
+        </w:rPr>
+        <w:t xml:space="preserve">Letters that fit:</w:t>
+      </w:r>
+      <w:r>
+        <w:rPr>
+          <w:rFonts w:ascii="Calibri" w:cs="Calibri" w:eastAsia="Calibri" w:hAnsi="Calibri"/>
+          <w:color w:val="1F2328"/>
+        </w:rPr>
+        <w:t xml:space="preserve"> on the shape logos (Star, Diamond, Crown and the rest), your abbreviation now fits inside the shape.</w:t>
+      </w:r>
+    </w:p>
+    <w:p>
+      <w:pPr>
+        <w:pStyle w:val="Heading2"/>
+        <w:spacing w:after="80" w:before="200"/>
+      </w:pPr>
+      <w:r>
+        <w:rPr>
+          <w:rFonts w:ascii="Calibri" w:cs="Calibri" w:eastAsia="Calibri" w:hAnsi="Calibri"/>
+          <w:b/>
+          <w:bCs/>
+          <w:color w:val="1F2328"/>
+          <w:sz w:val="26"/>
+          <w:szCs w:val="26"/>
+        </w:rPr>
+        <w:t xml:space="preserve">See it before you pick it</w:t>
+      </w:r>
+    </w:p>
+    <w:p>
+      <w:pPr>
+        <w:pStyle w:val="ListParagraph"/>
+        <w:numPr>
+          <w:ilvl w:val="0"/>
+          <w:numId w:val="2"/>
+        </w:numPr>
+        <w:spacing w:after="80" w:line="276"/>
+      </w:pPr>
+      <w:r>
+        <w:rPr>
+          <w:rFonts w:ascii="Calibri" w:cs="Calibri" w:eastAsia="Calibri" w:hAnsi="Calibri"/>
+          <w:b/>
+          <w:bCs/>
+          <w:color w:val="1F2328"/>
+        </w:rPr>
+        <w:t xml:space="preserve">Real logos in the menus:</w:t>
+      </w:r>
+      <w:r>
+        <w:rPr>
+          <w:rFonts w:ascii="Calibri" w:cs="Calibri" w:eastAsia="Calibri" w:hAnsi="Calibri"/>
+          <w:color w:val="1F2328"/>
+        </w:rPr>
+        <w:t xml:space="preserve"> team rows, team pages and invites show each team's real logo instead of a colored tile with letters.</w:t>
+      </w:r>
+    </w:p>
+    <w:p>
+      <w:pPr>
+        <w:pStyle w:val="ListParagraph"/>
+        <w:numPr>
+          <w:ilvl w:val="0"/>
+          <w:numId w:val="2"/>
+        </w:numPr>
+        <w:spacing w:after="80" w:line="276"/>
+      </w:pPr>
+      <w:r>
+        <w:rPr>
+          <w:rFonts w:ascii="Calibri" w:cs="Calibri" w:eastAsia="Calibri" w:hAnsi="Calibri"/>
+          <w:b/>
+          <w:bCs/>
+          <w:color w:val="1F2328"/>
+        </w:rPr>
+        <w:t xml:space="preserve">Logo pickers:</w:t>
+      </w:r>
+      <w:r>
+        <w:rPr>
+          <w:rFonts w:ascii="Calibri" w:cs="Calibri" w:eastAsia="Calibri" w:hAnsi="Calibri"/>
+          <w:color w:val="1F2328"/>
+        </w:rPr>
+        <w:t xml:space="preserve"> every logo choice shows a picture of that logo in your colors.</w:t>
+      </w:r>
+    </w:p>
+    <w:p>
+      <w:pPr>
+        <w:pStyle w:val="ListParagraph"/>
+        <w:numPr>
+          <w:ilvl w:val="0"/>
+          <w:numId w:val="2"/>
+        </w:numPr>
+        <w:spacing w:after="80" w:line="276"/>
+      </w:pPr>
+      <w:r>
+        <w:rPr>
+          <w:rFonts w:ascii="Calibri" w:cs="Calibri" w:eastAsia="Calibri" w:hAnsi="Calibri"/>
+          <w:b/>
+          <w:bCs/>
+          <w:color w:val="1F2328"/>
+        </w:rPr>
+        <w:t xml:space="preserve">Live preview:</w:t>
+      </w:r>
+      <w:r>
+        <w:rPr>
+          <w:rFonts w:ascii="Calibri" w:cs="Calibri" w:eastAsia="Calibri" w:hAnsi="Calibri"/>
+          <w:color w:val="1F2328"/>
+        </w:rPr>
+        <w:t xml:space="preserve"> the create and settings forms show your logo and kit as the game draws them, and update as you change the name, colors or picks.</w:t>
+      </w:r>
+    </w:p>
+    <w:p>
+      <w:pPr>
+        <w:pStyle w:val="ListParagraph"/>
+        <w:numPr>
+          <w:ilvl w:val="0"/>
+          <w:numId w:val="2"/>
+        </w:numPr>
+        <w:spacing w:after="80" w:line="276"/>
+      </w:pPr>
+      <w:r>
+        <w:rPr>
+          <w:rFonts w:ascii="Calibri" w:cs="Calibri" w:eastAsia="Calibri" w:hAnsi="Calibri"/>
+          <w:b/>
+          <w:bCs/>
+          <w:color w:val="1F2328"/>
+        </w:rPr>
+        <w:t xml:space="preserve">Create form fix:</w:t>
+      </w:r>
+      <w:r>
+        <w:rPr>
+          <w:rFonts w:ascii="Calibri" w:cs="Calibri" w:eastAsia="Calibri" w:hAnsi="Calibri"/>
+          <w:color w:val="1F2328"/>
+        </w:rPr>
+        <w:t xml:space="preserve"> the logo and jersey picks on the Create a Pro-Am team form now actually take. Before, only the settings panel saved them.</w:t>
+      </w:r>
+    </w:p>
+    <w:p>
+      <w:pPr>
+        <w:pStyle w:val="ListParagraph"/>
+        <w:numPr>
+          <w:ilvl w:val="0"/>
+          <w:numId w:val="2"/>
+        </w:numPr>
+        <w:spacing w:after="80" w:line="276"/>
+      </w:pPr>
+      <w:r>
+        <w:rPr>
+          <w:rFonts w:ascii="Calibri" w:cs="Calibri" w:eastAsia="Calibri" w:hAnsi="Calibri"/>
+          <w:b/>
+          <w:bCs/>
+          <w:color w:val="1F2328"/>
+        </w:rPr>
+        <w:t xml:space="preserve">Clearer clubhouse option:</w:t>
+      </w:r>
+      <w:r>
+        <w:rPr>
+          <w:rFonts w:ascii="Calibri" w:cs="Calibri" w:eastAsia="Calibri" w:hAnsi="Calibri"/>
+          <w:color w:val="1F2328"/>
+        </w:rPr>
+        <w:t xml:space="preserve"> the clubhouse's logo option now says what it changes: the clubhouse court, logo wall, banners and rug.</w:t>
+      </w:r>
+    </w:p>
+    <w:p>
+      <w:pPr>
+        <w:pStyle w:val="ListParagraph"/>
+        <w:numPr>
+          <w:ilvl w:val="0"/>
+          <w:numId w:val="2"/>
+        </w:numPr>
+        <w:spacing w:after="80" w:line="276"/>
+      </w:pPr>
+      <w:r>
+        <w:rPr>
+          <w:rFonts w:ascii="Calibri" w:cs="Calibri" w:eastAsia="Calibri" w:hAnsi="Calibri"/>
+          <w:b/>
+          <w:bCs/>
+          <w:color w:val="1F2328"/>
+        </w:rPr>
+        <w:t xml:space="preserve">Honey gloss:</w:t>
+      </w:r>
+      <w:r>
+        <w:rPr>
+          <w:rFonts w:ascii="Calibri" w:cs="Calibri" w:eastAsia="Calibri" w:hAnsi="Calibri"/>
+          <w:color w:val="1F2328"/>
+        </w:rPr>
+        <w:t xml:space="preserve"> the Honey gloss floor now has more shine than the others.</w:t>
+      </w:r>
+    </w:p>
     <w:sectPr>
       <w:pgSz w:w="12240" w:h="15840" w:orient="portrait"/>
       <w:pgMar w:top="1440" w:right="1440" w:bottom="1440" w:left="1440" w:header="708" w:footer="708" w:gutter="0"/>

</xml_diff>

<commit_message>
Reduce background and rendering overhead
Cap the frame rate and slow the game in the background, select graphics quality for the user's hardware, and reduce redundant bone uniform uploads. Release unused texture caches during long background or menu sessions, and add tests for the performance changes.
</commit_message>
<xml_diff>
--- a/PATCH_NOTES_v0.4.8.9.docx
+++ b/PATCH_NOTES_v0.4.8.9.docx
@@ -6613,6 +6613,370 @@
         <w:t xml:space="preserve"> the Honey gloss floor now has more shine than the others.</w:t>
       </w:r>
     </w:p>
+    <w:p>
+      <w:pPr>
+        <w:pBdr>
+          <w:bottom w:val="single" w:color="D0D7DE" w:sz="4" w:space="1"/>
+        </w:pBdr>
+        <w:spacing w:after="160" w:before="80"/>
+      </w:pPr>
+    </w:p>
+    <w:p>
+      <w:pPr>
+        <w:pStyle w:val="Heading1"/>
+        <w:spacing w:after="120" w:before="280"/>
+      </w:pPr>
+      <w:r>
+        <w:rPr>
+          <w:rFonts w:ascii="Calibri" w:cs="Calibri" w:eastAsia="Calibri" w:hAnsi="Calibri"/>
+          <w:b/>
+          <w:bCs/>
+          <w:color w:val="C8102E"/>
+          <w:sz w:val="32"/>
+          <w:szCs w:val="32"/>
+        </w:rPr>
+        <w:t xml:space="preserve">Quick patch 15 (Oct 26): the game no longer slows your PC down</w:t>
+      </w:r>
+    </w:p>
+    <w:p>
+      <w:pPr>
+        <w:pStyle w:val="Heading2"/>
+        <w:spacing w:after="80" w:before="200"/>
+      </w:pPr>
+      <w:r>
+        <w:rPr>
+          <w:rFonts w:ascii="Calibri" w:cs="Calibri" w:eastAsia="Calibri" w:hAnsi="Calibri"/>
+          <w:b/>
+          <w:bCs/>
+          <w:color w:val="1F2328"/>
+          <w:sz w:val="26"/>
+          <w:szCs w:val="26"/>
+        </w:rPr>
+        <w:t xml:space="preserve">What was wrong</w:t>
+      </w:r>
+    </w:p>
+    <w:p>
+      <w:pPr>
+        <w:spacing w:after="140" w:line="288"/>
+      </w:pPr>
+      <w:r>
+        <w:rPr>
+          <w:rFonts w:ascii="Calibri" w:cs="Calibri" w:eastAsia="Calibri" w:hAnsi="Calibri"/>
+          <w:color w:val="1F2328"/>
+        </w:rPr>
+        <w:t xml:space="preserve">We found no memory leak: memory, page size and graphics memory all stay flat over long sessions and repeated trips between the menus and the park. The slowdown came from the game working flat out the whole time it was open:</w:t>
+      </w:r>
+    </w:p>
+    <w:p>
+      <w:pPr>
+        <w:pStyle w:val="ListParagraph"/>
+        <w:numPr>
+          <w:ilvl w:val="0"/>
+          <w:numId w:val="2"/>
+        </w:numPr>
+        <w:spacing w:after="80" w:line="276"/>
+      </w:pPr>
+      <w:r>
+        <w:rPr>
+          <w:rFonts w:ascii="Calibri" w:cs="Calibri" w:eastAsia="Calibri" w:hAnsi="Calibri"/>
+          <w:b/>
+          <w:bCs/>
+          <w:color w:val="1F2328"/>
+        </w:rPr>
+        <w:t xml:space="preserve">It never slowed down in the background.</w:t>
+      </w:r>
+      <w:r>
+        <w:rPr>
+          <w:rFonts w:ascii="Calibri" w:cs="Calibri" w:eastAsia="Calibri" w:hAnsi="Calibri"/>
+          <w:color w:val="1F2328"/>
+        </w:rPr>
+        <w:t xml:space="preserve"> To keep online games in step, the game window opens with the browser's own background slow-down turned off. So when you clicked away to do something else, the game kept drawing the park (about a million triangles a frame) at your monitor's full refresh rate behind your other windows.</w:t>
+      </w:r>
+    </w:p>
+    <w:p>
+      <w:pPr>
+        <w:pStyle w:val="ListParagraph"/>
+        <w:numPr>
+          <w:ilvl w:val="0"/>
+          <w:numId w:val="2"/>
+        </w:numPr>
+        <w:spacing w:after="80" w:line="276"/>
+      </w:pPr>
+      <w:r>
+        <w:rPr>
+          <w:rFonts w:ascii="Calibri" w:cs="Calibri" w:eastAsia="Calibri" w:hAnsi="Calibri"/>
+          <w:b/>
+          <w:bCs/>
+          <w:color w:val="1F2328"/>
+        </w:rPr>
+        <w:t xml:space="preserve">It never picked graphics for your PC.</w:t>
+      </w:r>
+      <w:r>
+        <w:rPr>
+          <w:rFonts w:ascii="Calibri" w:cs="Calibri" w:eastAsia="Calibri" w:hAnsi="Calibri"/>
+          <w:color w:val="1F2328"/>
+        </w:rPr>
+        <w:t xml:space="preserve"> A bug meant the game never chose a graphics preset for your PC, so everyone started on High (the full-resolution reflections, the big shadow map and extra-sharp rendering), even on laptops with built-in graphics.</w:t>
+      </w:r>
+    </w:p>
+    <w:p>
+      <w:pPr>
+        <w:pStyle w:val="ListParagraph"/>
+        <w:numPr>
+          <w:ilvl w:val="0"/>
+          <w:numId w:val="2"/>
+        </w:numPr>
+        <w:spacing w:after="80" w:line="276"/>
+      </w:pPr>
+      <w:r>
+        <w:rPr>
+          <w:rFonts w:ascii="Calibri" w:cs="Calibri" w:eastAsia="Calibri" w:hAnsi="Calibri"/>
+          <w:b/>
+          <w:bCs/>
+          <w:color w:val="1F2328"/>
+        </w:rPr>
+        <w:t xml:space="preserve">No frame rate limit:</w:t>
+      </w:r>
+      <w:r>
+        <w:rPr>
+          <w:rFonts w:ascii="Calibri" w:cs="Calibri" w:eastAsia="Calibri" w:hAnsi="Calibri"/>
+          <w:color w:val="1F2328"/>
+        </w:rPr>
+        <w:t xml:space="preserve"> on a 144 or 240 Hz monitor the game drew 2–4 times more frames than it needed.</w:t>
+      </w:r>
+    </w:p>
+    <w:p>
+      <w:pPr>
+        <w:pStyle w:val="Heading2"/>
+        <w:spacing w:after="80" w:before="200"/>
+      </w:pPr>
+      <w:r>
+        <w:rPr>
+          <w:rFonts w:ascii="Calibri" w:cs="Calibri" w:eastAsia="Calibri" w:hAnsi="Calibri"/>
+          <w:b/>
+          <w:bCs/>
+          <w:color w:val="1F2328"/>
+          <w:sz w:val="26"/>
+          <w:szCs w:val="26"/>
+        </w:rPr>
+        <w:t xml:space="preserve">The fixes</w:t>
+      </w:r>
+    </w:p>
+    <w:p>
+      <w:pPr>
+        <w:pStyle w:val="ListParagraph"/>
+        <w:numPr>
+          <w:ilvl w:val="0"/>
+          <w:numId w:val="2"/>
+        </w:numPr>
+        <w:spacing w:after="80" w:line="276"/>
+      </w:pPr>
+      <w:r>
+        <w:rPr>
+          <w:rFonts w:ascii="Calibri" w:cs="Calibri" w:eastAsia="Calibri" w:hAnsi="Calibri"/>
+          <w:b/>
+          <w:bCs/>
+          <w:color w:val="1F2328"/>
+        </w:rPr>
+        <w:t xml:space="preserve">Slows right down in the background:</w:t>
+      </w:r>
+      <w:r>
+        <w:rPr>
+          <w:rFonts w:ascii="Calibri" w:cs="Calibri" w:eastAsia="Calibri" w:hAnsi="Calibri"/>
+          <w:color w:val="1F2328"/>
+        </w:rPr>
+        <w:t xml:space="preserve"> when the game window isn't the one you're using, the game drops to 10 frames a second in the menus and the park. A game in progress keeps playing at 30, so online games stay in step. To keep full speed, use Settings → </w:t>
+      </w:r>
+      <w:r>
+        <w:rPr>
+          <w:rFonts w:ascii="Calibri" w:cs="Calibri" w:eastAsia="Calibri" w:hAnsi="Calibri"/>
+          <w:b/>
+          <w:bCs/>
+          <w:color w:val="1F2328"/>
+        </w:rPr>
+        <w:t xml:space="preserve">In the background</w:t>
+      </w:r>
+      <w:r>
+        <w:rPr>
+          <w:rFonts w:ascii="Calibri" w:cs="Calibri" w:eastAsia="Calibri" w:hAnsi="Calibri"/>
+          <w:color w:val="1F2328"/>
+        </w:rPr>
+        <w:t xml:space="preserve"> → Full speed.</w:t>
+      </w:r>
+    </w:p>
+    <w:p>
+      <w:pPr>
+        <w:pStyle w:val="ListParagraph"/>
+        <w:numPr>
+          <w:ilvl w:val="0"/>
+          <w:numId w:val="2"/>
+        </w:numPr>
+        <w:spacing w:after="80" w:line="276"/>
+      </w:pPr>
+      <w:r>
+        <w:rPr>
+          <w:rFonts w:ascii="Calibri" w:cs="Calibri" w:eastAsia="Calibri" w:hAnsi="Calibri"/>
+          <w:b/>
+          <w:bCs/>
+          <w:color w:val="1F2328"/>
+        </w:rPr>
+        <w:t xml:space="preserve">Frame rate limit:</w:t>
+      </w:r>
+      <w:r>
+        <w:rPr>
+          <w:rFonts w:ascii="Calibri" w:cs="Calibri" w:eastAsia="Calibri" w:hAnsi="Calibri"/>
+          <w:color w:val="1F2328"/>
+        </w:rPr>
+        <w:t xml:space="preserve"> Settings → </w:t>
+      </w:r>
+      <w:r>
+        <w:rPr>
+          <w:rFonts w:ascii="Calibri" w:cs="Calibri" w:eastAsia="Calibri" w:hAnsi="Calibri"/>
+          <w:b/>
+          <w:bCs/>
+          <w:color w:val="1F2328"/>
+        </w:rPr>
+        <w:t xml:space="preserve">Frame rate limit</w:t>
+      </w:r>
+      <w:r>
+        <w:rPr>
+          <w:rFonts w:ascii="Calibri" w:cs="Calibri" w:eastAsia="Calibri" w:hAnsi="Calibri"/>
+          <w:color w:val="1F2328"/>
+        </w:rPr>
+        <w:t xml:space="preserve"> (30, 60, 120, 144 or your display's own rate) is 60 by default.</w:t>
+      </w:r>
+    </w:p>
+    <w:p>
+      <w:pPr>
+        <w:pStyle w:val="ListParagraph"/>
+        <w:numPr>
+          <w:ilvl w:val="0"/>
+          <w:numId w:val="2"/>
+        </w:numPr>
+        <w:spacing w:after="80" w:line="276"/>
+      </w:pPr>
+      <w:r>
+        <w:rPr>
+          <w:rFonts w:ascii="Calibri" w:cs="Calibri" w:eastAsia="Calibri" w:hAnsi="Calibri"/>
+          <w:b/>
+          <w:bCs/>
+          <w:color w:val="1F2328"/>
+        </w:rPr>
+        <w:t xml:space="preserve">Graphics picked for your PC:</w:t>
+      </w:r>
+      <w:r>
+        <w:rPr>
+          <w:rFonts w:ascii="Calibri" w:cs="Calibri" w:eastAsia="Calibri" w:hAnsi="Calibri"/>
+          <w:color w:val="1F2328"/>
+        </w:rPr>
+        <w:t xml:space="preserve"> new installs get a graphics preset chosen for your graphics chip. If you were left on High without ever choosing it and your PC has built-in graphics, the game switches you to Balanced once and tells you. Anything you've picked yourself stays as it is.</w:t>
+      </w:r>
+    </w:p>
+    <w:p>
+      <w:pPr>
+        <w:pStyle w:val="ListParagraph"/>
+        <w:numPr>
+          <w:ilvl w:val="0"/>
+          <w:numId w:val="2"/>
+        </w:numPr>
+        <w:spacing w:after="80" w:line="276"/>
+      </w:pPr>
+      <w:r>
+        <w:rPr>
+          <w:rFonts w:ascii="Calibri" w:cs="Calibri" w:eastAsia="Calibri" w:hAnsi="Calibri"/>
+          <w:b/>
+          <w:bCs/>
+          <w:color w:val="1F2328"/>
+        </w:rPr>
+        <w:t xml:space="preserve">Lighter drawing:</w:t>
+      </w:r>
+      <w:r>
+        <w:rPr>
+          <w:rFonts w:ascii="Calibri" w:cs="Calibri" w:eastAsia="Calibri" w:hAnsi="Calibri"/>
+          <w:color w:val="1F2328"/>
+        </w:rPr>
+        <w:t xml:space="preserve"> each player's skeleton is now sent to the graphics card once a frame instead of once for every piece of their body in every drawing step, about 55% less of that data per frame in the park.</w:t>
+      </w:r>
+    </w:p>
+    <w:p>
+      <w:pPr>
+        <w:pStyle w:val="ListParagraph"/>
+        <w:numPr>
+          <w:ilvl w:val="0"/>
+          <w:numId w:val="2"/>
+        </w:numPr>
+        <w:spacing w:after="80" w:line="276"/>
+      </w:pPr>
+      <w:r>
+        <w:rPr>
+          <w:rFonts w:ascii="Calibri" w:cs="Calibri" w:eastAsia="Calibri" w:hAnsi="Calibri"/>
+          <w:b/>
+          <w:bCs/>
+          <w:color w:val="1F2328"/>
+        </w:rPr>
+        <w:t xml:space="preserve">Memory given back:</w:t>
+      </w:r>
+    </w:p>
+    <w:p>
+      <w:pPr>
+        <w:pStyle w:val="ListParagraph"/>
+        <w:numPr>
+          <w:ilvl w:val="1"/>
+          <w:numId w:val="2"/>
+        </w:numPr>
+        <w:spacing w:after="80" w:line="276"/>
+      </w:pPr>
+      <w:r>
+        <w:rPr>
+          <w:rFonts w:ascii="Calibri" w:cs="Calibri" w:eastAsia="Calibri" w:hAnsi="Calibri"/>
+          <w:color w:val="1F2328"/>
+        </w:rPr>
+        <w:t xml:space="preserve">After 20 seconds with the game in the background, it frees the textures nothing on screen is using.</w:t>
+      </w:r>
+    </w:p>
+    <w:p>
+      <w:pPr>
+        <w:pStyle w:val="ListParagraph"/>
+        <w:numPr>
+          <w:ilvl w:val="1"/>
+          <w:numId w:val="2"/>
+        </w:numPr>
+        <w:spacing w:after="80" w:line="276"/>
+      </w:pPr>
+      <w:r>
+        <w:rPr>
+          <w:rFonts w:ascii="Calibri" w:cs="Calibri" w:eastAsia="Calibri" w:hAnsi="Calibri"/>
+          <w:color w:val="1F2328"/>
+        </w:rPr>
+        <w:t xml:space="preserve">After a minute and a half in the menus, it trims the textures kept for a quick trip back to the park. A park visit used to leave about 300 MB of them in use; now it's about 110 MB, or about 20 MB once the game is in the background.</w:t>
+      </w:r>
+    </w:p>
+    <w:p>
+      <w:pPr>
+        <w:pStyle w:val="ListParagraph"/>
+        <w:numPr>
+          <w:ilvl w:val="0"/>
+          <w:numId w:val="2"/>
+        </w:numPr>
+        <w:spacing w:after="80" w:line="276"/>
+      </w:pPr>
+      <w:r>
+        <w:rPr>
+          <w:rFonts w:ascii="Calibri" w:cs="Calibri" w:eastAsia="Calibri" w:hAnsi="Calibri"/>
+          <w:b/>
+          <w:bCs/>
+          <w:color w:val="1F2328"/>
+        </w:rPr>
+        <w:t xml:space="preserve">Idle courts slow down in the background:</w:t>
+      </w:r>
+      <w:r>
+        <w:rPr>
+          <w:rFonts w:ascii="Calibri" w:cs="Calibri" w:eastAsia="Calibri" w:hAnsi="Calibri"/>
+          <w:color w:val="1F2328"/>
+        </w:rPr>
+        <w:t xml:space="preserve"> the courts you aren't watching in the park play at normal speed when the game is in the background, instead of fast-forwarding.</w:t>
+      </w:r>
+    </w:p>
     <w:sectPr>
       <w:pgSz w:w="12240" w:h="15840" w:orient="portrait"/>
       <w:pgMar w:top="1440" w:right="1440" w:bottom="1440" w:left="1440" w:header="708" w:footer="708" w:gutter="0"/>

</xml_diff>